<commit_message>
se completan mas tablas para las uuid y se agrega funcionalidad de sincronismo a las navbar
</commit_message>
<xml_diff>
--- a/ANALISIS/requerimientos.docx
+++ b/ANALISIS/requerimientos.docx
@@ -12025,7 +12025,6 @@
           <w:b/>
         </w:rPr>
       </w:pPr>
-      <w:bookmarkStart w:id="0" w:name="_GoBack"/>
       <w:r>
         <w:rPr>
           <w:b/>
@@ -12082,7 +12081,6 @@
         <w:t xml:space="preserve"> con la base de datos</w:t>
       </w:r>
     </w:p>
-    <w:bookmarkEnd w:id="0"/>
     <w:p>
       <w:pPr>
         <w:spacing w:after="0"/>
@@ -18831,6 +18829,129 @@
     <w:p>
       <w:pPr>
         <w:rPr>
+          <w:b/>
+          <w:color w:val="FFC000"/>
+        </w:rPr>
+      </w:pPr>
+      <w:bookmarkStart w:id="0" w:name="_GoBack"/>
+      <w:proofErr w:type="spellStart"/>
+      <w:r>
+        <w:rPr>
+          <w:b/>
+          <w:color w:val="FFC000"/>
+        </w:rPr>
+        <w:lastRenderedPageBreak/>
+        <w:t>podras</w:t>
+      </w:r>
+      <w:proofErr w:type="spellEnd"/>
+      <w:r>
+        <w:rPr>
+          <w:b/>
+          <w:color w:val="FFC000"/>
+        </w:rPr>
+        <w:t xml:space="preserve"> incorporar al </w:t>
+      </w:r>
+      <w:proofErr w:type="spellStart"/>
+      <w:r>
+        <w:rPr>
+          <w:b/>
+          <w:color w:val="FFC000"/>
+        </w:rPr>
+        <w:t>navbar</w:t>
+      </w:r>
+      <w:proofErr w:type="spellEnd"/>
+      <w:r>
+        <w:rPr>
+          <w:b/>
+          <w:color w:val="FFC000"/>
+        </w:rPr>
+        <w:t xml:space="preserve"> que se muestra en todas las vistas dos </w:t>
+      </w:r>
+      <w:proofErr w:type="spellStart"/>
+      <w:r>
+        <w:rPr>
+          <w:b/>
+          <w:color w:val="FFC000"/>
+        </w:rPr>
+        <w:t>badge</w:t>
+      </w:r>
+      <w:proofErr w:type="spellEnd"/>
+      <w:r>
+        <w:rPr>
+          <w:b/>
+          <w:color w:val="FFC000"/>
+        </w:rPr>
+        <w:t xml:space="preserve"> que muestren el estado, en uno con </w:t>
+      </w:r>
+      <w:proofErr w:type="spellStart"/>
+      <w:r>
+        <w:rPr>
+          <w:b/>
+          <w:color w:val="FFC000"/>
+        </w:rPr>
+        <w:t>conexion</w:t>
+      </w:r>
+      <w:proofErr w:type="spellEnd"/>
+      <w:r>
+        <w:rPr>
+          <w:b/>
+          <w:color w:val="FFC000"/>
+        </w:rPr>
+        <w:t xml:space="preserve"> y sin </w:t>
+      </w:r>
+      <w:proofErr w:type="spellStart"/>
+      <w:r>
+        <w:rPr>
+          <w:b/>
+          <w:color w:val="FFC000"/>
+        </w:rPr>
+        <w:t>conexion</w:t>
+      </w:r>
+      <w:proofErr w:type="spellEnd"/>
+      <w:r>
+        <w:rPr>
+          <w:b/>
+          <w:color w:val="FFC000"/>
+        </w:rPr>
+        <w:t xml:space="preserve">, con </w:t>
+      </w:r>
+      <w:proofErr w:type="spellStart"/>
+      <w:r>
+        <w:rPr>
+          <w:b/>
+          <w:color w:val="FFC000"/>
+        </w:rPr>
+        <w:t>conexion</w:t>
+      </w:r>
+      <w:proofErr w:type="spellEnd"/>
+      <w:r>
+        <w:rPr>
+          <w:b/>
+          <w:color w:val="FFC000"/>
+        </w:rPr>
+        <w:t xml:space="preserve"> color verde sin </w:t>
+      </w:r>
+      <w:proofErr w:type="spellStart"/>
+      <w:r>
+        <w:rPr>
+          <w:b/>
+          <w:color w:val="FFC000"/>
+        </w:rPr>
+        <w:t>conexion</w:t>
+      </w:r>
+      <w:proofErr w:type="spellEnd"/>
+      <w:r>
+        <w:rPr>
+          <w:b/>
+          <w:color w:val="FFC000"/>
+        </w:rPr>
+        <w:t xml:space="preserve"> color rojo, y el otro con tres estados, datos sincronizados ok, verde, sincronizando amarillo, sin sincronizar rojo.</w:t>
+      </w:r>
+    </w:p>
+    <w:bookmarkEnd w:id="0"/>
+    <w:p>
+      <w:pPr>
+        <w:rPr>
           <w:lang w:val="es-ES"/>
         </w:rPr>
       </w:pPr>
@@ -19064,6 +19185,7 @@
           <w:b/>
           <w:bCs/>
         </w:rPr>
+        <w:lastRenderedPageBreak/>
         <w:t xml:space="preserve">Un Archivo </w:t>
       </w:r>
       <w:proofErr w:type="spellStart"/>
@@ -19180,421 +19302,604 @@
           <w:b/>
           <w:bCs/>
         </w:rPr>
+        <w:t>Paso a Paso: Implementación Código a Código</w:t>
+      </w:r>
+    </w:p>
+    <w:p>
+      <w:pPr>
+        <w:spacing w:after="0"/>
+        <w:rPr>
+          <w:b/>
+          <w:bCs/>
+        </w:rPr>
+      </w:pPr>
+      <w:r>
+        <w:rPr>
+          <w:b/>
+          <w:bCs/>
+        </w:rPr>
+        <w:t xml:space="preserve">Paso 1: Crear el archivo </w:t>
+      </w:r>
+      <w:proofErr w:type="spellStart"/>
+      <w:r>
+        <w:rPr>
+          <w:b/>
+          <w:bCs/>
+        </w:rPr>
+        <w:t>manifest.json</w:t>
+      </w:r>
+      <w:proofErr w:type="spellEnd"/>
+    </w:p>
+    <w:p>
+      <w:pPr>
+        <w:spacing w:after="0"/>
+      </w:pPr>
+      <w:r>
+        <w:t>Crea este archivo en la raíz de tu proyecto. Es el documento de identidad de tu aplicación.</w:t>
+      </w:r>
+    </w:p>
+    <w:p>
+      <w:pPr>
+        <w:spacing w:after="0"/>
+      </w:pPr>
+      <w:r>
+        <w:t>JSON</w:t>
+      </w:r>
+    </w:p>
+    <w:p>
+      <w:pPr>
+        <w:spacing w:after="0"/>
+      </w:pPr>
+      <w:r>
+        <w:t>{</w:t>
+      </w:r>
+    </w:p>
+    <w:p>
+      <w:pPr>
+        <w:spacing w:after="0"/>
+      </w:pPr>
+      <w:r>
+        <w:t xml:space="preserve">  "</w:t>
+      </w:r>
+      <w:proofErr w:type="spellStart"/>
+      <w:r>
+        <w:t>short_name</w:t>
+      </w:r>
+      <w:proofErr w:type="spellEnd"/>
+      <w:r>
+        <w:t>": "</w:t>
+      </w:r>
+      <w:proofErr w:type="spellStart"/>
+      <w:r>
+        <w:t>MiApp</w:t>
+      </w:r>
+      <w:proofErr w:type="spellEnd"/>
+      <w:r>
+        <w:t>",</w:t>
+      </w:r>
+    </w:p>
+    <w:p>
+      <w:pPr>
+        <w:spacing w:after="0"/>
+      </w:pPr>
+      <w:r>
+        <w:t xml:space="preserve">  "</w:t>
+      </w:r>
+      <w:proofErr w:type="spellStart"/>
+      <w:r>
+        <w:t>name</w:t>
+      </w:r>
+      <w:proofErr w:type="spellEnd"/>
+      <w:r>
+        <w:t>": "Mi Aplicación de Escritorio",</w:t>
+      </w:r>
+    </w:p>
+    <w:p>
+      <w:pPr>
+        <w:spacing w:after="0"/>
+      </w:pPr>
+      <w:r>
+        <w:t xml:space="preserve">  "</w:t>
+      </w:r>
+      <w:proofErr w:type="spellStart"/>
+      <w:r>
+        <w:t>icons</w:t>
+      </w:r>
+      <w:proofErr w:type="spellEnd"/>
+      <w:r>
+        <w:t>": [</w:t>
+      </w:r>
+    </w:p>
+    <w:p>
+      <w:pPr>
+        <w:spacing w:after="0"/>
+      </w:pPr>
+      <w:r>
+        <w:t xml:space="preserve">    {</w:t>
+      </w:r>
+    </w:p>
+    <w:p>
+      <w:pPr>
+        <w:spacing w:after="0"/>
+      </w:pPr>
+      <w:r>
+        <w:t xml:space="preserve">      "</w:t>
+      </w:r>
+      <w:proofErr w:type="spellStart"/>
+      <w:r>
+        <w:t>src</w:t>
+      </w:r>
+      <w:proofErr w:type="spellEnd"/>
+      <w:r>
+        <w:t>": "icon-192.png",</w:t>
+      </w:r>
+    </w:p>
+    <w:p>
+      <w:pPr>
+        <w:spacing w:after="0"/>
+      </w:pPr>
+      <w:r>
+        <w:t xml:space="preserve">      "</w:t>
+      </w:r>
+      <w:proofErr w:type="spellStart"/>
+      <w:r>
+        <w:t>type</w:t>
+      </w:r>
+      <w:proofErr w:type="spellEnd"/>
+      <w:r>
+        <w:t>": "</w:t>
+      </w:r>
+      <w:proofErr w:type="spellStart"/>
+      <w:r>
+        <w:t>image</w:t>
+      </w:r>
+      <w:proofErr w:type="spellEnd"/>
+      <w:r>
+        <w:t>/</w:t>
+      </w:r>
+      <w:proofErr w:type="spellStart"/>
+      <w:r>
+        <w:t>png</w:t>
+      </w:r>
+      <w:proofErr w:type="spellEnd"/>
+      <w:r>
+        <w:t>",</w:t>
+      </w:r>
+    </w:p>
+    <w:p>
+      <w:pPr>
+        <w:spacing w:after="0"/>
+      </w:pPr>
+      <w:r>
+        <w:t xml:space="preserve">      "</w:t>
+      </w:r>
+      <w:proofErr w:type="spellStart"/>
+      <w:r>
+        <w:t>sizes</w:t>
+      </w:r>
+      <w:proofErr w:type="spellEnd"/>
+      <w:r>
+        <w:t>": "192x192"</w:t>
+      </w:r>
+    </w:p>
+    <w:p>
+      <w:pPr>
+        <w:spacing w:after="0"/>
+      </w:pPr>
+      <w:r>
+        <w:t xml:space="preserve">    },</w:t>
+      </w:r>
+    </w:p>
+    <w:p>
+      <w:pPr>
+        <w:spacing w:after="0"/>
+      </w:pPr>
+      <w:r>
+        <w:t xml:space="preserve">    {</w:t>
+      </w:r>
+    </w:p>
+    <w:p>
+      <w:pPr>
+        <w:spacing w:after="0"/>
+      </w:pPr>
+      <w:r>
+        <w:t xml:space="preserve">      "</w:t>
+      </w:r>
+      <w:proofErr w:type="spellStart"/>
+      <w:r>
+        <w:t>src</w:t>
+      </w:r>
+      <w:proofErr w:type="spellEnd"/>
+      <w:r>
+        <w:t>": "icon-512.png",</w:t>
+      </w:r>
+    </w:p>
+    <w:p>
+      <w:pPr>
+        <w:spacing w:after="0"/>
+      </w:pPr>
+      <w:r>
+        <w:t xml:space="preserve">      "</w:t>
+      </w:r>
+      <w:proofErr w:type="spellStart"/>
+      <w:r>
+        <w:t>type</w:t>
+      </w:r>
+      <w:proofErr w:type="spellEnd"/>
+      <w:r>
+        <w:t>": "</w:t>
+      </w:r>
+      <w:proofErr w:type="spellStart"/>
+      <w:r>
+        <w:t>image</w:t>
+      </w:r>
+      <w:proofErr w:type="spellEnd"/>
+      <w:r>
+        <w:t>/</w:t>
+      </w:r>
+      <w:proofErr w:type="spellStart"/>
+      <w:r>
+        <w:t>png</w:t>
+      </w:r>
+      <w:proofErr w:type="spellEnd"/>
+      <w:r>
+        <w:t>",</w:t>
+      </w:r>
+    </w:p>
+    <w:p>
+      <w:pPr>
+        <w:spacing w:after="0"/>
+      </w:pPr>
+      <w:r>
+        <w:t xml:space="preserve">      "</w:t>
+      </w:r>
+      <w:proofErr w:type="spellStart"/>
+      <w:r>
+        <w:t>sizes</w:t>
+      </w:r>
+      <w:proofErr w:type="spellEnd"/>
+      <w:r>
+        <w:t>": "512x512"</w:t>
+      </w:r>
+    </w:p>
+    <w:p>
+      <w:pPr>
+        <w:spacing w:after="0"/>
+      </w:pPr>
+      <w:r>
+        <w:t xml:space="preserve">    }</w:t>
+      </w:r>
+    </w:p>
+    <w:p>
+      <w:pPr>
+        <w:spacing w:after="0"/>
+      </w:pPr>
+      <w:r>
+        <w:t xml:space="preserve">  ],</w:t>
+      </w:r>
+    </w:p>
+    <w:p>
+      <w:pPr>
+        <w:spacing w:after="0"/>
+      </w:pPr>
+      <w:r>
+        <w:t xml:space="preserve">  "</w:t>
+      </w:r>
+      <w:proofErr w:type="spellStart"/>
+      <w:r>
+        <w:t>start_url</w:t>
+      </w:r>
+      <w:proofErr w:type="spellEnd"/>
+      <w:r>
+        <w:t>": "/index.html",</w:t>
+      </w:r>
+    </w:p>
+    <w:p>
+      <w:pPr>
+        <w:spacing w:after="0"/>
+      </w:pPr>
+      <w:r>
+        <w:t xml:space="preserve">  "</w:t>
+      </w:r>
+      <w:proofErr w:type="spellStart"/>
+      <w:r>
+        <w:t>background_color</w:t>
+      </w:r>
+      <w:proofErr w:type="spellEnd"/>
+      <w:r>
+        <w:t>": "#</w:t>
+      </w:r>
+      <w:proofErr w:type="spellStart"/>
+      <w:r>
+        <w:t>ffffff</w:t>
+      </w:r>
+      <w:proofErr w:type="spellEnd"/>
+      <w:r>
+        <w:t>",</w:t>
+      </w:r>
+    </w:p>
+    <w:p>
+      <w:pPr>
+        <w:spacing w:after="0"/>
+      </w:pPr>
+      <w:r>
+        <w:t xml:space="preserve">  "</w:t>
+      </w:r>
+      <w:proofErr w:type="spellStart"/>
+      <w:r>
+        <w:t>theme_color</w:t>
+      </w:r>
+      <w:proofErr w:type="spellEnd"/>
+      <w:r>
+        <w:t>": "#0078d4",</w:t>
+      </w:r>
+    </w:p>
+    <w:p>
+      <w:pPr>
+        <w:spacing w:after="0"/>
+      </w:pPr>
+      <w:r>
+        <w:t xml:space="preserve">  "</w:t>
+      </w:r>
+      <w:proofErr w:type="spellStart"/>
+      <w:r>
+        <w:t>display</w:t>
+      </w:r>
+      <w:proofErr w:type="spellEnd"/>
+      <w:r>
+        <w:t>": "</w:t>
+      </w:r>
+      <w:proofErr w:type="spellStart"/>
+      <w:r>
+        <w:t>standalone</w:t>
+      </w:r>
+      <w:proofErr w:type="spellEnd"/>
+      <w:r>
+        <w:t>",</w:t>
+      </w:r>
+    </w:p>
+    <w:p>
+      <w:pPr>
+        <w:spacing w:after="0"/>
+      </w:pPr>
+      <w:r>
+        <w:t xml:space="preserve">  "</w:t>
+      </w:r>
+      <w:proofErr w:type="spellStart"/>
+      <w:r>
+        <w:t>orientation</w:t>
+      </w:r>
+      <w:proofErr w:type="spellEnd"/>
+      <w:r>
+        <w:t>": "</w:t>
+      </w:r>
+      <w:proofErr w:type="spellStart"/>
+      <w:r>
+        <w:t>portrait</w:t>
+      </w:r>
+      <w:proofErr w:type="spellEnd"/>
+      <w:r>
+        <w:t>"</w:t>
+      </w:r>
+    </w:p>
+    <w:p>
+      <w:pPr>
+        <w:spacing w:after="0"/>
+      </w:pPr>
+      <w:r>
+        <w:t>}</w:t>
+      </w:r>
+    </w:p>
+    <w:p>
+      <w:r>
+        <w:rPr>
+          <w:b/>
+          <w:bCs/>
+        </w:rPr>
+        <w:t>Nota clave:</w:t>
+      </w:r>
+      <w:r>
+        <w:t xml:space="preserve"> La propiedad "</w:t>
+      </w:r>
+      <w:proofErr w:type="spellStart"/>
+      <w:r>
+        <w:t>display</w:t>
+      </w:r>
+      <w:proofErr w:type="spellEnd"/>
+      <w:r>
+        <w:t>": "</w:t>
+      </w:r>
+      <w:proofErr w:type="spellStart"/>
+      <w:r>
+        <w:t>standalone</w:t>
+      </w:r>
+      <w:proofErr w:type="spellEnd"/>
+      <w:r>
+        <w:t xml:space="preserve">" es la que hace que la aplicación se abra en su propia ventana oculta, eliminando la barra de direcciones del navegador para que parezca una </w:t>
+      </w:r>
+      <w:proofErr w:type="spellStart"/>
+      <w:r>
+        <w:t>app</w:t>
+      </w:r>
+      <w:proofErr w:type="spellEnd"/>
+      <w:r>
+        <w:t xml:space="preserve"> de escritorio nativa.</w:t>
+      </w:r>
+    </w:p>
+    <w:p>
+      <w:pPr>
+        <w:rPr>
+          <w:b/>
+          <w:bCs/>
+        </w:rPr>
+      </w:pPr>
+      <w:r>
+        <w:rPr>
+          <w:b/>
+          <w:bCs/>
+        </w:rPr>
+        <w:t xml:space="preserve">Paso 2: Vincular el </w:t>
+      </w:r>
+      <w:proofErr w:type="spellStart"/>
+      <w:r>
+        <w:rPr>
+          <w:b/>
+          <w:bCs/>
+        </w:rPr>
+        <w:t>Manifest</w:t>
+      </w:r>
+      <w:proofErr w:type="spellEnd"/>
+      <w:r>
+        <w:rPr>
+          <w:b/>
+          <w:bCs/>
+        </w:rPr>
+        <w:t xml:space="preserve"> en tu HTML</w:t>
+      </w:r>
+    </w:p>
+    <w:p>
+      <w:r>
+        <w:t>En el &lt;head&gt; de tu archivo index.html, debes enlazar el archivo que acabas de crear:</w:t>
+      </w:r>
+    </w:p>
+    <w:p>
+      <w:r>
+        <w:t>HTML</w:t>
+      </w:r>
+    </w:p>
+    <w:p>
+      <w:r>
+        <w:t xml:space="preserve">&lt;link </w:t>
+      </w:r>
+      <w:proofErr w:type="spellStart"/>
+      <w:r>
+        <w:t>rel</w:t>
+      </w:r>
+      <w:proofErr w:type="spellEnd"/>
+      <w:r>
+        <w:t>="</w:t>
+      </w:r>
+      <w:proofErr w:type="spellStart"/>
+      <w:r>
+        <w:t>manifest</w:t>
+      </w:r>
+      <w:proofErr w:type="spellEnd"/>
+      <w:r>
+        <w:t xml:space="preserve">" </w:t>
+      </w:r>
+      <w:proofErr w:type="spellStart"/>
+      <w:r>
+        <w:t>href</w:t>
+      </w:r>
+      <w:proofErr w:type="spellEnd"/>
+      <w:r>
+        <w:t>="/</w:t>
+      </w:r>
+      <w:proofErr w:type="spellStart"/>
+      <w:r>
+        <w:t>manifest.json</w:t>
+      </w:r>
+      <w:proofErr w:type="spellEnd"/>
+      <w:r>
+        <w:t>"&gt;</w:t>
+      </w:r>
+    </w:p>
+    <w:p>
+      <w:r>
+        <w:t xml:space="preserve">&lt;meta </w:t>
+      </w:r>
+      <w:proofErr w:type="spellStart"/>
+      <w:r>
+        <w:t>name</w:t>
+      </w:r>
+      <w:proofErr w:type="spellEnd"/>
+      <w:r>
+        <w:t>="</w:t>
+      </w:r>
+      <w:proofErr w:type="spellStart"/>
+      <w:r>
+        <w:t>theme</w:t>
+      </w:r>
+      <w:proofErr w:type="spellEnd"/>
+      <w:r>
+        <w:t xml:space="preserve">-color" </w:t>
+      </w:r>
+      <w:proofErr w:type="spellStart"/>
+      <w:r>
+        <w:t>content</w:t>
+      </w:r>
+      <w:proofErr w:type="spellEnd"/>
+      <w:r>
+        <w:t>="#0078d4"&gt;</w:t>
+      </w:r>
+    </w:p>
+    <w:p>
+      <w:pPr>
+        <w:rPr>
+          <w:b/>
+          <w:bCs/>
+        </w:rPr>
+      </w:pPr>
+      <w:r>
+        <w:rPr>
+          <w:b/>
+          <w:bCs/>
+        </w:rPr>
+        <w:t xml:space="preserve">Paso 3: Crear el </w:t>
+      </w:r>
+      <w:proofErr w:type="spellStart"/>
+      <w:r>
+        <w:rPr>
+          <w:b/>
+          <w:bCs/>
+        </w:rPr>
+        <w:t>Service</w:t>
+      </w:r>
+      <w:proofErr w:type="spellEnd"/>
+      <w:r>
+        <w:rPr>
+          <w:b/>
+          <w:bCs/>
+        </w:rPr>
+        <w:t xml:space="preserve"> </w:t>
+      </w:r>
+      <w:proofErr w:type="spellStart"/>
+      <w:r>
+        <w:rPr>
+          <w:b/>
+          <w:bCs/>
+        </w:rPr>
+        <w:t>Worker</w:t>
+      </w:r>
+      <w:proofErr w:type="spellEnd"/>
+      <w:r>
+        <w:rPr>
+          <w:b/>
+          <w:bCs/>
+        </w:rPr>
+        <w:t xml:space="preserve"> (sw.js)</w:t>
+      </w:r>
+    </w:p>
+    <w:p>
+      <w:r>
         <w:lastRenderedPageBreak/>
-        <w:t>Paso a Paso: Implementación Código a Código</w:t>
-      </w:r>
-    </w:p>
-    <w:p>
-      <w:pPr>
-        <w:spacing w:after="0"/>
-        <w:rPr>
-          <w:b/>
-          <w:bCs/>
-        </w:rPr>
-      </w:pPr>
-      <w:r>
-        <w:rPr>
-          <w:b/>
-          <w:bCs/>
-        </w:rPr>
-        <w:t xml:space="preserve">Paso 1: Crear el archivo </w:t>
-      </w:r>
-      <w:proofErr w:type="spellStart"/>
-      <w:r>
-        <w:rPr>
-          <w:b/>
-          <w:bCs/>
-        </w:rPr>
-        <w:t>manifest.json</w:t>
-      </w:r>
-      <w:proofErr w:type="spellEnd"/>
-    </w:p>
-    <w:p>
-      <w:pPr>
-        <w:spacing w:after="0"/>
-      </w:pPr>
-      <w:r>
-        <w:t>Crea este archivo en la raíz de tu proyecto. Es el documento de identidad de tu aplicación.</w:t>
-      </w:r>
-    </w:p>
-    <w:p>
-      <w:pPr>
-        <w:spacing w:after="0"/>
-      </w:pPr>
-      <w:r>
-        <w:t>JSON</w:t>
-      </w:r>
-    </w:p>
-    <w:p>
-      <w:pPr>
-        <w:spacing w:after="0"/>
-      </w:pPr>
-      <w:r>
-        <w:t>{</w:t>
-      </w:r>
-    </w:p>
-    <w:p>
-      <w:pPr>
-        <w:spacing w:after="0"/>
-      </w:pPr>
-      <w:r>
-        <w:t xml:space="preserve">  "</w:t>
-      </w:r>
-      <w:proofErr w:type="spellStart"/>
-      <w:r>
-        <w:t>short_name</w:t>
-      </w:r>
-      <w:proofErr w:type="spellEnd"/>
-      <w:r>
-        <w:t>": "</w:t>
-      </w:r>
-      <w:proofErr w:type="spellStart"/>
-      <w:r>
-        <w:t>MiApp</w:t>
-      </w:r>
-      <w:proofErr w:type="spellEnd"/>
-      <w:r>
-        <w:t>",</w:t>
-      </w:r>
-    </w:p>
-    <w:p>
-      <w:pPr>
-        <w:spacing w:after="0"/>
-      </w:pPr>
-      <w:r>
-        <w:t xml:space="preserve">  "</w:t>
-      </w:r>
-      <w:proofErr w:type="spellStart"/>
-      <w:r>
-        <w:t>name</w:t>
-      </w:r>
-      <w:proofErr w:type="spellEnd"/>
-      <w:r>
-        <w:t>": "Mi Aplicación de Escritorio",</w:t>
-      </w:r>
-    </w:p>
-    <w:p>
-      <w:pPr>
-        <w:spacing w:after="0"/>
-      </w:pPr>
-      <w:r>
-        <w:t xml:space="preserve">  "</w:t>
-      </w:r>
-      <w:proofErr w:type="spellStart"/>
-      <w:r>
-        <w:t>icons</w:t>
-      </w:r>
-      <w:proofErr w:type="spellEnd"/>
-      <w:r>
-        <w:t>": [</w:t>
-      </w:r>
-    </w:p>
-    <w:p>
-      <w:pPr>
-        <w:spacing w:after="0"/>
-      </w:pPr>
-      <w:r>
-        <w:t xml:space="preserve">    {</w:t>
-      </w:r>
-    </w:p>
-    <w:p>
-      <w:pPr>
-        <w:spacing w:after="0"/>
-      </w:pPr>
-      <w:r>
-        <w:t xml:space="preserve">      "</w:t>
-      </w:r>
-      <w:proofErr w:type="spellStart"/>
-      <w:r>
-        <w:t>src</w:t>
-      </w:r>
-      <w:proofErr w:type="spellEnd"/>
-      <w:r>
-        <w:t>": "icon-192.png",</w:t>
-      </w:r>
-    </w:p>
-    <w:p>
-      <w:pPr>
-        <w:spacing w:after="0"/>
-      </w:pPr>
-      <w:r>
-        <w:t xml:space="preserve">      "</w:t>
-      </w:r>
-      <w:proofErr w:type="spellStart"/>
-      <w:r>
-        <w:t>type</w:t>
-      </w:r>
-      <w:proofErr w:type="spellEnd"/>
-      <w:r>
-        <w:t>": "</w:t>
-      </w:r>
-      <w:proofErr w:type="spellStart"/>
-      <w:r>
-        <w:t>image</w:t>
-      </w:r>
-      <w:proofErr w:type="spellEnd"/>
-      <w:r>
-        <w:t>/</w:t>
-      </w:r>
-      <w:proofErr w:type="spellStart"/>
-      <w:r>
-        <w:t>png</w:t>
-      </w:r>
-      <w:proofErr w:type="spellEnd"/>
-      <w:r>
-        <w:t>",</w:t>
-      </w:r>
-    </w:p>
-    <w:p>
-      <w:pPr>
-        <w:spacing w:after="0"/>
-      </w:pPr>
-      <w:r>
-        <w:t xml:space="preserve">      "</w:t>
-      </w:r>
-      <w:proofErr w:type="spellStart"/>
-      <w:r>
-        <w:t>sizes</w:t>
-      </w:r>
-      <w:proofErr w:type="spellEnd"/>
-      <w:r>
-        <w:t>": "192x192"</w:t>
-      </w:r>
-    </w:p>
-    <w:p>
-      <w:pPr>
-        <w:spacing w:after="0"/>
-      </w:pPr>
-      <w:r>
-        <w:t xml:space="preserve">    },</w:t>
-      </w:r>
-    </w:p>
-    <w:p>
-      <w:pPr>
-        <w:spacing w:after="0"/>
-      </w:pPr>
-      <w:r>
-        <w:t xml:space="preserve">    {</w:t>
-      </w:r>
-    </w:p>
-    <w:p>
-      <w:pPr>
-        <w:spacing w:after="0"/>
-      </w:pPr>
-      <w:r>
-        <w:t xml:space="preserve">      "</w:t>
-      </w:r>
-      <w:proofErr w:type="spellStart"/>
-      <w:r>
-        <w:t>src</w:t>
-      </w:r>
-      <w:proofErr w:type="spellEnd"/>
-      <w:r>
-        <w:t>": "icon-512.png",</w:t>
-      </w:r>
-    </w:p>
-    <w:p>
-      <w:pPr>
-        <w:spacing w:after="0"/>
-      </w:pPr>
-      <w:r>
-        <w:t xml:space="preserve">      "</w:t>
-      </w:r>
-      <w:proofErr w:type="spellStart"/>
-      <w:r>
-        <w:t>type</w:t>
-      </w:r>
-      <w:proofErr w:type="spellEnd"/>
-      <w:r>
-        <w:t>": "</w:t>
-      </w:r>
-      <w:proofErr w:type="spellStart"/>
-      <w:r>
-        <w:t>image</w:t>
-      </w:r>
-      <w:proofErr w:type="spellEnd"/>
-      <w:r>
-        <w:t>/</w:t>
-      </w:r>
-      <w:proofErr w:type="spellStart"/>
-      <w:r>
-        <w:t>png</w:t>
-      </w:r>
-      <w:proofErr w:type="spellEnd"/>
-      <w:r>
-        <w:t>",</w:t>
-      </w:r>
-    </w:p>
-    <w:p>
-      <w:pPr>
-        <w:spacing w:after="0"/>
-      </w:pPr>
-      <w:r>
-        <w:t xml:space="preserve">      "</w:t>
-      </w:r>
-      <w:proofErr w:type="spellStart"/>
-      <w:r>
-        <w:t>sizes</w:t>
-      </w:r>
-      <w:proofErr w:type="spellEnd"/>
-      <w:r>
-        <w:t>": "512x512"</w:t>
-      </w:r>
-    </w:p>
-    <w:p>
-      <w:pPr>
-        <w:spacing w:after="0"/>
-      </w:pPr>
-      <w:r>
-        <w:t xml:space="preserve">    }</w:t>
-      </w:r>
-    </w:p>
-    <w:p>
-      <w:pPr>
-        <w:spacing w:after="0"/>
-      </w:pPr>
-      <w:r>
-        <w:t xml:space="preserve">  ],</w:t>
-      </w:r>
-    </w:p>
-    <w:p>
-      <w:pPr>
-        <w:spacing w:after="0"/>
-      </w:pPr>
-      <w:r>
-        <w:t xml:space="preserve">  "</w:t>
-      </w:r>
-      <w:proofErr w:type="spellStart"/>
-      <w:r>
-        <w:t>start_url</w:t>
-      </w:r>
-      <w:proofErr w:type="spellEnd"/>
-      <w:r>
-        <w:t>": "/index.html",</w:t>
-      </w:r>
-    </w:p>
-    <w:p>
-      <w:pPr>
-        <w:spacing w:after="0"/>
-      </w:pPr>
-      <w:r>
-        <w:t xml:space="preserve">  "</w:t>
-      </w:r>
-      <w:proofErr w:type="spellStart"/>
-      <w:r>
-        <w:t>background_color</w:t>
-      </w:r>
-      <w:proofErr w:type="spellEnd"/>
-      <w:r>
-        <w:t>": "#</w:t>
-      </w:r>
-      <w:proofErr w:type="spellStart"/>
-      <w:r>
-        <w:t>ffffff</w:t>
-      </w:r>
-      <w:proofErr w:type="spellEnd"/>
-      <w:r>
-        <w:t>",</w:t>
-      </w:r>
-    </w:p>
-    <w:p>
-      <w:pPr>
-        <w:spacing w:after="0"/>
-      </w:pPr>
-      <w:r>
-        <w:t xml:space="preserve">  "</w:t>
-      </w:r>
-      <w:proofErr w:type="spellStart"/>
-      <w:r>
-        <w:t>theme_color</w:t>
-      </w:r>
-      <w:proofErr w:type="spellEnd"/>
-      <w:r>
-        <w:t>": "#0078d4",</w:t>
-      </w:r>
-    </w:p>
-    <w:p>
-      <w:pPr>
-        <w:spacing w:after="0"/>
-      </w:pPr>
-      <w:r>
-        <w:t xml:space="preserve">  "</w:t>
-      </w:r>
-      <w:proofErr w:type="spellStart"/>
-      <w:r>
-        <w:t>display</w:t>
-      </w:r>
-      <w:proofErr w:type="spellEnd"/>
-      <w:r>
-        <w:t>": "</w:t>
-      </w:r>
-      <w:proofErr w:type="spellStart"/>
-      <w:r>
-        <w:t>standalone</w:t>
-      </w:r>
-      <w:proofErr w:type="spellEnd"/>
-      <w:r>
-        <w:t>",</w:t>
-      </w:r>
-    </w:p>
-    <w:p>
-      <w:pPr>
-        <w:spacing w:after="0"/>
-      </w:pPr>
-      <w:r>
-        <w:t xml:space="preserve">  "</w:t>
-      </w:r>
-      <w:proofErr w:type="spellStart"/>
-      <w:r>
-        <w:t>orientation</w:t>
-      </w:r>
-      <w:proofErr w:type="spellEnd"/>
-      <w:r>
-        <w:t>": "</w:t>
-      </w:r>
-      <w:proofErr w:type="spellStart"/>
-      <w:r>
-        <w:t>portrait</w:t>
-      </w:r>
-      <w:proofErr w:type="spellEnd"/>
-      <w:r>
-        <w:t>"</w:t>
-      </w:r>
-    </w:p>
-    <w:p>
-      <w:pPr>
-        <w:spacing w:after="0"/>
-      </w:pPr>
-      <w:r>
-        <w:t>}</w:t>
-      </w:r>
-    </w:p>
-    <w:p>
-      <w:r>
-        <w:rPr>
-          <w:b/>
-          <w:bCs/>
-        </w:rPr>
-        <w:t>Nota clave:</w:t>
-      </w:r>
-      <w:r>
-        <w:t xml:space="preserve"> La propiedad "</w:t>
-      </w:r>
-      <w:proofErr w:type="spellStart"/>
-      <w:r>
-        <w:t>display</w:t>
-      </w:r>
-      <w:proofErr w:type="spellEnd"/>
-      <w:r>
-        <w:t>": "</w:t>
-      </w:r>
-      <w:proofErr w:type="spellStart"/>
-      <w:r>
-        <w:t>standalone</w:t>
-      </w:r>
-      <w:proofErr w:type="spellEnd"/>
-      <w:r>
-        <w:t xml:space="preserve">" es la que hace que la aplicación se abra en su propia ventana oculta, eliminando la barra de direcciones del navegador para que parezca una </w:t>
+        <w:t xml:space="preserve">El </w:t>
+      </w:r>
+      <w:proofErr w:type="spellStart"/>
+      <w:r>
+        <w:t>Service</w:t>
+      </w:r>
+      <w:proofErr w:type="spellEnd"/>
+      <w:r>
+        <w:t xml:space="preserve"> </w:t>
+      </w:r>
+      <w:proofErr w:type="spellStart"/>
+      <w:r>
+        <w:t>Worker</w:t>
+      </w:r>
+      <w:proofErr w:type="spellEnd"/>
+      <w:r>
+        <w:t xml:space="preserve"> es el motor que gestiona la caché y permite que la </w:t>
       </w:r>
       <w:proofErr w:type="spellStart"/>
       <w:r>
@@ -19602,213 +19907,619 @@
       </w:r>
       <w:proofErr w:type="spellEnd"/>
       <w:r>
-        <w:t xml:space="preserve"> de escritorio nativa.</w:t>
-      </w:r>
-    </w:p>
-    <w:p>
-      <w:pPr>
-        <w:rPr>
-          <w:b/>
-          <w:bCs/>
-        </w:rPr>
-      </w:pPr>
-      <w:r>
-        <w:rPr>
-          <w:b/>
-          <w:bCs/>
-        </w:rPr>
-        <w:t xml:space="preserve">Paso 2: Vincular el </w:t>
-      </w:r>
-      <w:proofErr w:type="spellStart"/>
-      <w:r>
-        <w:rPr>
-          <w:b/>
-          <w:bCs/>
-        </w:rPr>
-        <w:t>Manifest</w:t>
-      </w:r>
-      <w:proofErr w:type="spellEnd"/>
-      <w:r>
-        <w:rPr>
-          <w:b/>
-          <w:bCs/>
-        </w:rPr>
-        <w:t xml:space="preserve"> en tu HTML</w:t>
-      </w:r>
-    </w:p>
-    <w:p>
-      <w:r>
-        <w:t>En el &lt;head&gt; de tu archivo index.html, debes enlazar el archivo que acabas de crear:</w:t>
-      </w:r>
-    </w:p>
-    <w:p>
-      <w:r>
-        <w:t>HTML</w:t>
-      </w:r>
-    </w:p>
-    <w:p>
-      <w:r>
-        <w:t xml:space="preserve">&lt;link </w:t>
-      </w:r>
-      <w:proofErr w:type="spellStart"/>
-      <w:r>
-        <w:t>rel</w:t>
-      </w:r>
-      <w:proofErr w:type="spellEnd"/>
-      <w:r>
-        <w:t>="</w:t>
-      </w:r>
-      <w:proofErr w:type="spellStart"/>
-      <w:r>
-        <w:t>manifest</w:t>
-      </w:r>
-      <w:proofErr w:type="spellEnd"/>
-      <w:r>
-        <w:t xml:space="preserve">" </w:t>
-      </w:r>
-      <w:proofErr w:type="spellStart"/>
-      <w:r>
-        <w:t>href</w:t>
-      </w:r>
-      <w:proofErr w:type="spellEnd"/>
-      <w:r>
-        <w:t>="/</w:t>
-      </w:r>
-      <w:proofErr w:type="spellStart"/>
-      <w:r>
-        <w:t>manifest.json</w:t>
-      </w:r>
-      <w:proofErr w:type="spellEnd"/>
-      <w:r>
-        <w:t>"&gt;</w:t>
-      </w:r>
-    </w:p>
-    <w:p>
-      <w:r>
-        <w:t xml:space="preserve">&lt;meta </w:t>
-      </w:r>
-      <w:proofErr w:type="spellStart"/>
-      <w:r>
-        <w:t>name</w:t>
-      </w:r>
-      <w:proofErr w:type="spellEnd"/>
-      <w:r>
-        <w:t>="</w:t>
-      </w:r>
-      <w:proofErr w:type="spellStart"/>
-      <w:r>
-        <w:t>theme</w:t>
-      </w:r>
-      <w:proofErr w:type="spellEnd"/>
-      <w:r>
-        <w:t xml:space="preserve">-color" </w:t>
-      </w:r>
-      <w:proofErr w:type="spellStart"/>
-      <w:r>
-        <w:t>content</w:t>
-      </w:r>
-      <w:proofErr w:type="spellEnd"/>
-      <w:r>
-        <w:t>="#0078d4"&gt;</w:t>
-      </w:r>
-    </w:p>
-    <w:p>
-      <w:pPr>
-        <w:rPr>
-          <w:b/>
-          <w:bCs/>
-        </w:rPr>
-      </w:pPr>
-      <w:r>
-        <w:rPr>
-          <w:b/>
-          <w:bCs/>
-        </w:rPr>
-        <w:t xml:space="preserve">Paso 3: Crear el </w:t>
-      </w:r>
-      <w:proofErr w:type="spellStart"/>
-      <w:r>
-        <w:rPr>
-          <w:b/>
-          <w:bCs/>
-        </w:rPr>
-        <w:t>Service</w:t>
-      </w:r>
-      <w:proofErr w:type="spellEnd"/>
-      <w:r>
-        <w:rPr>
-          <w:b/>
-          <w:bCs/>
-        </w:rPr>
+        <w:t xml:space="preserve"> cargue instantáneamente. Crea un archivo llamado sw.js en la raíz de tu proyecto con este código básico de almacenamiento en caché:</w:t>
+      </w:r>
+    </w:p>
+    <w:p>
+      <w:pPr>
+        <w:spacing w:after="0"/>
+      </w:pPr>
+      <w:r>
+        <w:t>JavaScript</w:t>
+      </w:r>
+    </w:p>
+    <w:p>
+      <w:pPr>
+        <w:spacing w:after="0"/>
+      </w:pPr>
+      <w:proofErr w:type="spellStart"/>
+      <w:proofErr w:type="gramStart"/>
+      <w:r>
+        <w:t>const</w:t>
+      </w:r>
+      <w:proofErr w:type="spellEnd"/>
+      <w:proofErr w:type="gramEnd"/>
+      <w:r>
+        <w:t xml:space="preserve"> CACHE_NAME = 'v1_cache_miapp';</w:t>
+      </w:r>
+    </w:p>
+    <w:p>
+      <w:pPr>
+        <w:spacing w:after="0"/>
+      </w:pPr>
+      <w:r>
+        <w:t>// Archivos esenciales que quieres que funcionen incluso sin internet</w:t>
+      </w:r>
+    </w:p>
+    <w:p>
+      <w:pPr>
+        <w:spacing w:after="0"/>
+      </w:pPr>
+      <w:proofErr w:type="spellStart"/>
+      <w:proofErr w:type="gramStart"/>
+      <w:r>
+        <w:t>const</w:t>
+      </w:r>
+      <w:proofErr w:type="spellEnd"/>
+      <w:proofErr w:type="gramEnd"/>
+      <w:r>
         <w:t xml:space="preserve"> </w:t>
       </w:r>
       <w:proofErr w:type="spellStart"/>
       <w:r>
-        <w:rPr>
-          <w:b/>
-          <w:bCs/>
-        </w:rPr>
-        <w:t>Worker</w:t>
-      </w:r>
-      <w:proofErr w:type="spellEnd"/>
-      <w:r>
-        <w:rPr>
-          <w:b/>
-          <w:bCs/>
-        </w:rPr>
-        <w:t xml:space="preserve"> (sw.js)</w:t>
-      </w:r>
-    </w:p>
-    <w:p>
-      <w:r>
-        <w:t xml:space="preserve">El </w:t>
-      </w:r>
-      <w:proofErr w:type="spellStart"/>
-      <w:r>
-        <w:t>Service</w:t>
-      </w:r>
-      <w:proofErr w:type="spellEnd"/>
+        <w:t>urlsToCache</w:t>
+      </w:r>
+      <w:proofErr w:type="spellEnd"/>
+      <w:r>
+        <w:t xml:space="preserve"> = [</w:t>
+      </w:r>
+    </w:p>
+    <w:p>
+      <w:pPr>
+        <w:spacing w:after="0"/>
+      </w:pPr>
+      <w:r>
+        <w:t xml:space="preserve">  '/',</w:t>
+      </w:r>
+    </w:p>
+    <w:p>
+      <w:pPr>
+        <w:spacing w:after="0"/>
+      </w:pPr>
+      <w:r>
+        <w:t xml:space="preserve">  '/index.html',</w:t>
+      </w:r>
+    </w:p>
+    <w:p>
+      <w:pPr>
+        <w:spacing w:after="0"/>
+      </w:pPr>
+      <w:r>
+        <w:t xml:space="preserve">  '/styles.css',</w:t>
+      </w:r>
+    </w:p>
+    <w:p>
+      <w:pPr>
+        <w:spacing w:after="0"/>
+      </w:pPr>
+      <w:r>
+        <w:t xml:space="preserve">  '/script.js',</w:t>
+      </w:r>
+    </w:p>
+    <w:p>
+      <w:pPr>
+        <w:spacing w:after="0"/>
+      </w:pPr>
+      <w:r>
+        <w:t xml:space="preserve">  '/icon-192.png'</w:t>
+      </w:r>
+    </w:p>
+    <w:p>
+      <w:pPr>
+        <w:spacing w:after="0"/>
+      </w:pPr>
+      <w:r>
+        <w:t>];</w:t>
+      </w:r>
+    </w:p>
+    <w:p>
+      <w:pPr>
+        <w:spacing w:after="0"/>
+      </w:pPr>
+    </w:p>
+    <w:p>
+      <w:pPr>
+        <w:spacing w:after="0"/>
+      </w:pPr>
+      <w:r>
+        <w:t>// Evento de instalación: Guarda los archivos en la caché del navegador</w:t>
+      </w:r>
+    </w:p>
+    <w:p>
+      <w:pPr>
+        <w:spacing w:after="0"/>
+      </w:pPr>
+      <w:proofErr w:type="spellStart"/>
+      <w:proofErr w:type="gramStart"/>
+      <w:r>
+        <w:t>self.addEventListener</w:t>
+      </w:r>
+      <w:proofErr w:type="spellEnd"/>
+      <w:r>
+        <w:t>(</w:t>
+      </w:r>
+      <w:proofErr w:type="gramEnd"/>
+      <w:r>
+        <w:t>'</w:t>
+      </w:r>
+      <w:proofErr w:type="spellStart"/>
+      <w:r>
+        <w:t>install</w:t>
+      </w:r>
+      <w:proofErr w:type="spellEnd"/>
+      <w:r>
+        <w:t>', e =&gt; {</w:t>
+      </w:r>
+    </w:p>
+    <w:p>
+      <w:pPr>
+        <w:spacing w:after="0"/>
+      </w:pPr>
+      <w:r>
+        <w:t xml:space="preserve">  </w:t>
+      </w:r>
+      <w:proofErr w:type="spellStart"/>
+      <w:proofErr w:type="gramStart"/>
+      <w:r>
+        <w:t>e.waitUntil</w:t>
+      </w:r>
+      <w:proofErr w:type="spellEnd"/>
+      <w:r>
+        <w:t>(</w:t>
+      </w:r>
+      <w:proofErr w:type="gramEnd"/>
+    </w:p>
+    <w:p>
+      <w:pPr>
+        <w:spacing w:after="0"/>
+      </w:pPr>
+      <w:r>
+        <w:t xml:space="preserve">    </w:t>
+      </w:r>
+      <w:proofErr w:type="spellStart"/>
+      <w:proofErr w:type="gramStart"/>
+      <w:r>
+        <w:t>caches.open</w:t>
+      </w:r>
+      <w:proofErr w:type="spellEnd"/>
+      <w:r>
+        <w:t>(</w:t>
+      </w:r>
+      <w:proofErr w:type="gramEnd"/>
+      <w:r>
+        <w:t>CACHE_NAME)</w:t>
+      </w:r>
+    </w:p>
+    <w:p>
+      <w:pPr>
+        <w:spacing w:after="0"/>
+      </w:pPr>
+      <w:r>
+        <w:t xml:space="preserve">      .</w:t>
+      </w:r>
+      <w:proofErr w:type="spellStart"/>
+      <w:proofErr w:type="gramStart"/>
+      <w:r>
+        <w:t>then</w:t>
+      </w:r>
+      <w:proofErr w:type="spellEnd"/>
+      <w:r>
+        <w:t>(</w:t>
+      </w:r>
+      <w:proofErr w:type="gramEnd"/>
+      <w:r>
+        <w:t>cache =&gt; {</w:t>
+      </w:r>
+    </w:p>
+    <w:p>
+      <w:pPr>
+        <w:spacing w:after="0"/>
+      </w:pPr>
+      <w:r>
+        <w:t xml:space="preserve">        </w:t>
+      </w:r>
+      <w:proofErr w:type="spellStart"/>
+      <w:proofErr w:type="gramStart"/>
+      <w:r>
+        <w:t>return</w:t>
+      </w:r>
+      <w:proofErr w:type="spellEnd"/>
+      <w:proofErr w:type="gramEnd"/>
       <w:r>
         <w:t xml:space="preserve"> </w:t>
       </w:r>
       <w:proofErr w:type="spellStart"/>
       <w:r>
-        <w:t>Worker</w:t>
-      </w:r>
-      <w:proofErr w:type="spellEnd"/>
-      <w:r>
-        <w:t xml:space="preserve"> es el motor que gestiona la caché y permite que la </w:t>
-      </w:r>
-      <w:proofErr w:type="spellStart"/>
-      <w:r>
-        <w:t>app</w:t>
-      </w:r>
-      <w:proofErr w:type="spellEnd"/>
-      <w:r>
-        <w:t xml:space="preserve"> cargue instantáneamente. Crea un archivo llamado sw.js en la raíz de tu proyecto con este código básico de almacenamiento en caché:</w:t>
-      </w:r>
-    </w:p>
-    <w:p>
-      <w:pPr>
-        <w:spacing w:after="0"/>
-      </w:pPr>
-      <w:r>
-        <w:t>JavaScript</w:t>
-      </w:r>
-    </w:p>
-    <w:p>
-      <w:pPr>
-        <w:spacing w:after="0"/>
-      </w:pPr>
+        <w:t>cache.addAll</w:t>
+      </w:r>
+      <w:proofErr w:type="spellEnd"/>
+      <w:r>
+        <w:t>(</w:t>
+      </w:r>
+      <w:proofErr w:type="spellStart"/>
+      <w:r>
+        <w:t>urlsToCache</w:t>
+      </w:r>
+      <w:proofErr w:type="spellEnd"/>
+      <w:r>
+        <w:t>);</w:t>
+      </w:r>
+    </w:p>
+    <w:p>
+      <w:pPr>
+        <w:spacing w:after="0"/>
+      </w:pPr>
+      <w:r>
+        <w:t xml:space="preserve">      })</w:t>
+      </w:r>
+    </w:p>
+    <w:p>
+      <w:pPr>
+        <w:spacing w:after="0"/>
+      </w:pPr>
+      <w:r>
+        <w:t xml:space="preserve">      .</w:t>
+      </w:r>
       <w:proofErr w:type="spellStart"/>
       <w:proofErr w:type="gramStart"/>
       <w:r>
-        <w:t>const</w:t>
-      </w:r>
-      <w:proofErr w:type="spellEnd"/>
+        <w:t>then</w:t>
+      </w:r>
+      <w:proofErr w:type="spellEnd"/>
+      <w:r>
+        <w:t>(</w:t>
+      </w:r>
       <w:proofErr w:type="gramEnd"/>
       <w:r>
-        <w:t xml:space="preserve"> CACHE_NAME = 'v1_cache_miapp';</w:t>
+        <w:t xml:space="preserve">() =&gt; </w:t>
+      </w:r>
+      <w:proofErr w:type="spellStart"/>
+      <w:r>
+        <w:t>self.skipWaiting</w:t>
+      </w:r>
+      <w:proofErr w:type="spellEnd"/>
+      <w:r>
+        <w:t>())</w:t>
+      </w:r>
+    </w:p>
+    <w:p>
+      <w:pPr>
+        <w:spacing w:after="0"/>
+      </w:pPr>
+      <w:r>
+        <w:t xml:space="preserve">  );</w:t>
+      </w:r>
+    </w:p>
+    <w:p>
+      <w:pPr>
+        <w:spacing w:after="0"/>
+      </w:pPr>
+      <w:r>
+        <w:t>});</w:t>
+      </w:r>
+    </w:p>
+    <w:p>
+      <w:pPr>
+        <w:spacing w:after="0"/>
+      </w:pPr>
+    </w:p>
+    <w:p>
+      <w:pPr>
+        <w:spacing w:after="0"/>
+      </w:pPr>
+      <w:r>
+        <w:t>// Evento de activación: Limpia cachés antiguas</w:t>
+      </w:r>
+    </w:p>
+    <w:p>
+      <w:pPr>
+        <w:spacing w:after="0"/>
+      </w:pPr>
+      <w:proofErr w:type="spellStart"/>
+      <w:proofErr w:type="gramStart"/>
+      <w:r>
+        <w:t>self.addEventListener</w:t>
+      </w:r>
+      <w:proofErr w:type="spellEnd"/>
+      <w:r>
+        <w:t>(</w:t>
+      </w:r>
+      <w:proofErr w:type="gramEnd"/>
+      <w:r>
+        <w:t>'</w:t>
+      </w:r>
+      <w:proofErr w:type="spellStart"/>
+      <w:r>
+        <w:t>activate</w:t>
+      </w:r>
+      <w:proofErr w:type="spellEnd"/>
+      <w:r>
+        <w:t>', e =&gt; {</w:t>
+      </w:r>
+    </w:p>
+    <w:p>
+      <w:pPr>
+        <w:spacing w:after="0"/>
+      </w:pPr>
+      <w:r>
+        <w:t xml:space="preserve">  </w:t>
+      </w:r>
+      <w:proofErr w:type="spellStart"/>
+      <w:proofErr w:type="gramStart"/>
+      <w:r>
+        <w:t>e.waitUntil</w:t>
+      </w:r>
+      <w:proofErr w:type="spellEnd"/>
+      <w:r>
+        <w:t>(</w:t>
+      </w:r>
+      <w:proofErr w:type="gramEnd"/>
+    </w:p>
+    <w:p>
+      <w:pPr>
+        <w:spacing w:after="0"/>
+      </w:pPr>
+      <w:r>
+        <w:t xml:space="preserve">    </w:t>
+      </w:r>
+      <w:proofErr w:type="spellStart"/>
+      <w:proofErr w:type="gramStart"/>
+      <w:r>
+        <w:t>caches.keys</w:t>
+      </w:r>
+      <w:proofErr w:type="spellEnd"/>
+      <w:r>
+        <w:t>(</w:t>
+      </w:r>
+      <w:proofErr w:type="gramEnd"/>
+      <w:r>
+        <w:t>).</w:t>
+      </w:r>
+      <w:proofErr w:type="spellStart"/>
+      <w:r>
+        <w:t>then</w:t>
+      </w:r>
+      <w:proofErr w:type="spellEnd"/>
+      <w:r>
+        <w:t>(</w:t>
+      </w:r>
+      <w:proofErr w:type="spellStart"/>
+      <w:r>
+        <w:t>cacheNames</w:t>
+      </w:r>
+      <w:proofErr w:type="spellEnd"/>
+      <w:r>
+        <w:t xml:space="preserve"> =&gt; {</w:t>
+      </w:r>
+    </w:p>
+    <w:p>
+      <w:pPr>
+        <w:spacing w:after="0"/>
+      </w:pPr>
+      <w:r>
+        <w:t xml:space="preserve">      </w:t>
+      </w:r>
+      <w:proofErr w:type="spellStart"/>
+      <w:proofErr w:type="gramStart"/>
+      <w:r>
+        <w:t>return</w:t>
+      </w:r>
+      <w:proofErr w:type="spellEnd"/>
+      <w:proofErr w:type="gramEnd"/>
+      <w:r>
+        <w:t xml:space="preserve"> </w:t>
+      </w:r>
+      <w:proofErr w:type="spellStart"/>
+      <w:r>
+        <w:t>Promise.all</w:t>
+      </w:r>
+      <w:proofErr w:type="spellEnd"/>
+      <w:r>
+        <w:t>(</w:t>
+      </w:r>
+    </w:p>
+    <w:p>
+      <w:pPr>
+        <w:spacing w:after="0"/>
+      </w:pPr>
+      <w:r>
+        <w:t xml:space="preserve">        </w:t>
+      </w:r>
+      <w:proofErr w:type="spellStart"/>
+      <w:proofErr w:type="gramStart"/>
+      <w:r>
+        <w:t>cacheNames.map</w:t>
+      </w:r>
+      <w:proofErr w:type="spellEnd"/>
+      <w:r>
+        <w:t>(</w:t>
+      </w:r>
+      <w:proofErr w:type="gramEnd"/>
+      <w:r>
+        <w:t>cache =&gt; {</w:t>
+      </w:r>
+    </w:p>
+    <w:p>
+      <w:pPr>
+        <w:spacing w:after="0"/>
+      </w:pPr>
+      <w:r>
+        <w:t xml:space="preserve">          </w:t>
+      </w:r>
+      <w:proofErr w:type="spellStart"/>
+      <w:proofErr w:type="gramStart"/>
+      <w:r>
+        <w:t>if</w:t>
+      </w:r>
+      <w:proofErr w:type="spellEnd"/>
+      <w:proofErr w:type="gramEnd"/>
+      <w:r>
+        <w:t xml:space="preserve"> (cache !== CACHE_NAME) {</w:t>
+      </w:r>
+    </w:p>
+    <w:p>
+      <w:pPr>
+        <w:spacing w:after="0"/>
+      </w:pPr>
+      <w:r>
+        <w:t xml:space="preserve">            </w:t>
+      </w:r>
+      <w:proofErr w:type="spellStart"/>
+      <w:proofErr w:type="gramStart"/>
+      <w:r>
+        <w:t>return</w:t>
+      </w:r>
+      <w:proofErr w:type="spellEnd"/>
+      <w:proofErr w:type="gramEnd"/>
+      <w:r>
+        <w:t xml:space="preserve"> </w:t>
+      </w:r>
+      <w:proofErr w:type="spellStart"/>
+      <w:r>
+        <w:t>caches.delete</w:t>
+      </w:r>
+      <w:proofErr w:type="spellEnd"/>
+      <w:r>
+        <w:t>(cache);</w:t>
+      </w:r>
+    </w:p>
+    <w:p>
+      <w:pPr>
+        <w:spacing w:after="0"/>
+      </w:pPr>
+      <w:r>
+        <w:t xml:space="preserve">          }</w:t>
+      </w:r>
+    </w:p>
+    <w:p>
+      <w:pPr>
+        <w:spacing w:after="0"/>
+      </w:pPr>
+      <w:r>
+        <w:t xml:space="preserve">        })</w:t>
+      </w:r>
+    </w:p>
+    <w:p>
+      <w:pPr>
+        <w:spacing w:after="0"/>
+      </w:pPr>
+      <w:r>
+        <w:t xml:space="preserve">      );</w:t>
+      </w:r>
+    </w:p>
+    <w:p>
+      <w:pPr>
+        <w:spacing w:after="0"/>
+      </w:pPr>
+      <w:r>
+        <w:t xml:space="preserve">    })</w:t>
+      </w:r>
+    </w:p>
+    <w:p>
+      <w:pPr>
+        <w:spacing w:after="0"/>
+      </w:pPr>
+      <w:r>
+        <w:t xml:space="preserve">  );</w:t>
+      </w:r>
+    </w:p>
+    <w:p>
+      <w:pPr>
+        <w:spacing w:after="0"/>
+      </w:pPr>
+      <w:r>
+        <w:t>});</w:t>
+      </w:r>
+    </w:p>
+    <w:p>
+      <w:pPr>
+        <w:spacing w:after="0"/>
+      </w:pPr>
+    </w:p>
+    <w:p>
+      <w:pPr>
+        <w:spacing w:after="0"/>
+      </w:pPr>
+      <w:r>
+        <w:t xml:space="preserve">// Evento </w:t>
+      </w:r>
+      <w:proofErr w:type="spellStart"/>
+      <w:r>
+        <w:t>fetch</w:t>
+      </w:r>
+      <w:proofErr w:type="spellEnd"/>
+      <w:r>
+        <w:t>: Sirve el contenido desde la caché si no hay internet</w:t>
+      </w:r>
+    </w:p>
+    <w:p>
+      <w:pPr>
+        <w:spacing w:after="0"/>
+      </w:pPr>
+      <w:proofErr w:type="spellStart"/>
+      <w:proofErr w:type="gramStart"/>
+      <w:r>
+        <w:t>self.addEventListener</w:t>
+      </w:r>
+      <w:proofErr w:type="spellEnd"/>
+      <w:r>
+        <w:t>(</w:t>
+      </w:r>
+      <w:proofErr w:type="gramEnd"/>
+      <w:r>
+        <w:t>'</w:t>
+      </w:r>
+      <w:proofErr w:type="spellStart"/>
+      <w:r>
+        <w:t>fetch</w:t>
+      </w:r>
+      <w:proofErr w:type="spellEnd"/>
+      <w:r>
+        <w:t>', e =&gt; {</w:t>
+      </w:r>
+    </w:p>
+    <w:p>
+      <w:pPr>
+        <w:spacing w:after="0"/>
+      </w:pPr>
+      <w:r>
+        <w:t xml:space="preserve">  </w:t>
+      </w:r>
+      <w:proofErr w:type="spellStart"/>
+      <w:proofErr w:type="gramStart"/>
+      <w:r>
+        <w:t>e.respondWith</w:t>
+      </w:r>
+      <w:proofErr w:type="spellEnd"/>
+      <w:r>
+        <w:t>(</w:t>
+      </w:r>
+      <w:proofErr w:type="gramEnd"/>
+    </w:p>
+    <w:p>
+      <w:pPr>
+        <w:spacing w:after="0"/>
+      </w:pPr>
+      <w:r>
+        <w:t xml:space="preserve">    </w:t>
+      </w:r>
+      <w:proofErr w:type="spellStart"/>
+      <w:proofErr w:type="gramStart"/>
+      <w:r>
+        <w:t>caches.match</w:t>
+      </w:r>
+      <w:proofErr w:type="spellEnd"/>
+      <w:r>
+        <w:t>(</w:t>
+      </w:r>
+      <w:proofErr w:type="spellStart"/>
+      <w:proofErr w:type="gramEnd"/>
+      <w:r>
+        <w:t>e.request</w:t>
+      </w:r>
+      <w:proofErr w:type="spellEnd"/>
+      <w:r>
+        <w:t>)</w:t>
       </w:r>
     </w:p>
     <w:p>
@@ -19817,211 +20528,98 @@
       </w:pPr>
       <w:r>
         <w:lastRenderedPageBreak/>
-        <w:t>// Archivos esenciales que quieres que funcionen incluso sin internet</w:t>
-      </w:r>
-    </w:p>
-    <w:p>
-      <w:pPr>
-        <w:spacing w:after="0"/>
-      </w:pPr>
+        <w:t xml:space="preserve">      .</w:t>
+      </w:r>
       <w:proofErr w:type="spellStart"/>
       <w:proofErr w:type="gramStart"/>
       <w:r>
-        <w:t>const</w:t>
-      </w:r>
-      <w:proofErr w:type="spellEnd"/>
+        <w:t>then</w:t>
+      </w:r>
+      <w:proofErr w:type="spellEnd"/>
+      <w:r>
+        <w:t>(</w:t>
+      </w:r>
       <w:proofErr w:type="gramEnd"/>
       <w:r>
+        <w:t>res =&gt; {</w:t>
+      </w:r>
+    </w:p>
+    <w:p>
+      <w:pPr>
+        <w:spacing w:after="0"/>
+      </w:pPr>
+      <w:r>
+        <w:t xml:space="preserve">        </w:t>
+      </w:r>
+      <w:proofErr w:type="spellStart"/>
+      <w:proofErr w:type="gramStart"/>
+      <w:r>
+        <w:t>if</w:t>
+      </w:r>
+      <w:proofErr w:type="spellEnd"/>
+      <w:proofErr w:type="gramEnd"/>
+      <w:r>
+        <w:t xml:space="preserve"> (res) {</w:t>
+      </w:r>
+    </w:p>
+    <w:p>
+      <w:pPr>
+        <w:spacing w:after="0"/>
+      </w:pPr>
+      <w:r>
+        <w:t xml:space="preserve">          </w:t>
+      </w:r>
+      <w:proofErr w:type="spellStart"/>
+      <w:proofErr w:type="gramStart"/>
+      <w:r>
+        <w:t>return</w:t>
+      </w:r>
+      <w:proofErr w:type="spellEnd"/>
+      <w:proofErr w:type="gramEnd"/>
+      <w:r>
+        <w:t xml:space="preserve"> res; // Devuelve lo que está en caché</w:t>
+      </w:r>
+    </w:p>
+    <w:p>
+      <w:pPr>
+        <w:spacing w:after="0"/>
+      </w:pPr>
+      <w:r>
+        <w:t xml:space="preserve">        }</w:t>
+      </w:r>
+    </w:p>
+    <w:p>
+      <w:pPr>
+        <w:spacing w:after="0"/>
+      </w:pPr>
+      <w:r>
+        <w:t xml:space="preserve">        </w:t>
+      </w:r>
+      <w:proofErr w:type="spellStart"/>
+      <w:proofErr w:type="gramStart"/>
+      <w:r>
+        <w:t>return</w:t>
+      </w:r>
+      <w:proofErr w:type="spellEnd"/>
+      <w:proofErr w:type="gramEnd"/>
+      <w:r>
         <w:t xml:space="preserve"> </w:t>
       </w:r>
       <w:proofErr w:type="spellStart"/>
       <w:r>
-        <w:t>urlsToCache</w:t>
-      </w:r>
-      <w:proofErr w:type="spellEnd"/>
-      <w:r>
-        <w:t xml:space="preserve"> = [</w:t>
-      </w:r>
-    </w:p>
-    <w:p>
-      <w:pPr>
-        <w:spacing w:after="0"/>
-      </w:pPr>
-      <w:r>
-        <w:t xml:space="preserve">  '/',</w:t>
-      </w:r>
-    </w:p>
-    <w:p>
-      <w:pPr>
-        <w:spacing w:after="0"/>
-      </w:pPr>
-      <w:r>
-        <w:t xml:space="preserve">  '/index.html',</w:t>
-      </w:r>
-    </w:p>
-    <w:p>
-      <w:pPr>
-        <w:spacing w:after="0"/>
-      </w:pPr>
-      <w:r>
-        <w:t xml:space="preserve">  '/styles.css',</w:t>
-      </w:r>
-    </w:p>
-    <w:p>
-      <w:pPr>
-        <w:spacing w:after="0"/>
-      </w:pPr>
-      <w:r>
-        <w:t xml:space="preserve">  '/script.js',</w:t>
-      </w:r>
-    </w:p>
-    <w:p>
-      <w:pPr>
-        <w:spacing w:after="0"/>
-      </w:pPr>
-      <w:r>
-        <w:t xml:space="preserve">  '/icon-192.png'</w:t>
-      </w:r>
-    </w:p>
-    <w:p>
-      <w:pPr>
-        <w:spacing w:after="0"/>
-      </w:pPr>
-      <w:r>
-        <w:t>];</w:t>
-      </w:r>
-    </w:p>
-    <w:p>
-      <w:pPr>
-        <w:spacing w:after="0"/>
-      </w:pPr>
-    </w:p>
-    <w:p>
-      <w:pPr>
-        <w:spacing w:after="0"/>
-      </w:pPr>
-      <w:r>
-        <w:t>// Evento de instalación: Guarda los archivos en la caché del navegador</w:t>
-      </w:r>
-    </w:p>
-    <w:p>
-      <w:pPr>
-        <w:spacing w:after="0"/>
-      </w:pPr>
-      <w:proofErr w:type="spellStart"/>
-      <w:proofErr w:type="gramStart"/>
-      <w:r>
-        <w:t>self.addEventListener</w:t>
+        <w:t>fetch</w:t>
       </w:r>
       <w:proofErr w:type="spellEnd"/>
       <w:r>
         <w:t>(</w:t>
       </w:r>
-      <w:proofErr w:type="gramEnd"/>
-      <w:r>
-        <w:t>'</w:t>
-      </w:r>
-      <w:proofErr w:type="spellStart"/>
-      <w:r>
-        <w:t>install</w:t>
-      </w:r>
-      <w:proofErr w:type="spellEnd"/>
-      <w:r>
-        <w:t>', e =&gt; {</w:t>
-      </w:r>
-    </w:p>
-    <w:p>
-      <w:pPr>
-        <w:spacing w:after="0"/>
-      </w:pPr>
-      <w:r>
-        <w:t xml:space="preserve">  </w:t>
-      </w:r>
-      <w:proofErr w:type="spellStart"/>
-      <w:proofErr w:type="gramStart"/>
-      <w:r>
-        <w:t>e.waitUntil</w:t>
-      </w:r>
-      <w:proofErr w:type="spellEnd"/>
-      <w:r>
-        <w:t>(</w:t>
-      </w:r>
-      <w:proofErr w:type="gramEnd"/>
-    </w:p>
-    <w:p>
-      <w:pPr>
-        <w:spacing w:after="0"/>
-      </w:pPr>
-      <w:r>
-        <w:t xml:space="preserve">    </w:t>
-      </w:r>
-      <w:proofErr w:type="spellStart"/>
-      <w:proofErr w:type="gramStart"/>
-      <w:r>
-        <w:t>caches.open</w:t>
-      </w:r>
-      <w:proofErr w:type="spellEnd"/>
-      <w:r>
-        <w:t>(</w:t>
-      </w:r>
-      <w:proofErr w:type="gramEnd"/>
-      <w:r>
-        <w:t>CACHE_NAME)</w:t>
-      </w:r>
-    </w:p>
-    <w:p>
-      <w:pPr>
-        <w:spacing w:after="0"/>
-      </w:pPr>
-      <w:r>
-        <w:t xml:space="preserve">      .</w:t>
-      </w:r>
-      <w:proofErr w:type="spellStart"/>
-      <w:proofErr w:type="gramStart"/>
-      <w:r>
-        <w:t>then</w:t>
-      </w:r>
-      <w:proofErr w:type="spellEnd"/>
-      <w:r>
-        <w:t>(</w:t>
-      </w:r>
-      <w:proofErr w:type="gramEnd"/>
-      <w:r>
-        <w:t>cache =&gt; {</w:t>
-      </w:r>
-    </w:p>
-    <w:p>
-      <w:pPr>
-        <w:spacing w:after="0"/>
-      </w:pPr>
-      <w:r>
-        <w:t xml:space="preserve">        </w:t>
-      </w:r>
-      <w:proofErr w:type="spellStart"/>
-      <w:proofErr w:type="gramStart"/>
-      <w:r>
-        <w:t>return</w:t>
-      </w:r>
-      <w:proofErr w:type="spellEnd"/>
-      <w:proofErr w:type="gramEnd"/>
-      <w:r>
-        <w:t xml:space="preserve"> </w:t>
-      </w:r>
-      <w:proofErr w:type="spellStart"/>
-      <w:r>
-        <w:t>cache.addAll</w:t>
-      </w:r>
-      <w:proofErr w:type="spellEnd"/>
-      <w:r>
-        <w:t>(</w:t>
-      </w:r>
-      <w:proofErr w:type="spellStart"/>
-      <w:r>
-        <w:t>urlsToCache</w:t>
-      </w:r>
-      <w:proofErr w:type="spellEnd"/>
-      <w:r>
-        <w:t>);</w:t>
+      <w:proofErr w:type="spellStart"/>
+      <w:r>
+        <w:t>e.request</w:t>
+      </w:r>
+      <w:proofErr w:type="spellEnd"/>
+      <w:r>
+        <w:t>); // Si no está en caché, va a internet</w:t>
       </w:r>
     </w:p>
     <w:p>
@@ -20037,483 +20635,6 @@
         <w:spacing w:after="0"/>
       </w:pPr>
       <w:r>
-        <w:t xml:space="preserve">      .</w:t>
-      </w:r>
-      <w:proofErr w:type="spellStart"/>
-      <w:proofErr w:type="gramStart"/>
-      <w:r>
-        <w:t>then</w:t>
-      </w:r>
-      <w:proofErr w:type="spellEnd"/>
-      <w:r>
-        <w:t>(</w:t>
-      </w:r>
-      <w:proofErr w:type="gramEnd"/>
-      <w:r>
-        <w:t xml:space="preserve">() =&gt; </w:t>
-      </w:r>
-      <w:proofErr w:type="spellStart"/>
-      <w:r>
-        <w:t>self.skipWaiting</w:t>
-      </w:r>
-      <w:proofErr w:type="spellEnd"/>
-      <w:r>
-        <w:t>())</w:t>
-      </w:r>
-    </w:p>
-    <w:p>
-      <w:pPr>
-        <w:spacing w:after="0"/>
-      </w:pPr>
-      <w:r>
-        <w:t xml:space="preserve">  );</w:t>
-      </w:r>
-    </w:p>
-    <w:p>
-      <w:pPr>
-        <w:spacing w:after="0"/>
-      </w:pPr>
-      <w:r>
-        <w:t>});</w:t>
-      </w:r>
-    </w:p>
-    <w:p>
-      <w:pPr>
-        <w:spacing w:after="0"/>
-      </w:pPr>
-    </w:p>
-    <w:p>
-      <w:pPr>
-        <w:spacing w:after="0"/>
-      </w:pPr>
-      <w:r>
-        <w:t>// Evento de activación: Limpia cachés antiguas</w:t>
-      </w:r>
-    </w:p>
-    <w:p>
-      <w:pPr>
-        <w:spacing w:after="0"/>
-      </w:pPr>
-      <w:proofErr w:type="spellStart"/>
-      <w:proofErr w:type="gramStart"/>
-      <w:r>
-        <w:t>self.addEventListener</w:t>
-      </w:r>
-      <w:proofErr w:type="spellEnd"/>
-      <w:r>
-        <w:t>(</w:t>
-      </w:r>
-      <w:proofErr w:type="gramEnd"/>
-      <w:r>
-        <w:t>'</w:t>
-      </w:r>
-      <w:proofErr w:type="spellStart"/>
-      <w:r>
-        <w:t>activate</w:t>
-      </w:r>
-      <w:proofErr w:type="spellEnd"/>
-      <w:r>
-        <w:t>', e =&gt; {</w:t>
-      </w:r>
-    </w:p>
-    <w:p>
-      <w:pPr>
-        <w:spacing w:after="0"/>
-      </w:pPr>
-      <w:r>
-        <w:t xml:space="preserve">  </w:t>
-      </w:r>
-      <w:proofErr w:type="spellStart"/>
-      <w:proofErr w:type="gramStart"/>
-      <w:r>
-        <w:t>e.waitUntil</w:t>
-      </w:r>
-      <w:proofErr w:type="spellEnd"/>
-      <w:r>
-        <w:t>(</w:t>
-      </w:r>
-      <w:proofErr w:type="gramEnd"/>
-    </w:p>
-    <w:p>
-      <w:pPr>
-        <w:spacing w:after="0"/>
-      </w:pPr>
-      <w:r>
-        <w:t xml:space="preserve">    </w:t>
-      </w:r>
-      <w:proofErr w:type="spellStart"/>
-      <w:proofErr w:type="gramStart"/>
-      <w:r>
-        <w:t>caches.keys</w:t>
-      </w:r>
-      <w:proofErr w:type="spellEnd"/>
-      <w:r>
-        <w:t>(</w:t>
-      </w:r>
-      <w:proofErr w:type="gramEnd"/>
-      <w:r>
-        <w:t>).</w:t>
-      </w:r>
-      <w:proofErr w:type="spellStart"/>
-      <w:r>
-        <w:t>then</w:t>
-      </w:r>
-      <w:proofErr w:type="spellEnd"/>
-      <w:r>
-        <w:t>(</w:t>
-      </w:r>
-      <w:proofErr w:type="spellStart"/>
-      <w:r>
-        <w:t>cacheNames</w:t>
-      </w:r>
-      <w:proofErr w:type="spellEnd"/>
-      <w:r>
-        <w:t xml:space="preserve"> =&gt; {</w:t>
-      </w:r>
-    </w:p>
-    <w:p>
-      <w:pPr>
-        <w:spacing w:after="0"/>
-      </w:pPr>
-      <w:r>
-        <w:t xml:space="preserve">      </w:t>
-      </w:r>
-      <w:proofErr w:type="spellStart"/>
-      <w:proofErr w:type="gramStart"/>
-      <w:r>
-        <w:t>return</w:t>
-      </w:r>
-      <w:proofErr w:type="spellEnd"/>
-      <w:proofErr w:type="gramEnd"/>
-      <w:r>
-        <w:t xml:space="preserve"> </w:t>
-      </w:r>
-      <w:proofErr w:type="spellStart"/>
-      <w:r>
-        <w:t>Promise.all</w:t>
-      </w:r>
-      <w:proofErr w:type="spellEnd"/>
-      <w:r>
-        <w:t>(</w:t>
-      </w:r>
-    </w:p>
-    <w:p>
-      <w:pPr>
-        <w:spacing w:after="0"/>
-      </w:pPr>
-      <w:r>
-        <w:t xml:space="preserve">        </w:t>
-      </w:r>
-      <w:proofErr w:type="spellStart"/>
-      <w:proofErr w:type="gramStart"/>
-      <w:r>
-        <w:t>cacheNames.map</w:t>
-      </w:r>
-      <w:proofErr w:type="spellEnd"/>
-      <w:r>
-        <w:t>(</w:t>
-      </w:r>
-      <w:proofErr w:type="gramEnd"/>
-      <w:r>
-        <w:t>cache =&gt; {</w:t>
-      </w:r>
-    </w:p>
-    <w:p>
-      <w:pPr>
-        <w:spacing w:after="0"/>
-      </w:pPr>
-      <w:r>
-        <w:t xml:space="preserve">          </w:t>
-      </w:r>
-      <w:proofErr w:type="spellStart"/>
-      <w:proofErr w:type="gramStart"/>
-      <w:r>
-        <w:t>if</w:t>
-      </w:r>
-      <w:proofErr w:type="spellEnd"/>
-      <w:proofErr w:type="gramEnd"/>
-      <w:r>
-        <w:t xml:space="preserve"> (cache !== CACHE_NAME) {</w:t>
-      </w:r>
-    </w:p>
-    <w:p>
-      <w:pPr>
-        <w:spacing w:after="0"/>
-      </w:pPr>
-      <w:r>
-        <w:t xml:space="preserve">            </w:t>
-      </w:r>
-      <w:proofErr w:type="spellStart"/>
-      <w:proofErr w:type="gramStart"/>
-      <w:r>
-        <w:t>return</w:t>
-      </w:r>
-      <w:proofErr w:type="spellEnd"/>
-      <w:proofErr w:type="gramEnd"/>
-      <w:r>
-        <w:t xml:space="preserve"> </w:t>
-      </w:r>
-      <w:proofErr w:type="spellStart"/>
-      <w:r>
-        <w:t>caches.delete</w:t>
-      </w:r>
-      <w:proofErr w:type="spellEnd"/>
-      <w:r>
-        <w:t>(cache);</w:t>
-      </w:r>
-    </w:p>
-    <w:p>
-      <w:pPr>
-        <w:spacing w:after="0"/>
-      </w:pPr>
-      <w:r>
-        <w:t xml:space="preserve">          }</w:t>
-      </w:r>
-    </w:p>
-    <w:p>
-      <w:pPr>
-        <w:spacing w:after="0"/>
-      </w:pPr>
-      <w:r>
-        <w:t xml:space="preserve">        })</w:t>
-      </w:r>
-    </w:p>
-    <w:p>
-      <w:pPr>
-        <w:spacing w:after="0"/>
-      </w:pPr>
-      <w:r>
-        <w:t xml:space="preserve">      );</w:t>
-      </w:r>
-    </w:p>
-    <w:p>
-      <w:pPr>
-        <w:spacing w:after="0"/>
-      </w:pPr>
-      <w:r>
-        <w:t xml:space="preserve">    })</w:t>
-      </w:r>
-    </w:p>
-    <w:p>
-      <w:pPr>
-        <w:spacing w:after="0"/>
-      </w:pPr>
-      <w:r>
-        <w:t xml:space="preserve">  );</w:t>
-      </w:r>
-    </w:p>
-    <w:p>
-      <w:pPr>
-        <w:spacing w:after="0"/>
-      </w:pPr>
-      <w:r>
-        <w:t>});</w:t>
-      </w:r>
-    </w:p>
-    <w:p>
-      <w:pPr>
-        <w:spacing w:after="0"/>
-      </w:pPr>
-    </w:p>
-    <w:p>
-      <w:pPr>
-        <w:spacing w:after="0"/>
-      </w:pPr>
-      <w:r>
-        <w:t xml:space="preserve">// Evento </w:t>
-      </w:r>
-      <w:proofErr w:type="spellStart"/>
-      <w:r>
-        <w:t>fetch</w:t>
-      </w:r>
-      <w:proofErr w:type="spellEnd"/>
-      <w:r>
-        <w:t>: Sirve el contenido desde la caché si no hay internet</w:t>
-      </w:r>
-    </w:p>
-    <w:p>
-      <w:pPr>
-        <w:spacing w:after="0"/>
-      </w:pPr>
-      <w:proofErr w:type="spellStart"/>
-      <w:proofErr w:type="gramStart"/>
-      <w:r>
-        <w:t>self.addEventListener</w:t>
-      </w:r>
-      <w:proofErr w:type="spellEnd"/>
-      <w:r>
-        <w:t>(</w:t>
-      </w:r>
-      <w:proofErr w:type="gramEnd"/>
-      <w:r>
-        <w:t>'</w:t>
-      </w:r>
-      <w:proofErr w:type="spellStart"/>
-      <w:r>
-        <w:t>fetch</w:t>
-      </w:r>
-      <w:proofErr w:type="spellEnd"/>
-      <w:r>
-        <w:t>', e =&gt; {</w:t>
-      </w:r>
-    </w:p>
-    <w:p>
-      <w:pPr>
-        <w:spacing w:after="0"/>
-      </w:pPr>
-      <w:r>
-        <w:t xml:space="preserve">  </w:t>
-      </w:r>
-      <w:proofErr w:type="spellStart"/>
-      <w:proofErr w:type="gramStart"/>
-      <w:r>
-        <w:t>e.respondWith</w:t>
-      </w:r>
-      <w:proofErr w:type="spellEnd"/>
-      <w:r>
-        <w:t>(</w:t>
-      </w:r>
-      <w:proofErr w:type="gramEnd"/>
-    </w:p>
-    <w:p>
-      <w:pPr>
-        <w:spacing w:after="0"/>
-      </w:pPr>
-      <w:r>
-        <w:t xml:space="preserve">    </w:t>
-      </w:r>
-      <w:proofErr w:type="spellStart"/>
-      <w:proofErr w:type="gramStart"/>
-      <w:r>
-        <w:t>caches.match</w:t>
-      </w:r>
-      <w:proofErr w:type="spellEnd"/>
-      <w:r>
-        <w:t>(</w:t>
-      </w:r>
-      <w:proofErr w:type="spellStart"/>
-      <w:proofErr w:type="gramEnd"/>
-      <w:r>
-        <w:t>e.request</w:t>
-      </w:r>
-      <w:proofErr w:type="spellEnd"/>
-      <w:r>
-        <w:t>)</w:t>
-      </w:r>
-    </w:p>
-    <w:p>
-      <w:pPr>
-        <w:spacing w:after="0"/>
-      </w:pPr>
-      <w:r>
-        <w:t xml:space="preserve">      .</w:t>
-      </w:r>
-      <w:proofErr w:type="spellStart"/>
-      <w:proofErr w:type="gramStart"/>
-      <w:r>
-        <w:t>then</w:t>
-      </w:r>
-      <w:proofErr w:type="spellEnd"/>
-      <w:r>
-        <w:t>(</w:t>
-      </w:r>
-      <w:proofErr w:type="gramEnd"/>
-      <w:r>
-        <w:t>res =&gt; {</w:t>
-      </w:r>
-    </w:p>
-    <w:p>
-      <w:pPr>
-        <w:spacing w:after="0"/>
-      </w:pPr>
-      <w:r>
-        <w:t xml:space="preserve">        </w:t>
-      </w:r>
-      <w:proofErr w:type="spellStart"/>
-      <w:proofErr w:type="gramStart"/>
-      <w:r>
-        <w:t>if</w:t>
-      </w:r>
-      <w:proofErr w:type="spellEnd"/>
-      <w:proofErr w:type="gramEnd"/>
-      <w:r>
-        <w:t xml:space="preserve"> (res) {</w:t>
-      </w:r>
-    </w:p>
-    <w:p>
-      <w:pPr>
-        <w:spacing w:after="0"/>
-      </w:pPr>
-      <w:r>
-        <w:t xml:space="preserve">          </w:t>
-      </w:r>
-      <w:proofErr w:type="spellStart"/>
-      <w:proofErr w:type="gramStart"/>
-      <w:r>
-        <w:t>return</w:t>
-      </w:r>
-      <w:proofErr w:type="spellEnd"/>
-      <w:proofErr w:type="gramEnd"/>
-      <w:r>
-        <w:t xml:space="preserve"> res; // Devuelve lo que está en caché</w:t>
-      </w:r>
-    </w:p>
-    <w:p>
-      <w:pPr>
-        <w:spacing w:after="0"/>
-      </w:pPr>
-      <w:r>
-        <w:t xml:space="preserve">        }</w:t>
-      </w:r>
-    </w:p>
-    <w:p>
-      <w:pPr>
-        <w:spacing w:after="0"/>
-      </w:pPr>
-      <w:r>
-        <w:t xml:space="preserve">        </w:t>
-      </w:r>
-      <w:proofErr w:type="spellStart"/>
-      <w:proofErr w:type="gramStart"/>
-      <w:r>
-        <w:t>return</w:t>
-      </w:r>
-      <w:proofErr w:type="spellEnd"/>
-      <w:proofErr w:type="gramEnd"/>
-      <w:r>
-        <w:t xml:space="preserve"> </w:t>
-      </w:r>
-      <w:proofErr w:type="spellStart"/>
-      <w:r>
-        <w:t>fetch</w:t>
-      </w:r>
-      <w:proofErr w:type="spellEnd"/>
-      <w:r>
-        <w:t>(</w:t>
-      </w:r>
-      <w:proofErr w:type="spellStart"/>
-      <w:r>
-        <w:t>e.request</w:t>
-      </w:r>
-      <w:proofErr w:type="spellEnd"/>
-      <w:r>
-        <w:t>); // Si no está en caché, va a internet</w:t>
-      </w:r>
-    </w:p>
-    <w:p>
-      <w:pPr>
-        <w:spacing w:after="0"/>
-      </w:pPr>
-      <w:r>
-        <w:t xml:space="preserve">      })</w:t>
-      </w:r>
-    </w:p>
-    <w:p>
-      <w:pPr>
-        <w:spacing w:after="0"/>
-      </w:pPr>
-      <w:r>
-        <w:lastRenderedPageBreak/>
         <w:t xml:space="preserve">  );</w:t>
       </w:r>
     </w:p>
@@ -25839,7 +25960,6 @@
   <w:style w:type="character" w:default="1" w:styleId="Fuentedeprrafopredeter">
     <w:name w:val="Default Paragraph Font"/>
     <w:uiPriority w:val="1"/>
-    <w:semiHidden/>
     <w:unhideWhenUsed/>
   </w:style>
   <w:style w:type="table" w:default="1" w:styleId="Tablanormal">
@@ -26068,7 +26188,6 @@
   <w:style w:type="character" w:default="1" w:styleId="Fuentedeprrafopredeter">
     <w:name w:val="Default Paragraph Font"/>
     <w:uiPriority w:val="1"/>
-    <w:semiHidden/>
     <w:unhideWhenUsed/>
   </w:style>
   <w:style w:type="table" w:default="1" w:styleId="Tablanormal">
@@ -26424,7 +26543,7 @@
 </file>
 
 <file path=customXml/itemProps1.xml><?xml version="1.0" encoding="utf-8"?>
-<ds:datastoreItem xmlns:ds="http://schemas.openxmlformats.org/officeDocument/2006/customXml" ds:itemID="{5CDC32CE-F206-43BD-8FFE-859FBA3E6BD4}">
+<ds:datastoreItem xmlns:ds="http://schemas.openxmlformats.org/officeDocument/2006/customXml" ds:itemID="{0BA15614-74D7-4EE5-B934-3CCEA8BB5547}">
   <ds:schemaRefs>
     <ds:schemaRef ds:uri="http://schemas.openxmlformats.org/officeDocument/2006/bibliography"/>
   </ds:schemaRefs>

</xml_diff>

<commit_message>
se cambia forma de registrar la fecha en la carga del libro de temas
</commit_message>
<xml_diff>
--- a/ANALISIS/requerimientos.docx
+++ b/ANALISIS/requerimientos.docx
@@ -12082,11 +12082,262 @@
       </w:r>
     </w:p>
     <w:p>
-      <w:pPr>
-        <w:spacing w:after="0"/>
-      </w:pPr>
+      <w:proofErr w:type="gramStart"/>
       <w:r>
         <w:lastRenderedPageBreak/>
+        <w:t>ahora</w:t>
+      </w:r>
+      <w:proofErr w:type="gramEnd"/>
+      <w:r>
+        <w:t xml:space="preserve"> necesito que cuando entre a la vista del libro de temas me aparezca seleccionados en las listas desplegables la materia y el curso que están activos</w:t>
+      </w:r>
+      <w:r>
+        <w:t xml:space="preserve">, y que al presionar registrar la clase me permita en la vista la posibilidad de editar la fecha que entra desde el sistema </w:t>
+      </w:r>
+    </w:p>
+    <w:p>
+      <w:proofErr w:type="gramStart"/>
+      <w:r>
+        <w:t>ahora</w:t>
+      </w:r>
+      <w:proofErr w:type="gramEnd"/>
+      <w:r>
+        <w:t xml:space="preserve"> necesito que cuando entre a la vista del libro de temas me aparezca seleccionados en las listas desplegables la materia y </w:t>
+      </w:r>
+      <w:r>
+        <w:t>solo los cursos que están asignados a esa materia, y en primer lugar el activo en el momento según el horario</w:t>
+      </w:r>
+      <w:r>
+        <w:t xml:space="preserve">, y que al presionar registrar la clase me permita en la vista la posibilidad de editar la fecha que entra desde el sistema </w:t>
+      </w:r>
+    </w:p>
+    <w:p>
+      <w:proofErr w:type="gramStart"/>
+      <w:r>
+        <w:t>ahora</w:t>
+      </w:r>
+      <w:proofErr w:type="gramEnd"/>
+      <w:r>
+        <w:t xml:space="preserve"> necesito que cuando entre a la vista </w:t>
+      </w:r>
+      <w:r>
+        <w:t>de actividades asignadas</w:t>
+      </w:r>
+      <w:r>
+        <w:t xml:space="preserve"> me aparezca seleccionados en las listas desplegables la materia y solo los cursos </w:t>
+      </w:r>
+      <w:r>
+        <w:t xml:space="preserve">que </w:t>
+      </w:r>
+      <w:r>
+        <w:t xml:space="preserve">están asignados a esa materia, y en primer lugar el activo en el momento según el horario </w:t>
+      </w:r>
+      <w:r>
+        <w:t>actual.</w:t>
+      </w:r>
+    </w:p>
+    <w:p>
+      <w:proofErr w:type="gramStart"/>
+      <w:r>
+        <w:t>ahora</w:t>
+      </w:r>
+      <w:proofErr w:type="gramEnd"/>
+      <w:r>
+        <w:t xml:space="preserve"> necesito que cuando entre a la vista </w:t>
+      </w:r>
+      <w:r>
+        <w:t xml:space="preserve">de </w:t>
+      </w:r>
+      <w:r>
+        <w:t>calificar actividades</w:t>
+      </w:r>
+      <w:r>
+        <w:t xml:space="preserve"> me aparezca seleccionados en las listas desplegables la materia y </w:t>
+      </w:r>
+      <w:r>
+        <w:t xml:space="preserve">solo los cursos </w:t>
+      </w:r>
+      <w:r>
+        <w:t xml:space="preserve">que </w:t>
+      </w:r>
+      <w:r>
+        <w:t xml:space="preserve">están asignados a esa materia, y en primer lugar el activo en el momento según el horario </w:t>
+      </w:r>
+      <w:r>
+        <w:t>actual.</w:t>
+      </w:r>
+    </w:p>
+    <w:p>
+      <w:proofErr w:type="gramStart"/>
+      <w:r>
+        <w:t>ahora</w:t>
+      </w:r>
+      <w:proofErr w:type="gramEnd"/>
+      <w:r>
+        <w:t xml:space="preserve"> necesito que cuando entre a la vista </w:t>
+      </w:r>
+      <w:r>
+        <w:t xml:space="preserve">de </w:t>
+      </w:r>
+      <w:r>
+        <w:t>contenidos</w:t>
+      </w:r>
+      <w:r>
+        <w:t xml:space="preserve"> me aparezca seleccionado en la lista desplegable la materia en primer lugar l</w:t>
+      </w:r>
+      <w:r>
+        <w:t>a</w:t>
+      </w:r>
+      <w:r>
+        <w:t xml:space="preserve"> activa</w:t>
+      </w:r>
+      <w:r>
+        <w:t xml:space="preserve"> en el momento según el horario </w:t>
+      </w:r>
+      <w:r>
+        <w:t>actual</w:t>
+      </w:r>
+      <w:r>
+        <w:t xml:space="preserve"> y luego las demás materias registradas según el horario.</w:t>
+      </w:r>
+    </w:p>
+    <w:p>
+      <w:proofErr w:type="gramStart"/>
+      <w:r>
+        <w:t>ahora</w:t>
+      </w:r>
+      <w:proofErr w:type="gramEnd"/>
+      <w:r>
+        <w:t xml:space="preserve"> necesito que cuando entre a la vista </w:t>
+      </w:r>
+      <w:r>
+        <w:t xml:space="preserve">de </w:t>
+      </w:r>
+      <w:r>
+        <w:t>actividades</w:t>
+      </w:r>
+      <w:r>
+        <w:t xml:space="preserve"> me aparezca seleccionado en la lista desplegable la materia en primer lugar l</w:t>
+      </w:r>
+      <w:r>
+        <w:t>a</w:t>
+      </w:r>
+      <w:r>
+        <w:t xml:space="preserve"> activa</w:t>
+      </w:r>
+      <w:r>
+        <w:t xml:space="preserve"> en el momento según el horario </w:t>
+      </w:r>
+      <w:r>
+        <w:t>actual y luego las demás materias registradas según el horario</w:t>
+      </w:r>
+    </w:p>
+    <w:p>
+      <w:proofErr w:type="gramStart"/>
+      <w:r>
+        <w:t>ahora</w:t>
+      </w:r>
+      <w:proofErr w:type="gramEnd"/>
+      <w:r>
+        <w:t xml:space="preserve"> necesito que cuando entre a la vista </w:t>
+      </w:r>
+      <w:r>
+        <w:t xml:space="preserve">de </w:t>
+      </w:r>
+      <w:r>
+        <w:t xml:space="preserve">asignar </w:t>
+      </w:r>
+      <w:r>
+        <w:t>actividades</w:t>
+      </w:r>
+      <w:r>
+        <w:t xml:space="preserve"> me aparezca seleccionado en la lista desplegable </w:t>
+      </w:r>
+      <w:r>
+        <w:t>el curso,</w:t>
+      </w:r>
+      <w:r>
+        <w:t xml:space="preserve"> en primer lugar </w:t>
+      </w:r>
+      <w:r>
+        <w:t>el</w:t>
+      </w:r>
+      <w:r>
+        <w:t xml:space="preserve"> activ</w:t>
+      </w:r>
+      <w:r>
+        <w:t>o</w:t>
+      </w:r>
+      <w:r>
+        <w:t xml:space="preserve"> en el momento según el horario </w:t>
+      </w:r>
+      <w:r>
+        <w:t xml:space="preserve">actual y luego </w:t>
+      </w:r>
+      <w:r>
+        <w:t>en el desplegable solo los cursos asociados a esa materia, en orden</w:t>
+      </w:r>
+      <w:r>
+        <w:t xml:space="preserve"> según el horario</w:t>
+      </w:r>
+    </w:p>
+    <w:p>
+      <w:proofErr w:type="gramStart"/>
+      <w:r>
+        <w:t>ahora</w:t>
+      </w:r>
+      <w:proofErr w:type="gramEnd"/>
+      <w:r>
+        <w:t xml:space="preserve"> necesito que cuando entre a la vista </w:t>
+      </w:r>
+      <w:r>
+        <w:t xml:space="preserve">de </w:t>
+      </w:r>
+      <w:r>
+        <w:t xml:space="preserve">proyectos, </w:t>
+      </w:r>
+      <w:r>
+        <w:t xml:space="preserve">me aparezca seleccionado en la lista desplegable </w:t>
+      </w:r>
+      <w:r>
+        <w:t>la materia actual según el horario y en orden todas las otras según mi horario</w:t>
+      </w:r>
+      <w:r>
+        <w:t>,</w:t>
+      </w:r>
+      <w:r>
+        <w:t xml:space="preserve"> </w:t>
+      </w:r>
+      <w:r>
+        <w:t xml:space="preserve">al desplegar los cursos que me muestre solo los cursos asociados a esa materia, y si cambio la materia del desplegable se </w:t>
+      </w:r>
+      <w:proofErr w:type="spellStart"/>
+      <w:r>
+        <w:t>actualize</w:t>
+      </w:r>
+      <w:proofErr w:type="spellEnd"/>
+      <w:r>
+        <w:t xml:space="preserve"> la lista de cursos asociados a la nueva materia lo demás sin cambios</w:t>
+      </w:r>
+      <w:bookmarkStart w:id="0" w:name="_GoBack"/>
+      <w:bookmarkEnd w:id="0"/>
+    </w:p>
+    <w:p/>
+    <w:p/>
+    <w:p/>
+    <w:p/>
+    <w:p/>
+    <w:p/>
+    <w:p/>
+    <w:p/>
+    <w:p/>
+    <w:p/>
+    <w:p/>
+    <w:p>
+      <w:pPr>
+        <w:spacing w:after="0"/>
+      </w:pPr>
+      <w:r>
         <w:t xml:space="preserve">Es una arquitectura conocida como </w:t>
       </w:r>
       <w:r>
@@ -12490,6 +12741,7 @@
         <w:spacing w:after="0"/>
       </w:pPr>
       <w:r>
+        <w:lastRenderedPageBreak/>
         <w:t>Usuario</w:t>
       </w:r>
     </w:p>
@@ -12532,7 +12784,6 @@
         <w:spacing w:after="0"/>
       </w:pPr>
       <w:r>
-        <w:lastRenderedPageBreak/>
         <w:t xml:space="preserve">   V</w:t>
       </w:r>
     </w:p>
@@ -12971,7 +13222,6 @@
         <w:spacing w:after="0"/>
       </w:pPr>
       <w:r>
-        <w:lastRenderedPageBreak/>
         <w:t>Pendiente</w:t>
       </w:r>
     </w:p>
@@ -13307,6 +13557,7 @@
         <w:spacing w:after="0"/>
       </w:pPr>
       <w:r>
+        <w:lastRenderedPageBreak/>
         <w:t xml:space="preserve">    </w:t>
       </w:r>
       <w:proofErr w:type="gramStart"/>
@@ -13791,7 +14042,6 @@
         <w:spacing w:after="0"/>
       </w:pPr>
       <w:r>
-        <w:lastRenderedPageBreak/>
         <w:t>Eso garantiza consistencia en el servidor.</w:t>
       </w:r>
     </w:p>
@@ -14483,7 +14733,6 @@
         <w:spacing w:after="0"/>
       </w:pPr>
       <w:r>
-        <w:lastRenderedPageBreak/>
         <w:t>OK</w:t>
       </w:r>
     </w:p>
@@ -14809,6 +15058,7 @@
       </w:pPr>
       <w:proofErr w:type="gramStart"/>
       <w:r>
+        <w:lastRenderedPageBreak/>
         <w:t>modifica</w:t>
       </w:r>
       <w:proofErr w:type="gramEnd"/>
@@ -14853,7 +15103,6 @@
           <w:b/>
           <w:bCs/>
         </w:rPr>
-        <w:lastRenderedPageBreak/>
         <w:t>Última escritura gana (</w:t>
       </w:r>
       <w:proofErr w:type="spellStart"/>
@@ -15349,6 +15598,7 @@
         <w:spacing w:after="0"/>
       </w:pPr>
       <w:r>
+        <w:lastRenderedPageBreak/>
         <w:t xml:space="preserve">       </w:t>
       </w:r>
       <w:r>
@@ -15420,7 +15670,6 @@
         <w:spacing w:after="0"/>
       </w:pPr>
       <w:r>
-        <w:lastRenderedPageBreak/>
         <w:t xml:space="preserve"> │</w:t>
       </w:r>
     </w:p>
@@ -15992,6 +16241,7 @@
         <w:spacing w:after="0"/>
       </w:pPr>
       <w:r>
+        <w:lastRenderedPageBreak/>
         <w:t>+---------------------------------------------+</w:t>
       </w:r>
     </w:p>
@@ -16024,7 +16274,6 @@
         <w:spacing w:after="0"/>
       </w:pPr>
       <w:r>
-        <w:lastRenderedPageBreak/>
         <w:t>|                                             |</w:t>
       </w:r>
     </w:p>
@@ -16963,6 +17212,7 @@
         <w:spacing w:after="0"/>
       </w:pPr>
       <w:r>
+        <w:lastRenderedPageBreak/>
         <w:t>}</w:t>
       </w:r>
     </w:p>
@@ -17347,6 +17597,7 @@
         <w:spacing w:after="0"/>
       </w:pPr>
       <w:r>
+        <w:lastRenderedPageBreak/>
         <w:t xml:space="preserve">Los datos siguen en </w:t>
       </w:r>
       <w:proofErr w:type="spellStart"/>
@@ -17386,7 +17637,6 @@
         <w:spacing w:after="0"/>
       </w:pPr>
       <w:r>
-        <w:lastRenderedPageBreak/>
         <w:t>↓</w:t>
       </w:r>
     </w:p>
@@ -17704,6 +17954,7 @@
         <w:spacing w:after="0"/>
       </w:pPr>
       <w:r>
+        <w:lastRenderedPageBreak/>
         <w:t>¿Existe ese UUID?</w:t>
       </w:r>
     </w:p>
@@ -17730,7 +17981,6 @@
         <w:spacing w:after="0"/>
       </w:pPr>
       <w:r>
-        <w:lastRenderedPageBreak/>
         <w:t>↓</w:t>
       </w:r>
     </w:p>
@@ -18046,6 +18296,7 @@
         <w:spacing w:after="0"/>
       </w:pPr>
       <w:r>
+        <w:lastRenderedPageBreak/>
         <w:t>---------------------------------</w:t>
       </w:r>
     </w:p>
@@ -18072,7 +18323,6 @@
         <w:spacing w:after="0"/>
       </w:pPr>
       <w:r>
-        <w:lastRenderedPageBreak/>
         <w:t>INSERT</w:t>
       </w:r>
     </w:p>
@@ -18833,14 +19083,12 @@
           <w:color w:val="FFC000"/>
         </w:rPr>
       </w:pPr>
-      <w:bookmarkStart w:id="0" w:name="_GoBack"/>
       <w:proofErr w:type="spellStart"/>
       <w:r>
         <w:rPr>
           <w:b/>
           <w:color w:val="FFC000"/>
         </w:rPr>
-        <w:lastRenderedPageBreak/>
         <w:t>podras</w:t>
       </w:r>
       <w:proofErr w:type="spellEnd"/>
@@ -18948,7 +19196,6 @@
         <w:t xml:space="preserve"> color rojo, y el otro con tres estados, datos sincronizados ok, verde, sincronizando amarillo, sin sincronizar rojo.</w:t>
       </w:r>
     </w:p>
-    <w:bookmarkEnd w:id="0"/>
     <w:p>
       <w:pPr>
         <w:rPr>
@@ -19159,6 +19406,7 @@
           <w:b/>
           <w:bCs/>
         </w:rPr>
+        <w:lastRenderedPageBreak/>
         <w:t>HTTPS:</w:t>
       </w:r>
       <w:r>
@@ -19185,7 +19433,6 @@
           <w:b/>
           <w:bCs/>
         </w:rPr>
-        <w:lastRenderedPageBreak/>
         <w:t xml:space="preserve">Un Archivo </w:t>
       </w:r>
       <w:proofErr w:type="spellStart"/>
@@ -19845,6 +20092,7 @@
           <w:b/>
           <w:bCs/>
         </w:rPr>
+        <w:lastRenderedPageBreak/>
         <w:t xml:space="preserve">Paso 3: Crear el </w:t>
       </w:r>
       <w:proofErr w:type="spellStart"/>
@@ -19882,639 +20130,639 @@
     </w:p>
     <w:p>
       <w:r>
+        <w:t xml:space="preserve">El </w:t>
+      </w:r>
+      <w:proofErr w:type="spellStart"/>
+      <w:r>
+        <w:t>Service</w:t>
+      </w:r>
+      <w:proofErr w:type="spellEnd"/>
+      <w:r>
+        <w:t xml:space="preserve"> </w:t>
+      </w:r>
+      <w:proofErr w:type="spellStart"/>
+      <w:r>
+        <w:t>Worker</w:t>
+      </w:r>
+      <w:proofErr w:type="spellEnd"/>
+      <w:r>
+        <w:t xml:space="preserve"> es el motor que gestiona la caché y permite que la </w:t>
+      </w:r>
+      <w:proofErr w:type="spellStart"/>
+      <w:r>
+        <w:t>app</w:t>
+      </w:r>
+      <w:proofErr w:type="spellEnd"/>
+      <w:r>
+        <w:t xml:space="preserve"> cargue instantáneamente. Crea un archivo llamado sw.js en la raíz de tu proyecto con este código básico de almacenamiento en caché:</w:t>
+      </w:r>
+    </w:p>
+    <w:p>
+      <w:pPr>
+        <w:spacing w:after="0"/>
+      </w:pPr>
+      <w:r>
+        <w:t>JavaScript</w:t>
+      </w:r>
+    </w:p>
+    <w:p>
+      <w:pPr>
+        <w:spacing w:after="0"/>
+      </w:pPr>
+      <w:proofErr w:type="spellStart"/>
+      <w:proofErr w:type="gramStart"/>
+      <w:r>
+        <w:t>const</w:t>
+      </w:r>
+      <w:proofErr w:type="spellEnd"/>
+      <w:proofErr w:type="gramEnd"/>
+      <w:r>
+        <w:t xml:space="preserve"> CACHE_NAME = 'v1_cache_miapp';</w:t>
+      </w:r>
+    </w:p>
+    <w:p>
+      <w:pPr>
+        <w:spacing w:after="0"/>
+      </w:pPr>
+      <w:r>
+        <w:t>// Archivos esenciales que quieres que funcionen incluso sin internet</w:t>
+      </w:r>
+    </w:p>
+    <w:p>
+      <w:pPr>
+        <w:spacing w:after="0"/>
+      </w:pPr>
+      <w:proofErr w:type="spellStart"/>
+      <w:proofErr w:type="gramStart"/>
+      <w:r>
+        <w:t>const</w:t>
+      </w:r>
+      <w:proofErr w:type="spellEnd"/>
+      <w:proofErr w:type="gramEnd"/>
+      <w:r>
+        <w:t xml:space="preserve"> </w:t>
+      </w:r>
+      <w:proofErr w:type="spellStart"/>
+      <w:r>
+        <w:t>urlsToCache</w:t>
+      </w:r>
+      <w:proofErr w:type="spellEnd"/>
+      <w:r>
+        <w:t xml:space="preserve"> = [</w:t>
+      </w:r>
+    </w:p>
+    <w:p>
+      <w:pPr>
+        <w:spacing w:after="0"/>
+      </w:pPr>
+      <w:r>
+        <w:t xml:space="preserve">  '/',</w:t>
+      </w:r>
+    </w:p>
+    <w:p>
+      <w:pPr>
+        <w:spacing w:after="0"/>
+      </w:pPr>
+      <w:r>
+        <w:t xml:space="preserve">  '/index.html',</w:t>
+      </w:r>
+    </w:p>
+    <w:p>
+      <w:pPr>
+        <w:spacing w:after="0"/>
+      </w:pPr>
+      <w:r>
+        <w:t xml:space="preserve">  '/styles.css',</w:t>
+      </w:r>
+    </w:p>
+    <w:p>
+      <w:pPr>
+        <w:spacing w:after="0"/>
+      </w:pPr>
+      <w:r>
+        <w:t xml:space="preserve">  '/script.js',</w:t>
+      </w:r>
+    </w:p>
+    <w:p>
+      <w:pPr>
+        <w:spacing w:after="0"/>
+      </w:pPr>
+      <w:r>
+        <w:t xml:space="preserve">  '/icon-192.png'</w:t>
+      </w:r>
+    </w:p>
+    <w:p>
+      <w:pPr>
+        <w:spacing w:after="0"/>
+      </w:pPr>
+      <w:r>
+        <w:t>];</w:t>
+      </w:r>
+    </w:p>
+    <w:p>
+      <w:pPr>
+        <w:spacing w:after="0"/>
+      </w:pPr>
+    </w:p>
+    <w:p>
+      <w:pPr>
+        <w:spacing w:after="0"/>
+      </w:pPr>
+      <w:r>
+        <w:t>// Evento de instalación: Guarda los archivos en la caché del navegador</w:t>
+      </w:r>
+    </w:p>
+    <w:p>
+      <w:pPr>
+        <w:spacing w:after="0"/>
+      </w:pPr>
+      <w:proofErr w:type="spellStart"/>
+      <w:proofErr w:type="gramStart"/>
+      <w:r>
+        <w:t>self.addEventListener</w:t>
+      </w:r>
+      <w:proofErr w:type="spellEnd"/>
+      <w:r>
+        <w:t>(</w:t>
+      </w:r>
+      <w:proofErr w:type="gramEnd"/>
+      <w:r>
+        <w:t>'</w:t>
+      </w:r>
+      <w:proofErr w:type="spellStart"/>
+      <w:r>
+        <w:t>install</w:t>
+      </w:r>
+      <w:proofErr w:type="spellEnd"/>
+      <w:r>
+        <w:t>', e =&gt; {</w:t>
+      </w:r>
+    </w:p>
+    <w:p>
+      <w:pPr>
+        <w:spacing w:after="0"/>
+      </w:pPr>
+      <w:r>
+        <w:t xml:space="preserve">  </w:t>
+      </w:r>
+      <w:proofErr w:type="spellStart"/>
+      <w:proofErr w:type="gramStart"/>
+      <w:r>
+        <w:t>e.waitUntil</w:t>
+      </w:r>
+      <w:proofErr w:type="spellEnd"/>
+      <w:r>
+        <w:t>(</w:t>
+      </w:r>
+      <w:proofErr w:type="gramEnd"/>
+    </w:p>
+    <w:p>
+      <w:pPr>
+        <w:spacing w:after="0"/>
+      </w:pPr>
+      <w:r>
+        <w:t xml:space="preserve">    </w:t>
+      </w:r>
+      <w:proofErr w:type="spellStart"/>
+      <w:proofErr w:type="gramStart"/>
+      <w:r>
+        <w:t>caches.open</w:t>
+      </w:r>
+      <w:proofErr w:type="spellEnd"/>
+      <w:r>
+        <w:t>(</w:t>
+      </w:r>
+      <w:proofErr w:type="gramEnd"/>
+      <w:r>
+        <w:t>CACHE_NAME)</w:t>
+      </w:r>
+    </w:p>
+    <w:p>
+      <w:pPr>
+        <w:spacing w:after="0"/>
+      </w:pPr>
+      <w:r>
+        <w:t xml:space="preserve">      .</w:t>
+      </w:r>
+      <w:proofErr w:type="spellStart"/>
+      <w:proofErr w:type="gramStart"/>
+      <w:r>
+        <w:t>then</w:t>
+      </w:r>
+      <w:proofErr w:type="spellEnd"/>
+      <w:r>
+        <w:t>(</w:t>
+      </w:r>
+      <w:proofErr w:type="gramEnd"/>
+      <w:r>
+        <w:t>cache =&gt; {</w:t>
+      </w:r>
+    </w:p>
+    <w:p>
+      <w:pPr>
+        <w:spacing w:after="0"/>
+      </w:pPr>
+      <w:r>
+        <w:t xml:space="preserve">        </w:t>
+      </w:r>
+      <w:proofErr w:type="spellStart"/>
+      <w:proofErr w:type="gramStart"/>
+      <w:r>
+        <w:t>return</w:t>
+      </w:r>
+      <w:proofErr w:type="spellEnd"/>
+      <w:proofErr w:type="gramEnd"/>
+      <w:r>
+        <w:t xml:space="preserve"> </w:t>
+      </w:r>
+      <w:proofErr w:type="spellStart"/>
+      <w:r>
+        <w:t>cache.addAll</w:t>
+      </w:r>
+      <w:proofErr w:type="spellEnd"/>
+      <w:r>
+        <w:t>(</w:t>
+      </w:r>
+      <w:proofErr w:type="spellStart"/>
+      <w:r>
+        <w:t>urlsToCache</w:t>
+      </w:r>
+      <w:proofErr w:type="spellEnd"/>
+      <w:r>
+        <w:t>);</w:t>
+      </w:r>
+    </w:p>
+    <w:p>
+      <w:pPr>
+        <w:spacing w:after="0"/>
+      </w:pPr>
+      <w:r>
+        <w:t xml:space="preserve">      })</w:t>
+      </w:r>
+    </w:p>
+    <w:p>
+      <w:pPr>
+        <w:spacing w:after="0"/>
+      </w:pPr>
+      <w:r>
+        <w:t xml:space="preserve">      .</w:t>
+      </w:r>
+      <w:proofErr w:type="spellStart"/>
+      <w:proofErr w:type="gramStart"/>
+      <w:r>
+        <w:t>then</w:t>
+      </w:r>
+      <w:proofErr w:type="spellEnd"/>
+      <w:r>
+        <w:t>(</w:t>
+      </w:r>
+      <w:proofErr w:type="gramEnd"/>
+      <w:r>
+        <w:t xml:space="preserve">() =&gt; </w:t>
+      </w:r>
+      <w:proofErr w:type="spellStart"/>
+      <w:r>
+        <w:t>self.skipWaiting</w:t>
+      </w:r>
+      <w:proofErr w:type="spellEnd"/>
+      <w:r>
+        <w:t>())</w:t>
+      </w:r>
+    </w:p>
+    <w:p>
+      <w:pPr>
+        <w:spacing w:after="0"/>
+      </w:pPr>
+      <w:r>
+        <w:t xml:space="preserve">  );</w:t>
+      </w:r>
+    </w:p>
+    <w:p>
+      <w:pPr>
+        <w:spacing w:after="0"/>
+      </w:pPr>
+      <w:r>
+        <w:t>});</w:t>
+      </w:r>
+    </w:p>
+    <w:p>
+      <w:pPr>
+        <w:spacing w:after="0"/>
+      </w:pPr>
+    </w:p>
+    <w:p>
+      <w:pPr>
+        <w:spacing w:after="0"/>
+      </w:pPr>
+      <w:r>
+        <w:t>// Evento de activación: Limpia cachés antiguas</w:t>
+      </w:r>
+    </w:p>
+    <w:p>
+      <w:pPr>
+        <w:spacing w:after="0"/>
+      </w:pPr>
+      <w:proofErr w:type="spellStart"/>
+      <w:proofErr w:type="gramStart"/>
+      <w:r>
+        <w:t>self.addEventListener</w:t>
+      </w:r>
+      <w:proofErr w:type="spellEnd"/>
+      <w:r>
+        <w:t>(</w:t>
+      </w:r>
+      <w:proofErr w:type="gramEnd"/>
+      <w:r>
+        <w:t>'</w:t>
+      </w:r>
+      <w:proofErr w:type="spellStart"/>
+      <w:r>
+        <w:t>activate</w:t>
+      </w:r>
+      <w:proofErr w:type="spellEnd"/>
+      <w:r>
+        <w:t>', e =&gt; {</w:t>
+      </w:r>
+    </w:p>
+    <w:p>
+      <w:pPr>
+        <w:spacing w:after="0"/>
+      </w:pPr>
+      <w:r>
+        <w:t xml:space="preserve">  </w:t>
+      </w:r>
+      <w:proofErr w:type="spellStart"/>
+      <w:proofErr w:type="gramStart"/>
+      <w:r>
+        <w:t>e.waitUntil</w:t>
+      </w:r>
+      <w:proofErr w:type="spellEnd"/>
+      <w:r>
+        <w:t>(</w:t>
+      </w:r>
+      <w:proofErr w:type="gramEnd"/>
+    </w:p>
+    <w:p>
+      <w:pPr>
+        <w:spacing w:after="0"/>
+      </w:pPr>
+      <w:r>
+        <w:t xml:space="preserve">    </w:t>
+      </w:r>
+      <w:proofErr w:type="spellStart"/>
+      <w:proofErr w:type="gramStart"/>
+      <w:r>
+        <w:t>caches.keys</w:t>
+      </w:r>
+      <w:proofErr w:type="spellEnd"/>
+      <w:r>
+        <w:t>(</w:t>
+      </w:r>
+      <w:proofErr w:type="gramEnd"/>
+      <w:r>
+        <w:t>).</w:t>
+      </w:r>
+      <w:proofErr w:type="spellStart"/>
+      <w:r>
+        <w:t>then</w:t>
+      </w:r>
+      <w:proofErr w:type="spellEnd"/>
+      <w:r>
+        <w:t>(</w:t>
+      </w:r>
+      <w:proofErr w:type="spellStart"/>
+      <w:r>
+        <w:t>cacheNames</w:t>
+      </w:r>
+      <w:proofErr w:type="spellEnd"/>
+      <w:r>
+        <w:t xml:space="preserve"> =&gt; {</w:t>
+      </w:r>
+    </w:p>
+    <w:p>
+      <w:pPr>
+        <w:spacing w:after="0"/>
+      </w:pPr>
+      <w:r>
+        <w:t xml:space="preserve">      </w:t>
+      </w:r>
+      <w:proofErr w:type="spellStart"/>
+      <w:proofErr w:type="gramStart"/>
+      <w:r>
+        <w:t>return</w:t>
+      </w:r>
+      <w:proofErr w:type="spellEnd"/>
+      <w:proofErr w:type="gramEnd"/>
+      <w:r>
+        <w:t xml:space="preserve"> </w:t>
+      </w:r>
+      <w:proofErr w:type="spellStart"/>
+      <w:r>
+        <w:t>Promise.all</w:t>
+      </w:r>
+      <w:proofErr w:type="spellEnd"/>
+      <w:r>
+        <w:t>(</w:t>
+      </w:r>
+    </w:p>
+    <w:p>
+      <w:pPr>
+        <w:spacing w:after="0"/>
+      </w:pPr>
+      <w:r>
+        <w:t xml:space="preserve">        </w:t>
+      </w:r>
+      <w:proofErr w:type="spellStart"/>
+      <w:proofErr w:type="gramStart"/>
+      <w:r>
+        <w:t>cacheNames.map</w:t>
+      </w:r>
+      <w:proofErr w:type="spellEnd"/>
+      <w:r>
+        <w:t>(</w:t>
+      </w:r>
+      <w:proofErr w:type="gramEnd"/>
+      <w:r>
+        <w:t>cache =&gt; {</w:t>
+      </w:r>
+    </w:p>
+    <w:p>
+      <w:pPr>
+        <w:spacing w:after="0"/>
+      </w:pPr>
+      <w:r>
+        <w:t xml:space="preserve">          </w:t>
+      </w:r>
+      <w:proofErr w:type="spellStart"/>
+      <w:proofErr w:type="gramStart"/>
+      <w:r>
+        <w:t>if</w:t>
+      </w:r>
+      <w:proofErr w:type="spellEnd"/>
+      <w:proofErr w:type="gramEnd"/>
+      <w:r>
+        <w:t xml:space="preserve"> (cache !== CACHE_NAME) {</w:t>
+      </w:r>
+    </w:p>
+    <w:p>
+      <w:pPr>
+        <w:spacing w:after="0"/>
+      </w:pPr>
+      <w:r>
+        <w:t xml:space="preserve">            </w:t>
+      </w:r>
+      <w:proofErr w:type="spellStart"/>
+      <w:proofErr w:type="gramStart"/>
+      <w:r>
+        <w:t>return</w:t>
+      </w:r>
+      <w:proofErr w:type="spellEnd"/>
+      <w:proofErr w:type="gramEnd"/>
+      <w:r>
+        <w:t xml:space="preserve"> </w:t>
+      </w:r>
+      <w:proofErr w:type="spellStart"/>
+      <w:r>
+        <w:t>caches.delete</w:t>
+      </w:r>
+      <w:proofErr w:type="spellEnd"/>
+      <w:r>
+        <w:t>(cache);</w:t>
+      </w:r>
+    </w:p>
+    <w:p>
+      <w:pPr>
+        <w:spacing w:after="0"/>
+      </w:pPr>
+      <w:r>
+        <w:t xml:space="preserve">          }</w:t>
+      </w:r>
+    </w:p>
+    <w:p>
+      <w:pPr>
+        <w:spacing w:after="0"/>
+      </w:pPr>
+      <w:r>
+        <w:t xml:space="preserve">        })</w:t>
+      </w:r>
+    </w:p>
+    <w:p>
+      <w:pPr>
+        <w:spacing w:after="0"/>
+      </w:pPr>
+      <w:r>
+        <w:t xml:space="preserve">      );</w:t>
+      </w:r>
+    </w:p>
+    <w:p>
+      <w:pPr>
+        <w:spacing w:after="0"/>
+      </w:pPr>
+      <w:r>
+        <w:t xml:space="preserve">    })</w:t>
+      </w:r>
+    </w:p>
+    <w:p>
+      <w:pPr>
+        <w:spacing w:after="0"/>
+      </w:pPr>
+      <w:r>
+        <w:t xml:space="preserve">  );</w:t>
+      </w:r>
+    </w:p>
+    <w:p>
+      <w:pPr>
+        <w:spacing w:after="0"/>
+      </w:pPr>
+      <w:r>
+        <w:t>});</w:t>
+      </w:r>
+    </w:p>
+    <w:p>
+      <w:pPr>
+        <w:spacing w:after="0"/>
+      </w:pPr>
+    </w:p>
+    <w:p>
+      <w:pPr>
+        <w:spacing w:after="0"/>
+      </w:pPr>
+      <w:r>
+        <w:t xml:space="preserve">// Evento </w:t>
+      </w:r>
+      <w:proofErr w:type="spellStart"/>
+      <w:r>
+        <w:t>fetch</w:t>
+      </w:r>
+      <w:proofErr w:type="spellEnd"/>
+      <w:r>
+        <w:t>: Sirve el contenido desde la caché si no hay internet</w:t>
+      </w:r>
+    </w:p>
+    <w:p>
+      <w:pPr>
+        <w:spacing w:after="0"/>
+      </w:pPr>
+      <w:proofErr w:type="spellStart"/>
+      <w:proofErr w:type="gramStart"/>
+      <w:r>
+        <w:t>self.addEventListener</w:t>
+      </w:r>
+      <w:proofErr w:type="spellEnd"/>
+      <w:r>
+        <w:t>(</w:t>
+      </w:r>
+      <w:proofErr w:type="gramEnd"/>
+      <w:r>
+        <w:t>'</w:t>
+      </w:r>
+      <w:proofErr w:type="spellStart"/>
+      <w:r>
+        <w:t>fetch</w:t>
+      </w:r>
+      <w:proofErr w:type="spellEnd"/>
+      <w:r>
+        <w:t>', e =&gt; {</w:t>
+      </w:r>
+    </w:p>
+    <w:p>
+      <w:pPr>
+        <w:spacing w:after="0"/>
+      </w:pPr>
+      <w:r>
+        <w:t xml:space="preserve">  </w:t>
+      </w:r>
+      <w:proofErr w:type="spellStart"/>
+      <w:proofErr w:type="gramStart"/>
+      <w:r>
+        <w:t>e.respondWith</w:t>
+      </w:r>
+      <w:proofErr w:type="spellEnd"/>
+      <w:r>
+        <w:t>(</w:t>
+      </w:r>
+      <w:proofErr w:type="gramEnd"/>
+    </w:p>
+    <w:p>
+      <w:pPr>
+        <w:spacing w:after="0"/>
+      </w:pPr>
+      <w:r>
         <w:lastRenderedPageBreak/>
-        <w:t xml:space="preserve">El </w:t>
-      </w:r>
-      <w:proofErr w:type="spellStart"/>
-      <w:r>
-        <w:t>Service</w:t>
-      </w:r>
-      <w:proofErr w:type="spellEnd"/>
-      <w:r>
-        <w:t xml:space="preserve"> </w:t>
-      </w:r>
-      <w:proofErr w:type="spellStart"/>
-      <w:r>
-        <w:t>Worker</w:t>
-      </w:r>
-      <w:proofErr w:type="spellEnd"/>
-      <w:r>
-        <w:t xml:space="preserve"> es el motor que gestiona la caché y permite que la </w:t>
-      </w:r>
-      <w:proofErr w:type="spellStart"/>
-      <w:r>
-        <w:t>app</w:t>
-      </w:r>
-      <w:proofErr w:type="spellEnd"/>
-      <w:r>
-        <w:t xml:space="preserve"> cargue instantáneamente. Crea un archivo llamado sw.js en la raíz de tu proyecto con este código básico de almacenamiento en caché:</w:t>
-      </w:r>
-    </w:p>
-    <w:p>
-      <w:pPr>
-        <w:spacing w:after="0"/>
-      </w:pPr>
-      <w:r>
-        <w:t>JavaScript</w:t>
-      </w:r>
-    </w:p>
-    <w:p>
-      <w:pPr>
-        <w:spacing w:after="0"/>
-      </w:pPr>
+        <w:t xml:space="preserve">    </w:t>
+      </w:r>
       <w:proofErr w:type="spellStart"/>
       <w:proofErr w:type="gramStart"/>
       <w:r>
-        <w:t>const</w:t>
-      </w:r>
-      <w:proofErr w:type="spellEnd"/>
+        <w:t>caches.match</w:t>
+      </w:r>
+      <w:proofErr w:type="spellEnd"/>
+      <w:r>
+        <w:t>(</w:t>
+      </w:r>
+      <w:proofErr w:type="spellStart"/>
       <w:proofErr w:type="gramEnd"/>
       <w:r>
-        <w:t xml:space="preserve"> CACHE_NAME = 'v1_cache_miapp';</w:t>
-      </w:r>
-    </w:p>
-    <w:p>
-      <w:pPr>
-        <w:spacing w:after="0"/>
-      </w:pPr>
-      <w:r>
-        <w:t>// Archivos esenciales que quieres que funcionen incluso sin internet</w:t>
-      </w:r>
-    </w:p>
-    <w:p>
-      <w:pPr>
-        <w:spacing w:after="0"/>
-      </w:pPr>
-      <w:proofErr w:type="spellStart"/>
-      <w:proofErr w:type="gramStart"/>
-      <w:r>
-        <w:t>const</w:t>
-      </w:r>
-      <w:proofErr w:type="spellEnd"/>
-      <w:proofErr w:type="gramEnd"/>
-      <w:r>
-        <w:t xml:space="preserve"> </w:t>
-      </w:r>
-      <w:proofErr w:type="spellStart"/>
-      <w:r>
-        <w:t>urlsToCache</w:t>
-      </w:r>
-      <w:proofErr w:type="spellEnd"/>
-      <w:r>
-        <w:t xml:space="preserve"> = [</w:t>
-      </w:r>
-    </w:p>
-    <w:p>
-      <w:pPr>
-        <w:spacing w:after="0"/>
-      </w:pPr>
-      <w:r>
-        <w:t xml:space="preserve">  '/',</w:t>
-      </w:r>
-    </w:p>
-    <w:p>
-      <w:pPr>
-        <w:spacing w:after="0"/>
-      </w:pPr>
-      <w:r>
-        <w:t xml:space="preserve">  '/index.html',</w:t>
-      </w:r>
-    </w:p>
-    <w:p>
-      <w:pPr>
-        <w:spacing w:after="0"/>
-      </w:pPr>
-      <w:r>
-        <w:t xml:space="preserve">  '/styles.css',</w:t>
-      </w:r>
-    </w:p>
-    <w:p>
-      <w:pPr>
-        <w:spacing w:after="0"/>
-      </w:pPr>
-      <w:r>
-        <w:t xml:space="preserve">  '/script.js',</w:t>
-      </w:r>
-    </w:p>
-    <w:p>
-      <w:pPr>
-        <w:spacing w:after="0"/>
-      </w:pPr>
-      <w:r>
-        <w:t xml:space="preserve">  '/icon-192.png'</w:t>
-      </w:r>
-    </w:p>
-    <w:p>
-      <w:pPr>
-        <w:spacing w:after="0"/>
-      </w:pPr>
-      <w:r>
-        <w:t>];</w:t>
-      </w:r>
-    </w:p>
-    <w:p>
-      <w:pPr>
-        <w:spacing w:after="0"/>
-      </w:pPr>
-    </w:p>
-    <w:p>
-      <w:pPr>
-        <w:spacing w:after="0"/>
-      </w:pPr>
-      <w:r>
-        <w:t>// Evento de instalación: Guarda los archivos en la caché del navegador</w:t>
-      </w:r>
-    </w:p>
-    <w:p>
-      <w:pPr>
-        <w:spacing w:after="0"/>
-      </w:pPr>
-      <w:proofErr w:type="spellStart"/>
-      <w:proofErr w:type="gramStart"/>
-      <w:r>
-        <w:t>self.addEventListener</w:t>
-      </w:r>
-      <w:proofErr w:type="spellEnd"/>
-      <w:r>
-        <w:t>(</w:t>
-      </w:r>
-      <w:proofErr w:type="gramEnd"/>
-      <w:r>
-        <w:t>'</w:t>
-      </w:r>
-      <w:proofErr w:type="spellStart"/>
-      <w:r>
-        <w:t>install</w:t>
-      </w:r>
-      <w:proofErr w:type="spellEnd"/>
-      <w:r>
-        <w:t>', e =&gt; {</w:t>
-      </w:r>
-    </w:p>
-    <w:p>
-      <w:pPr>
-        <w:spacing w:after="0"/>
-      </w:pPr>
-      <w:r>
-        <w:t xml:space="preserve">  </w:t>
-      </w:r>
-      <w:proofErr w:type="spellStart"/>
-      <w:proofErr w:type="gramStart"/>
-      <w:r>
-        <w:t>e.waitUntil</w:t>
-      </w:r>
-      <w:proofErr w:type="spellEnd"/>
-      <w:r>
-        <w:t>(</w:t>
-      </w:r>
-      <w:proofErr w:type="gramEnd"/>
-    </w:p>
-    <w:p>
-      <w:pPr>
-        <w:spacing w:after="0"/>
-      </w:pPr>
-      <w:r>
-        <w:t xml:space="preserve">    </w:t>
-      </w:r>
-      <w:proofErr w:type="spellStart"/>
-      <w:proofErr w:type="gramStart"/>
-      <w:r>
-        <w:t>caches.open</w:t>
-      </w:r>
-      <w:proofErr w:type="spellEnd"/>
-      <w:r>
-        <w:t>(</w:t>
-      </w:r>
-      <w:proofErr w:type="gramEnd"/>
-      <w:r>
-        <w:t>CACHE_NAME)</w:t>
-      </w:r>
-    </w:p>
-    <w:p>
-      <w:pPr>
-        <w:spacing w:after="0"/>
-      </w:pPr>
-      <w:r>
-        <w:t xml:space="preserve">      .</w:t>
-      </w:r>
-      <w:proofErr w:type="spellStart"/>
-      <w:proofErr w:type="gramStart"/>
-      <w:r>
-        <w:t>then</w:t>
-      </w:r>
-      <w:proofErr w:type="spellEnd"/>
-      <w:r>
-        <w:t>(</w:t>
-      </w:r>
-      <w:proofErr w:type="gramEnd"/>
-      <w:r>
-        <w:t>cache =&gt; {</w:t>
-      </w:r>
-    </w:p>
-    <w:p>
-      <w:pPr>
-        <w:spacing w:after="0"/>
-      </w:pPr>
-      <w:r>
-        <w:t xml:space="preserve">        </w:t>
-      </w:r>
-      <w:proofErr w:type="spellStart"/>
-      <w:proofErr w:type="gramStart"/>
-      <w:r>
-        <w:t>return</w:t>
-      </w:r>
-      <w:proofErr w:type="spellEnd"/>
-      <w:proofErr w:type="gramEnd"/>
-      <w:r>
-        <w:t xml:space="preserve"> </w:t>
-      </w:r>
-      <w:proofErr w:type="spellStart"/>
-      <w:r>
-        <w:t>cache.addAll</w:t>
-      </w:r>
-      <w:proofErr w:type="spellEnd"/>
-      <w:r>
-        <w:t>(</w:t>
-      </w:r>
-      <w:proofErr w:type="spellStart"/>
-      <w:r>
-        <w:t>urlsToCache</w:t>
-      </w:r>
-      <w:proofErr w:type="spellEnd"/>
-      <w:r>
-        <w:t>);</w:t>
-      </w:r>
-    </w:p>
-    <w:p>
-      <w:pPr>
-        <w:spacing w:after="0"/>
-      </w:pPr>
-      <w:r>
-        <w:t xml:space="preserve">      })</w:t>
-      </w:r>
-    </w:p>
-    <w:p>
-      <w:pPr>
-        <w:spacing w:after="0"/>
-      </w:pPr>
-      <w:r>
-        <w:t xml:space="preserve">      .</w:t>
-      </w:r>
-      <w:proofErr w:type="spellStart"/>
-      <w:proofErr w:type="gramStart"/>
-      <w:r>
-        <w:t>then</w:t>
-      </w:r>
-      <w:proofErr w:type="spellEnd"/>
-      <w:r>
-        <w:t>(</w:t>
-      </w:r>
-      <w:proofErr w:type="gramEnd"/>
-      <w:r>
-        <w:t xml:space="preserve">() =&gt; </w:t>
-      </w:r>
-      <w:proofErr w:type="spellStart"/>
-      <w:r>
-        <w:t>self.skipWaiting</w:t>
-      </w:r>
-      <w:proofErr w:type="spellEnd"/>
-      <w:r>
-        <w:t>())</w:t>
-      </w:r>
-    </w:p>
-    <w:p>
-      <w:pPr>
-        <w:spacing w:after="0"/>
-      </w:pPr>
-      <w:r>
-        <w:t xml:space="preserve">  );</w:t>
-      </w:r>
-    </w:p>
-    <w:p>
-      <w:pPr>
-        <w:spacing w:after="0"/>
-      </w:pPr>
-      <w:r>
-        <w:t>});</w:t>
-      </w:r>
-    </w:p>
-    <w:p>
-      <w:pPr>
-        <w:spacing w:after="0"/>
-      </w:pPr>
-    </w:p>
-    <w:p>
-      <w:pPr>
-        <w:spacing w:after="0"/>
-      </w:pPr>
-      <w:r>
-        <w:t>// Evento de activación: Limpia cachés antiguas</w:t>
-      </w:r>
-    </w:p>
-    <w:p>
-      <w:pPr>
-        <w:spacing w:after="0"/>
-      </w:pPr>
-      <w:proofErr w:type="spellStart"/>
-      <w:proofErr w:type="gramStart"/>
-      <w:r>
-        <w:t>self.addEventListener</w:t>
-      </w:r>
-      <w:proofErr w:type="spellEnd"/>
-      <w:r>
-        <w:t>(</w:t>
-      </w:r>
-      <w:proofErr w:type="gramEnd"/>
-      <w:r>
-        <w:t>'</w:t>
-      </w:r>
-      <w:proofErr w:type="spellStart"/>
-      <w:r>
-        <w:t>activate</w:t>
-      </w:r>
-      <w:proofErr w:type="spellEnd"/>
-      <w:r>
-        <w:t>', e =&gt; {</w:t>
-      </w:r>
-    </w:p>
-    <w:p>
-      <w:pPr>
-        <w:spacing w:after="0"/>
-      </w:pPr>
-      <w:r>
-        <w:t xml:space="preserve">  </w:t>
-      </w:r>
-      <w:proofErr w:type="spellStart"/>
-      <w:proofErr w:type="gramStart"/>
-      <w:r>
-        <w:t>e.waitUntil</w:t>
-      </w:r>
-      <w:proofErr w:type="spellEnd"/>
-      <w:r>
-        <w:t>(</w:t>
-      </w:r>
-      <w:proofErr w:type="gramEnd"/>
-    </w:p>
-    <w:p>
-      <w:pPr>
-        <w:spacing w:after="0"/>
-      </w:pPr>
-      <w:r>
-        <w:t xml:space="preserve">    </w:t>
-      </w:r>
-      <w:proofErr w:type="spellStart"/>
-      <w:proofErr w:type="gramStart"/>
-      <w:r>
-        <w:t>caches.keys</w:t>
-      </w:r>
-      <w:proofErr w:type="spellEnd"/>
-      <w:r>
-        <w:t>(</w:t>
-      </w:r>
-      <w:proofErr w:type="gramEnd"/>
-      <w:r>
-        <w:t>).</w:t>
-      </w:r>
-      <w:proofErr w:type="spellStart"/>
-      <w:r>
-        <w:t>then</w:t>
-      </w:r>
-      <w:proofErr w:type="spellEnd"/>
-      <w:r>
-        <w:t>(</w:t>
-      </w:r>
-      <w:proofErr w:type="spellStart"/>
-      <w:r>
-        <w:t>cacheNames</w:t>
-      </w:r>
-      <w:proofErr w:type="spellEnd"/>
-      <w:r>
-        <w:t xml:space="preserve"> =&gt; {</w:t>
-      </w:r>
-    </w:p>
-    <w:p>
-      <w:pPr>
-        <w:spacing w:after="0"/>
-      </w:pPr>
-      <w:r>
-        <w:t xml:space="preserve">      </w:t>
-      </w:r>
-      <w:proofErr w:type="spellStart"/>
-      <w:proofErr w:type="gramStart"/>
-      <w:r>
-        <w:t>return</w:t>
-      </w:r>
-      <w:proofErr w:type="spellEnd"/>
-      <w:proofErr w:type="gramEnd"/>
-      <w:r>
-        <w:t xml:space="preserve"> </w:t>
-      </w:r>
-      <w:proofErr w:type="spellStart"/>
-      <w:r>
-        <w:t>Promise.all</w:t>
-      </w:r>
-      <w:proofErr w:type="spellEnd"/>
-      <w:r>
-        <w:t>(</w:t>
-      </w:r>
-    </w:p>
-    <w:p>
-      <w:pPr>
-        <w:spacing w:after="0"/>
-      </w:pPr>
-      <w:r>
-        <w:t xml:space="preserve">        </w:t>
-      </w:r>
-      <w:proofErr w:type="spellStart"/>
-      <w:proofErr w:type="gramStart"/>
-      <w:r>
-        <w:t>cacheNames.map</w:t>
-      </w:r>
-      <w:proofErr w:type="spellEnd"/>
-      <w:r>
-        <w:t>(</w:t>
-      </w:r>
-      <w:proofErr w:type="gramEnd"/>
-      <w:r>
-        <w:t>cache =&gt; {</w:t>
-      </w:r>
-    </w:p>
-    <w:p>
-      <w:pPr>
-        <w:spacing w:after="0"/>
-      </w:pPr>
-      <w:r>
-        <w:t xml:space="preserve">          </w:t>
-      </w:r>
-      <w:proofErr w:type="spellStart"/>
-      <w:proofErr w:type="gramStart"/>
-      <w:r>
-        <w:t>if</w:t>
-      </w:r>
-      <w:proofErr w:type="spellEnd"/>
-      <w:proofErr w:type="gramEnd"/>
-      <w:r>
-        <w:t xml:space="preserve"> (cache !== CACHE_NAME) {</w:t>
-      </w:r>
-    </w:p>
-    <w:p>
-      <w:pPr>
-        <w:spacing w:after="0"/>
-      </w:pPr>
-      <w:r>
-        <w:t xml:space="preserve">            </w:t>
-      </w:r>
-      <w:proofErr w:type="spellStart"/>
-      <w:proofErr w:type="gramStart"/>
-      <w:r>
-        <w:t>return</w:t>
-      </w:r>
-      <w:proofErr w:type="spellEnd"/>
-      <w:proofErr w:type="gramEnd"/>
-      <w:r>
-        <w:t xml:space="preserve"> </w:t>
-      </w:r>
-      <w:proofErr w:type="spellStart"/>
-      <w:r>
-        <w:t>caches.delete</w:t>
-      </w:r>
-      <w:proofErr w:type="spellEnd"/>
-      <w:r>
-        <w:t>(cache);</w:t>
-      </w:r>
-    </w:p>
-    <w:p>
-      <w:pPr>
-        <w:spacing w:after="0"/>
-      </w:pPr>
-      <w:r>
-        <w:t xml:space="preserve">          }</w:t>
-      </w:r>
-    </w:p>
-    <w:p>
-      <w:pPr>
-        <w:spacing w:after="0"/>
-      </w:pPr>
-      <w:r>
-        <w:t xml:space="preserve">        })</w:t>
-      </w:r>
-    </w:p>
-    <w:p>
-      <w:pPr>
-        <w:spacing w:after="0"/>
-      </w:pPr>
-      <w:r>
-        <w:t xml:space="preserve">      );</w:t>
-      </w:r>
-    </w:p>
-    <w:p>
-      <w:pPr>
-        <w:spacing w:after="0"/>
-      </w:pPr>
-      <w:r>
-        <w:t xml:space="preserve">    })</w:t>
-      </w:r>
-    </w:p>
-    <w:p>
-      <w:pPr>
-        <w:spacing w:after="0"/>
-      </w:pPr>
-      <w:r>
-        <w:t xml:space="preserve">  );</w:t>
-      </w:r>
-    </w:p>
-    <w:p>
-      <w:pPr>
-        <w:spacing w:after="0"/>
-      </w:pPr>
-      <w:r>
-        <w:t>});</w:t>
-      </w:r>
-    </w:p>
-    <w:p>
-      <w:pPr>
-        <w:spacing w:after="0"/>
-      </w:pPr>
-    </w:p>
-    <w:p>
-      <w:pPr>
-        <w:spacing w:after="0"/>
-      </w:pPr>
-      <w:r>
-        <w:t xml:space="preserve">// Evento </w:t>
-      </w:r>
-      <w:proofErr w:type="spellStart"/>
-      <w:r>
-        <w:t>fetch</w:t>
-      </w:r>
-      <w:proofErr w:type="spellEnd"/>
-      <w:r>
-        <w:t>: Sirve el contenido desde la caché si no hay internet</w:t>
-      </w:r>
-    </w:p>
-    <w:p>
-      <w:pPr>
-        <w:spacing w:after="0"/>
-      </w:pPr>
-      <w:proofErr w:type="spellStart"/>
-      <w:proofErr w:type="gramStart"/>
-      <w:r>
-        <w:t>self.addEventListener</w:t>
-      </w:r>
-      <w:proofErr w:type="spellEnd"/>
-      <w:r>
-        <w:t>(</w:t>
-      </w:r>
-      <w:proofErr w:type="gramEnd"/>
-      <w:r>
-        <w:t>'</w:t>
-      </w:r>
-      <w:proofErr w:type="spellStart"/>
-      <w:r>
-        <w:t>fetch</w:t>
-      </w:r>
-      <w:proofErr w:type="spellEnd"/>
-      <w:r>
-        <w:t>', e =&gt; {</w:t>
-      </w:r>
-    </w:p>
-    <w:p>
-      <w:pPr>
-        <w:spacing w:after="0"/>
-      </w:pPr>
-      <w:r>
-        <w:t xml:space="preserve">  </w:t>
-      </w:r>
-      <w:proofErr w:type="spellStart"/>
-      <w:proofErr w:type="gramStart"/>
-      <w:r>
-        <w:t>e.respondWith</w:t>
-      </w:r>
-      <w:proofErr w:type="spellEnd"/>
-      <w:r>
-        <w:t>(</w:t>
-      </w:r>
-      <w:proofErr w:type="gramEnd"/>
-    </w:p>
-    <w:p>
-      <w:pPr>
-        <w:spacing w:after="0"/>
-      </w:pPr>
-      <w:r>
-        <w:t xml:space="preserve">    </w:t>
-      </w:r>
-      <w:proofErr w:type="spellStart"/>
-      <w:proofErr w:type="gramStart"/>
-      <w:r>
-        <w:t>caches.match</w:t>
-      </w:r>
-      <w:proofErr w:type="spellEnd"/>
-      <w:r>
-        <w:t>(</w:t>
-      </w:r>
-      <w:proofErr w:type="spellStart"/>
-      <w:proofErr w:type="gramEnd"/>
-      <w:r>
         <w:t>e.request</w:t>
       </w:r>
       <w:proofErr w:type="spellEnd"/>
@@ -20527,7 +20775,6 @@
         <w:spacing w:after="0"/>
       </w:pPr>
       <w:r>
-        <w:lastRenderedPageBreak/>
         <w:t xml:space="preserve">      .</w:t>
       </w:r>
       <w:proofErr w:type="spellStart"/>
@@ -26543,7 +26790,7 @@
 </file>
 
 <file path=customXml/itemProps1.xml><?xml version="1.0" encoding="utf-8"?>
-<ds:datastoreItem xmlns:ds="http://schemas.openxmlformats.org/officeDocument/2006/customXml" ds:itemID="{0BA15614-74D7-4EE5-B934-3CCEA8BB5547}">
+<ds:datastoreItem xmlns:ds="http://schemas.openxmlformats.org/officeDocument/2006/customXml" ds:itemID="{942940CC-C274-46F5-8256-EA6319E5057B}">
   <ds:schemaRefs>
     <ds:schemaRef ds:uri="http://schemas.openxmlformats.org/officeDocument/2006/bibliography"/>
   </ds:schemaRefs>

</xml_diff>

<commit_message>
se actualiza seleccion de materia segun el horario
</commit_message>
<xml_diff>
--- a/ANALISIS/requerimientos.docx
+++ b/ANALISIS/requerimientos.docx
@@ -12082,245 +12082,269 @@
       </w:r>
     </w:p>
     <w:p>
+      <w:pPr>
+        <w:rPr>
+          <w:b/>
+        </w:rPr>
+      </w:pPr>
       <w:proofErr w:type="gramStart"/>
       <w:r>
+        <w:rPr>
+          <w:b/>
+        </w:rPr>
         <w:lastRenderedPageBreak/>
         <w:t>ahora</w:t>
       </w:r>
       <w:proofErr w:type="gramEnd"/>
       <w:r>
+        <w:rPr>
+          <w:b/>
+        </w:rPr>
         <w:t xml:space="preserve"> necesito que cuando entre a la vista del libro de temas me aparezca seleccionados en las listas desplegables la materia y el curso que están activos</w:t>
       </w:r>
       <w:r>
+        <w:rPr>
+          <w:b/>
+        </w:rPr>
         <w:t xml:space="preserve">, y que al presionar registrar la clase me permita en la vista la posibilidad de editar la fecha que entra desde el sistema </w:t>
       </w:r>
     </w:p>
     <w:p>
+      <w:pPr>
+        <w:rPr>
+          <w:b/>
+        </w:rPr>
+      </w:pPr>
       <w:proofErr w:type="gramStart"/>
       <w:r>
+        <w:rPr>
+          <w:b/>
+        </w:rPr>
         <w:t>ahora</w:t>
       </w:r>
       <w:proofErr w:type="gramEnd"/>
       <w:r>
-        <w:t xml:space="preserve"> necesito que cuando entre a la vista del libro de temas me aparezca seleccionados en las listas desplegables la materia y </w:t>
-      </w:r>
-      <w:r>
-        <w:t>solo los cursos que están asignados a esa materia, y en primer lugar el activo en el momento según el horario</w:t>
-      </w:r>
-      <w:r>
-        <w:t xml:space="preserve">, y que al presionar registrar la clase me permita en la vista la posibilidad de editar la fecha que entra desde el sistema </w:t>
-      </w:r>
-    </w:p>
-    <w:p>
+        <w:rPr>
+          <w:b/>
+        </w:rPr>
+        <w:t xml:space="preserve"> necesito que cuando entre a la vista del libro de temas me aparezca seleccionados en las listas desplegables la materia y solo los cursos que están asignados a esa materia, y en primer lugar el activo en el momento según el horario, y que al presionar registrar la clase me permita en la vista la posibilidad de editar la fecha que entra desde el sistema </w:t>
+      </w:r>
+    </w:p>
+    <w:p>
+      <w:pPr>
+        <w:rPr>
+          <w:color w:val="00B0F0"/>
+        </w:rPr>
+      </w:pPr>
       <w:proofErr w:type="gramStart"/>
       <w:r>
+        <w:rPr>
+          <w:b/>
+          <w:color w:val="00B0F0"/>
+        </w:rPr>
         <w:t>ahora</w:t>
       </w:r>
       <w:proofErr w:type="gramEnd"/>
       <w:r>
-        <w:t xml:space="preserve"> necesito que cuando entre a la vista </w:t>
-      </w:r>
-      <w:r>
-        <w:t>de actividades asignadas</w:t>
-      </w:r>
-      <w:r>
-        <w:t xml:space="preserve"> me aparezca seleccionados en las listas desplegables la materia y solo los cursos </w:t>
-      </w:r>
-      <w:r>
-        <w:t xml:space="preserve">que </w:t>
-      </w:r>
-      <w:r>
-        <w:t xml:space="preserve">están asignados a esa materia, y en primer lugar el activo en el momento según el horario </w:t>
-      </w:r>
-      <w:r>
-        <w:t>actual.</w:t>
-      </w:r>
-    </w:p>
-    <w:p>
+        <w:rPr>
+          <w:b/>
+          <w:color w:val="00B0F0"/>
+        </w:rPr>
+        <w:t xml:space="preserve"> necesito que cuando entre a la vista de actividades asignadas me aparezca seleccionados en las listas desplegables la materia y solo los cursos que están asignados a esa materia, y en primer lugar el activo en el momento según el horario actual</w:t>
+      </w:r>
+      <w:r>
+        <w:rPr>
+          <w:color w:val="00B0F0"/>
+        </w:rPr>
+        <w:t>.</w:t>
+      </w:r>
+    </w:p>
+    <w:p>
+      <w:pPr>
+        <w:rPr>
+          <w:b/>
+          <w:color w:val="00B0F0"/>
+        </w:rPr>
+      </w:pPr>
       <w:proofErr w:type="gramStart"/>
       <w:r>
+        <w:rPr>
+          <w:b/>
+          <w:color w:val="00B0F0"/>
+        </w:rPr>
         <w:t>ahora</w:t>
       </w:r>
       <w:proofErr w:type="gramEnd"/>
       <w:r>
-        <w:t xml:space="preserve"> necesito que cuando entre a la vista </w:t>
-      </w:r>
-      <w:r>
-        <w:t xml:space="preserve">de </w:t>
-      </w:r>
-      <w:r>
-        <w:t>calificar actividades</w:t>
-      </w:r>
-      <w:r>
-        <w:t xml:space="preserve"> me aparezca seleccionados en las listas desplegables la materia y </w:t>
-      </w:r>
-      <w:r>
-        <w:t xml:space="preserve">solo los cursos </w:t>
-      </w:r>
-      <w:r>
-        <w:t xml:space="preserve">que </w:t>
-      </w:r>
-      <w:r>
-        <w:t xml:space="preserve">están asignados a esa materia, y en primer lugar el activo en el momento según el horario </w:t>
-      </w:r>
-      <w:r>
-        <w:t>actual.</w:t>
-      </w:r>
-    </w:p>
-    <w:p>
+        <w:rPr>
+          <w:b/>
+          <w:color w:val="00B0F0"/>
+        </w:rPr>
+        <w:t xml:space="preserve"> necesito que cuando entre a la vista de calificar actividades me aparezca seleccionados en las listas desplegables la materia y solo los cursos que están asignados a esa materia, y en primer lugar el activo en el momento según el horario actual.</w:t>
+      </w:r>
+    </w:p>
+    <w:p>
+      <w:pPr>
+        <w:rPr>
+          <w:b/>
+          <w:color w:val="00B0F0"/>
+        </w:rPr>
+      </w:pPr>
       <w:proofErr w:type="gramStart"/>
       <w:r>
+        <w:rPr>
+          <w:b/>
+          <w:color w:val="00B0F0"/>
+        </w:rPr>
         <w:t>ahora</w:t>
       </w:r>
       <w:proofErr w:type="gramEnd"/>
       <w:r>
-        <w:t xml:space="preserve"> necesito que cuando entre a la vista </w:t>
-      </w:r>
-      <w:r>
-        <w:t xml:space="preserve">de </w:t>
-      </w:r>
-      <w:r>
-        <w:t>contenidos</w:t>
-      </w:r>
-      <w:r>
-        <w:t xml:space="preserve"> me aparezca seleccionado en la lista desplegable la materia en primer lugar l</w:t>
-      </w:r>
-      <w:r>
-        <w:t>a</w:t>
-      </w:r>
-      <w:r>
+        <w:rPr>
+          <w:b/>
+          <w:color w:val="00B0F0"/>
+        </w:rPr>
+        <w:t xml:space="preserve"> necesito que cuando entre a la vista de contenidos me aparezca seleccionado en la lista desplegable la materia en primer lugar la</w:t>
+      </w:r>
+      <w:r>
+        <w:rPr>
+          <w:b/>
+          <w:color w:val="00B0F0"/>
+        </w:rPr>
         <w:t xml:space="preserve"> activa</w:t>
       </w:r>
       <w:r>
-        <w:t xml:space="preserve"> en el momento según el horario </w:t>
-      </w:r>
-      <w:r>
-        <w:t>actual</w:t>
-      </w:r>
-      <w:r>
-        <w:t xml:space="preserve"> y luego las demás materias registradas según el horario.</w:t>
-      </w:r>
-    </w:p>
-    <w:p>
+        <w:rPr>
+          <w:b/>
+          <w:color w:val="00B0F0"/>
+        </w:rPr>
+        <w:t xml:space="preserve"> en el momento según el horario actual y luego las demás materias registradas según el horario.</w:t>
+      </w:r>
+    </w:p>
+    <w:p>
+      <w:pPr>
+        <w:rPr>
+          <w:b/>
+          <w:color w:val="00B0F0"/>
+        </w:rPr>
+      </w:pPr>
       <w:proofErr w:type="gramStart"/>
       <w:r>
+        <w:rPr>
+          <w:b/>
+          <w:color w:val="00B0F0"/>
+        </w:rPr>
         <w:t>ahora</w:t>
       </w:r>
       <w:proofErr w:type="gramEnd"/>
       <w:r>
-        <w:t xml:space="preserve"> necesito que cuando entre a la vista </w:t>
-      </w:r>
-      <w:r>
-        <w:t xml:space="preserve">de </w:t>
-      </w:r>
-      <w:r>
-        <w:t>actividades</w:t>
-      </w:r>
-      <w:r>
-        <w:t xml:space="preserve"> me aparezca seleccionado en la lista desplegable la materia en primer lugar l</w:t>
-      </w:r>
-      <w:r>
-        <w:t>a</w:t>
-      </w:r>
-      <w:r>
-        <w:t xml:space="preserve"> activa</w:t>
-      </w:r>
-      <w:r>
-        <w:t xml:space="preserve"> en el momento según el horario </w:t>
-      </w:r>
-      <w:r>
-        <w:t>actual y luego las demás materias registradas según el horario</w:t>
-      </w:r>
-    </w:p>
-    <w:p>
+        <w:rPr>
+          <w:b/>
+          <w:color w:val="00B0F0"/>
+        </w:rPr>
+        <w:t xml:space="preserve"> necesito que cuando entre a la vista de actividades me aparezca seleccionado en la lista desplegable la materia en primer lugar la activa en el momento según el horario actual y luego las demás materias registradas según el horario</w:t>
+      </w:r>
+    </w:p>
+    <w:p>
+      <w:pPr>
+        <w:rPr>
+          <w:b/>
+          <w:color w:val="00B0F0"/>
+        </w:rPr>
+      </w:pPr>
       <w:proofErr w:type="gramStart"/>
       <w:r>
+        <w:rPr>
+          <w:b/>
+          <w:color w:val="00B0F0"/>
+        </w:rPr>
         <w:t>ahora</w:t>
       </w:r>
       <w:proofErr w:type="gramEnd"/>
       <w:r>
-        <w:t xml:space="preserve"> necesito que cuando entre a la vista </w:t>
-      </w:r>
-      <w:r>
-        <w:t xml:space="preserve">de </w:t>
-      </w:r>
-      <w:r>
-        <w:t xml:space="preserve">asignar </w:t>
-      </w:r>
-      <w:r>
-        <w:t>actividades</w:t>
-      </w:r>
-      <w:r>
-        <w:t xml:space="preserve"> me aparezca seleccionado en la lista desplegable </w:t>
-      </w:r>
-      <w:r>
-        <w:t>el curso,</w:t>
-      </w:r>
-      <w:r>
-        <w:t xml:space="preserve"> en primer lugar </w:t>
-      </w:r>
-      <w:r>
-        <w:t>el</w:t>
-      </w:r>
-      <w:r>
-        <w:t xml:space="preserve"> activ</w:t>
-      </w:r>
-      <w:r>
-        <w:t>o</w:t>
-      </w:r>
-      <w:r>
-        <w:t xml:space="preserve"> en el momento según el horario </w:t>
-      </w:r>
-      <w:r>
-        <w:t xml:space="preserve">actual y luego </w:t>
-      </w:r>
-      <w:r>
-        <w:t>en el desplegable solo los cursos asociados a esa materia, en orden</w:t>
-      </w:r>
-      <w:r>
-        <w:t xml:space="preserve"> según el horario</w:t>
-      </w:r>
-    </w:p>
-    <w:p>
+        <w:rPr>
+          <w:b/>
+          <w:color w:val="00B0F0"/>
+        </w:rPr>
+        <w:t xml:space="preserve"> necesito que cuando entre a la vista de asignar actividades me aparezca seleccionado en la lista desplegable el curso, en primer lugar el activo en el momento según el horario actual y luego en el desplegable solo los cursos asociados a esa materia, en orden según el horario</w:t>
+      </w:r>
+    </w:p>
+    <w:p>
+      <w:pPr>
+        <w:rPr>
+          <w:b/>
+          <w:color w:val="00B0F0"/>
+        </w:rPr>
+      </w:pPr>
       <w:proofErr w:type="gramStart"/>
       <w:r>
+        <w:rPr>
+          <w:b/>
+          <w:color w:val="00B0F0"/>
+        </w:rPr>
         <w:t>ahora</w:t>
       </w:r>
       <w:proofErr w:type="gramEnd"/>
       <w:r>
-        <w:t xml:space="preserve"> necesito que cuando entre a la vista </w:t>
-      </w:r>
-      <w:r>
-        <w:t xml:space="preserve">de </w:t>
-      </w:r>
-      <w:r>
-        <w:t xml:space="preserve">proyectos, </w:t>
-      </w:r>
-      <w:r>
-        <w:t xml:space="preserve">me aparezca seleccionado en la lista desplegable </w:t>
-      </w:r>
-      <w:r>
-        <w:t>la materia actual según el horario y en orden todas las otras según mi horario</w:t>
-      </w:r>
-      <w:r>
-        <w:t>,</w:t>
-      </w:r>
-      <w:r>
-        <w:t xml:space="preserve"> </w:t>
-      </w:r>
-      <w:r>
-        <w:t xml:space="preserve">al desplegar los cursos que me muestre solo los cursos asociados a esa materia, y si cambio la materia del desplegable se </w:t>
-      </w:r>
-      <w:proofErr w:type="spellStart"/>
-      <w:r>
+        <w:rPr>
+          <w:b/>
+          <w:color w:val="00B0F0"/>
+        </w:rPr>
+        <w:t xml:space="preserve"> necesito que cuando entre a la vista de proyectos, me aparezca seleccionado en la lista desplegable la materia actual según el horario y en orden todas las otras según mi horario, al desplegar los cursos que me muestre solo los cursos asociados a esa materia, y si cambio la materia del desplegable se </w:t>
+      </w:r>
+      <w:proofErr w:type="spellStart"/>
+      <w:r>
+        <w:rPr>
+          <w:b/>
+          <w:color w:val="00B0F0"/>
+        </w:rPr>
         <w:t>actualize</w:t>
       </w:r>
       <w:proofErr w:type="spellEnd"/>
       <w:r>
+        <w:rPr>
+          <w:b/>
+          <w:color w:val="00B0F0"/>
+        </w:rPr>
         <w:t xml:space="preserve"> la lista de cursos asociados a la nueva materia lo demás sin cambios</w:t>
       </w:r>
+      <w:r>
+        <w:rPr>
+          <w:b/>
+          <w:color w:val="00B0F0"/>
+        </w:rPr>
+        <w:t>.</w:t>
+      </w:r>
+    </w:p>
+    <w:p>
       <w:bookmarkStart w:id="0" w:name="_GoBack"/>
       <w:bookmarkEnd w:id="0"/>
+      <w:r>
+        <w:t>Necesito que en el dashboard , en la card clase actual, dentro de esa card, abajo me aparezca el tema que se dio en la clase anterior, fecha y tema, el tema de la clase actual fecha y tema, y lo mismo para la próxima clase, esos datos deben salir de la planificación de la materia.</w:t>
+      </w:r>
+    </w:p>
+    <w:p>
+      <w:proofErr w:type="gramStart"/>
+      <w:r>
+        <w:t>necesito</w:t>
+      </w:r>
+      <w:proofErr w:type="gramEnd"/>
+      <w:r>
+        <w:t xml:space="preserve"> implementar </w:t>
+      </w:r>
+      <w:proofErr w:type="spellStart"/>
+      <w:r>
+        <w:t>capcha</w:t>
+      </w:r>
+      <w:proofErr w:type="spellEnd"/>
+      <w:r>
+        <w:t xml:space="preserve"> en el </w:t>
+      </w:r>
+      <w:proofErr w:type="spellStart"/>
+      <w:r>
+        <w:t>login</w:t>
+      </w:r>
+      <w:proofErr w:type="spellEnd"/>
     </w:p>
     <w:p/>
     <w:p/>
@@ -12332,7 +12356,6 @@
     <w:p/>
     <w:p/>
     <w:p/>
-    <w:p/>
     <w:p>
       <w:pPr>
         <w:spacing w:after="0"/>
@@ -12667,6 +12690,7 @@
         <w:spacing w:after="0"/>
       </w:pPr>
       <w:r>
+        <w:lastRenderedPageBreak/>
         <w:pict>
           <v:rect id="_x0000_i1028" style="width:0;height:1.5pt" o:hralign="center" o:hrstd="t" o:hr="t" fillcolor="#a0a0a0" stroked="f"/>
         </w:pict>
@@ -12741,7 +12765,6 @@
         <w:spacing w:after="0"/>
       </w:pPr>
       <w:r>
-        <w:lastRenderedPageBreak/>
         <w:t>Usuario</w:t>
       </w:r>
     </w:p>
@@ -13154,6 +13177,7 @@
         <w:spacing w:after="0"/>
       </w:pPr>
       <w:r>
+        <w:lastRenderedPageBreak/>
         <w:t>Cada registro tiene un estado.</w:t>
       </w:r>
     </w:p>
@@ -13557,7 +13581,6 @@
         <w:spacing w:after="0"/>
       </w:pPr>
       <w:r>
-        <w:lastRenderedPageBreak/>
         <w:t xml:space="preserve">    </w:t>
       </w:r>
       <w:proofErr w:type="gramStart"/>
@@ -13966,6 +13989,7 @@
         <w:spacing w:after="0"/>
       </w:pPr>
       <w:r>
+        <w:lastRenderedPageBreak/>
         <w:t>INSERT detalle</w:t>
       </w:r>
     </w:p>
@@ -14320,6 +14344,7 @@
         <w:spacing w:after="0"/>
       </w:pPr>
       <w:r>
+        <w:lastRenderedPageBreak/>
         <w:t>Cada operación lleva un UUID.</w:t>
       </w:r>
     </w:p>
@@ -14655,6 +14680,7 @@
         <w:spacing w:after="0"/>
       </w:pPr>
       <w:r>
+        <w:lastRenderedPageBreak/>
         <w:t>PENDIENTE</w:t>
       </w:r>
     </w:p>
@@ -15012,6 +15038,7 @@
         <w:spacing w:after="0"/>
       </w:pPr>
       <w:r>
+        <w:lastRenderedPageBreak/>
         <w:t>Supongamos:</w:t>
       </w:r>
     </w:p>
@@ -15058,7 +15085,6 @@
       </w:pPr>
       <w:proofErr w:type="gramStart"/>
       <w:r>
-        <w:lastRenderedPageBreak/>
         <w:t>modifica</w:t>
       </w:r>
       <w:proofErr w:type="gramEnd"/>
@@ -15552,6 +15578,7 @@
         <w:spacing w:after="0"/>
       </w:pPr>
       <w:r>
+        <w:lastRenderedPageBreak/>
         <w:t>Leer pendientes</w:t>
       </w:r>
     </w:p>
@@ -15598,7 +15625,6 @@
         <w:spacing w:after="0"/>
       </w:pPr>
       <w:r>
-        <w:lastRenderedPageBreak/>
         <w:t xml:space="preserve">       </w:t>
       </w:r>
       <w:r>
@@ -16184,6 +16210,7 @@
         <w:spacing w:after="0"/>
       </w:pPr>
       <w:r>
+        <w:lastRenderedPageBreak/>
         <w:t xml:space="preserve">        |  NestJS + </w:t>
       </w:r>
       <w:proofErr w:type="spellStart"/>
@@ -16241,7 +16268,6 @@
         <w:spacing w:after="0"/>
       </w:pPr>
       <w:r>
-        <w:lastRenderedPageBreak/>
         <w:t>+---------------------------------------------+</w:t>
       </w:r>
     </w:p>
@@ -16752,6 +16778,7 @@
         <w:spacing w:after="0"/>
       </w:pPr>
       <w:r>
+        <w:lastRenderedPageBreak/>
         <w:t>No hay Internet</w:t>
       </w:r>
     </w:p>
@@ -17149,6 +17176,7 @@
       </w:pPr>
       <w:proofErr w:type="gramStart"/>
       <w:r>
+        <w:lastRenderedPageBreak/>
         <w:t>la</w:t>
       </w:r>
       <w:proofErr w:type="gramEnd"/>
@@ -17212,7 +17240,6 @@
         <w:spacing w:after="0"/>
       </w:pPr>
       <w:r>
-        <w:lastRenderedPageBreak/>
         <w:t>}</w:t>
       </w:r>
     </w:p>
@@ -17597,7 +17624,6 @@
         <w:spacing w:after="0"/>
       </w:pPr>
       <w:r>
-        <w:lastRenderedPageBreak/>
         <w:t xml:space="preserve">Los datos siguen en </w:t>
       </w:r>
       <w:proofErr w:type="spellStart"/>
@@ -17917,6 +17943,7 @@
         <w:spacing w:after="0"/>
       </w:pPr>
       <w:r>
+        <w:lastRenderedPageBreak/>
         <w:t>Ejemplo:</w:t>
       </w:r>
     </w:p>
@@ -17954,7 +17981,6 @@
         <w:spacing w:after="0"/>
       </w:pPr>
       <w:r>
-        <w:lastRenderedPageBreak/>
         <w:t>¿Existe ese UUID?</w:t>
       </w:r>
     </w:p>
@@ -18249,6 +18275,7 @@
         <w:spacing w:after="0"/>
       </w:pPr>
       <w:r>
+        <w:lastRenderedPageBreak/>
         <w:t>Cada una queda registrada como una operación pendiente y se envía cuando corresponde.</w:t>
       </w:r>
     </w:p>
@@ -18296,275 +18323,275 @@
         <w:spacing w:after="0"/>
       </w:pPr>
       <w:r>
+        <w:t>---------------------------------</w:t>
+      </w:r>
+    </w:p>
+    <w:p>
+      <w:pPr>
+        <w:spacing w:after="0"/>
+      </w:pPr>
+    </w:p>
+    <w:p>
+      <w:pPr>
+        <w:spacing w:after="0"/>
+      </w:pPr>
+      <w:r>
+        <w:t>1</w:t>
+      </w:r>
+    </w:p>
+    <w:p>
+      <w:pPr>
+        <w:spacing w:after="0"/>
+      </w:pPr>
+    </w:p>
+    <w:p>
+      <w:pPr>
+        <w:spacing w:after="0"/>
+      </w:pPr>
+      <w:r>
+        <w:t>INSERT</w:t>
+      </w:r>
+    </w:p>
+    <w:p>
+      <w:pPr>
+        <w:spacing w:after="0"/>
+      </w:pPr>
+    </w:p>
+    <w:p>
+      <w:pPr>
+        <w:spacing w:after="0"/>
+      </w:pPr>
+      <w:r>
+        <w:t>Clientes</w:t>
+      </w:r>
+    </w:p>
+    <w:p>
+      <w:pPr>
+        <w:spacing w:after="0"/>
+      </w:pPr>
+    </w:p>
+    <w:p>
+      <w:pPr>
+        <w:spacing w:after="0"/>
+      </w:pPr>
+      <w:r>
+        <w:t>Pendiente</w:t>
+      </w:r>
+    </w:p>
+    <w:p>
+      <w:pPr>
+        <w:spacing w:after="0"/>
+      </w:pPr>
+    </w:p>
+    <w:p>
+      <w:pPr>
+        <w:spacing w:after="0"/>
+      </w:pPr>
+      <w:r>
+        <w:t>---------------------------------</w:t>
+      </w:r>
+    </w:p>
+    <w:p>
+      <w:pPr>
+        <w:spacing w:after="0"/>
+      </w:pPr>
+    </w:p>
+    <w:p>
+      <w:pPr>
+        <w:spacing w:after="0"/>
+      </w:pPr>
+      <w:r>
+        <w:t>2</w:t>
+      </w:r>
+    </w:p>
+    <w:p>
+      <w:pPr>
+        <w:spacing w:after="0"/>
+      </w:pPr>
+    </w:p>
+    <w:p>
+      <w:pPr>
+        <w:spacing w:after="0"/>
+      </w:pPr>
+      <w:r>
+        <w:t>UPDATE</w:t>
+      </w:r>
+    </w:p>
+    <w:p>
+      <w:pPr>
+        <w:spacing w:after="0"/>
+      </w:pPr>
+    </w:p>
+    <w:p>
+      <w:pPr>
+        <w:spacing w:after="0"/>
+      </w:pPr>
+      <w:r>
+        <w:t>Productos</w:t>
+      </w:r>
+    </w:p>
+    <w:p>
+      <w:pPr>
+        <w:spacing w:after="0"/>
+      </w:pPr>
+    </w:p>
+    <w:p>
+      <w:pPr>
+        <w:spacing w:after="0"/>
+      </w:pPr>
+      <w:r>
+        <w:t>Pendiente</w:t>
+      </w:r>
+    </w:p>
+    <w:p>
+      <w:pPr>
+        <w:spacing w:after="0"/>
+      </w:pPr>
+    </w:p>
+    <w:p>
+      <w:pPr>
+        <w:spacing w:after="0"/>
+      </w:pPr>
+      <w:r>
+        <w:t>---------------------------------</w:t>
+      </w:r>
+    </w:p>
+    <w:p>
+      <w:pPr>
+        <w:spacing w:after="0"/>
+      </w:pPr>
+    </w:p>
+    <w:p>
+      <w:pPr>
+        <w:spacing w:after="0"/>
+      </w:pPr>
+      <w:r>
+        <w:t>3</w:t>
+      </w:r>
+    </w:p>
+    <w:p>
+      <w:pPr>
+        <w:spacing w:after="0"/>
+      </w:pPr>
+    </w:p>
+    <w:p>
+      <w:pPr>
+        <w:spacing w:after="0"/>
+      </w:pPr>
+      <w:r>
+        <w:t>INSERT</w:t>
+      </w:r>
+    </w:p>
+    <w:p>
+      <w:pPr>
+        <w:spacing w:after="0"/>
+      </w:pPr>
+    </w:p>
+    <w:p>
+      <w:pPr>
+        <w:spacing w:after="0"/>
+      </w:pPr>
+      <w:r>
+        <w:t>Ventas</w:t>
+      </w:r>
+    </w:p>
+    <w:p>
+      <w:pPr>
+        <w:spacing w:after="0"/>
+      </w:pPr>
+    </w:p>
+    <w:p>
+      <w:pPr>
+        <w:spacing w:after="0"/>
+      </w:pPr>
+      <w:r>
+        <w:t>Pendiente</w:t>
+      </w:r>
+    </w:p>
+    <w:p>
+      <w:pPr>
+        <w:spacing w:after="0"/>
+      </w:pPr>
+      <w:proofErr w:type="gramStart"/>
+      <w:r>
+        <w:t>El sincronizador</w:t>
+      </w:r>
+      <w:proofErr w:type="gramEnd"/>
+      <w:r>
+        <w:t xml:space="preserve"> toma una por una:</w:t>
+      </w:r>
+    </w:p>
+    <w:p>
+      <w:pPr>
+        <w:spacing w:after="0"/>
+      </w:pPr>
+      <w:r>
+        <w:t>Enviar</w:t>
+      </w:r>
+    </w:p>
+    <w:p>
+      <w:pPr>
+        <w:spacing w:after="0"/>
+      </w:pPr>
+    </w:p>
+    <w:p>
+      <w:pPr>
+        <w:spacing w:after="0"/>
+      </w:pPr>
+      <w:r>
+        <w:t>↓</w:t>
+      </w:r>
+    </w:p>
+    <w:p>
+      <w:pPr>
+        <w:spacing w:after="0"/>
+      </w:pPr>
+    </w:p>
+    <w:p>
+      <w:pPr>
+        <w:spacing w:after="0"/>
+      </w:pPr>
+      <w:r>
+        <w:t>OK</w:t>
+      </w:r>
+    </w:p>
+    <w:p>
+      <w:pPr>
+        <w:spacing w:after="0"/>
+      </w:pPr>
+    </w:p>
+    <w:p>
+      <w:pPr>
+        <w:spacing w:after="0"/>
+      </w:pPr>
+      <w:r>
+        <w:t>↓</w:t>
+      </w:r>
+    </w:p>
+    <w:p>
+      <w:pPr>
+        <w:spacing w:after="0"/>
+      </w:pPr>
+    </w:p>
+    <w:p>
+      <w:pPr>
+        <w:spacing w:after="0"/>
+      </w:pPr>
+      <w:r>
+        <w:t>Eliminar</w:t>
+      </w:r>
+    </w:p>
+    <w:p>
+      <w:pPr>
+        <w:spacing w:after="0"/>
+      </w:pPr>
+    </w:p>
+    <w:p>
+      <w:pPr>
+        <w:spacing w:after="0"/>
+      </w:pPr>
+      <w:r>
         <w:lastRenderedPageBreak/>
-        <w:t>---------------------------------</w:t>
-      </w:r>
-    </w:p>
-    <w:p>
-      <w:pPr>
-        <w:spacing w:after="0"/>
-      </w:pPr>
-    </w:p>
-    <w:p>
-      <w:pPr>
-        <w:spacing w:after="0"/>
-      </w:pPr>
-      <w:r>
-        <w:t>1</w:t>
-      </w:r>
-    </w:p>
-    <w:p>
-      <w:pPr>
-        <w:spacing w:after="0"/>
-      </w:pPr>
-    </w:p>
-    <w:p>
-      <w:pPr>
-        <w:spacing w:after="0"/>
-      </w:pPr>
-      <w:r>
-        <w:t>INSERT</w:t>
-      </w:r>
-    </w:p>
-    <w:p>
-      <w:pPr>
-        <w:spacing w:after="0"/>
-      </w:pPr>
-    </w:p>
-    <w:p>
-      <w:pPr>
-        <w:spacing w:after="0"/>
-      </w:pPr>
-      <w:r>
-        <w:t>Clientes</w:t>
-      </w:r>
-    </w:p>
-    <w:p>
-      <w:pPr>
-        <w:spacing w:after="0"/>
-      </w:pPr>
-    </w:p>
-    <w:p>
-      <w:pPr>
-        <w:spacing w:after="0"/>
-      </w:pPr>
-      <w:r>
-        <w:t>Pendiente</w:t>
-      </w:r>
-    </w:p>
-    <w:p>
-      <w:pPr>
-        <w:spacing w:after="0"/>
-      </w:pPr>
-    </w:p>
-    <w:p>
-      <w:pPr>
-        <w:spacing w:after="0"/>
-      </w:pPr>
-      <w:r>
-        <w:t>---------------------------------</w:t>
-      </w:r>
-    </w:p>
-    <w:p>
-      <w:pPr>
-        <w:spacing w:after="0"/>
-      </w:pPr>
-    </w:p>
-    <w:p>
-      <w:pPr>
-        <w:spacing w:after="0"/>
-      </w:pPr>
-      <w:r>
-        <w:t>2</w:t>
-      </w:r>
-    </w:p>
-    <w:p>
-      <w:pPr>
-        <w:spacing w:after="0"/>
-      </w:pPr>
-    </w:p>
-    <w:p>
-      <w:pPr>
-        <w:spacing w:after="0"/>
-      </w:pPr>
-      <w:r>
-        <w:t>UPDATE</w:t>
-      </w:r>
-    </w:p>
-    <w:p>
-      <w:pPr>
-        <w:spacing w:after="0"/>
-      </w:pPr>
-    </w:p>
-    <w:p>
-      <w:pPr>
-        <w:spacing w:after="0"/>
-      </w:pPr>
-      <w:r>
-        <w:t>Productos</w:t>
-      </w:r>
-    </w:p>
-    <w:p>
-      <w:pPr>
-        <w:spacing w:after="0"/>
-      </w:pPr>
-    </w:p>
-    <w:p>
-      <w:pPr>
-        <w:spacing w:after="0"/>
-      </w:pPr>
-      <w:r>
-        <w:t>Pendiente</w:t>
-      </w:r>
-    </w:p>
-    <w:p>
-      <w:pPr>
-        <w:spacing w:after="0"/>
-      </w:pPr>
-    </w:p>
-    <w:p>
-      <w:pPr>
-        <w:spacing w:after="0"/>
-      </w:pPr>
-      <w:r>
-        <w:t>---------------------------------</w:t>
-      </w:r>
-    </w:p>
-    <w:p>
-      <w:pPr>
-        <w:spacing w:after="0"/>
-      </w:pPr>
-    </w:p>
-    <w:p>
-      <w:pPr>
-        <w:spacing w:after="0"/>
-      </w:pPr>
-      <w:r>
-        <w:t>3</w:t>
-      </w:r>
-    </w:p>
-    <w:p>
-      <w:pPr>
-        <w:spacing w:after="0"/>
-      </w:pPr>
-    </w:p>
-    <w:p>
-      <w:pPr>
-        <w:spacing w:after="0"/>
-      </w:pPr>
-      <w:r>
-        <w:t>INSERT</w:t>
-      </w:r>
-    </w:p>
-    <w:p>
-      <w:pPr>
-        <w:spacing w:after="0"/>
-      </w:pPr>
-    </w:p>
-    <w:p>
-      <w:pPr>
-        <w:spacing w:after="0"/>
-      </w:pPr>
-      <w:r>
-        <w:t>Ventas</w:t>
-      </w:r>
-    </w:p>
-    <w:p>
-      <w:pPr>
-        <w:spacing w:after="0"/>
-      </w:pPr>
-    </w:p>
-    <w:p>
-      <w:pPr>
-        <w:spacing w:after="0"/>
-      </w:pPr>
-      <w:r>
-        <w:t>Pendiente</w:t>
-      </w:r>
-    </w:p>
-    <w:p>
-      <w:pPr>
-        <w:spacing w:after="0"/>
-      </w:pPr>
-      <w:proofErr w:type="gramStart"/>
-      <w:r>
-        <w:t>El sincronizador</w:t>
-      </w:r>
-      <w:proofErr w:type="gramEnd"/>
-      <w:r>
-        <w:t xml:space="preserve"> toma una por una:</w:t>
-      </w:r>
-    </w:p>
-    <w:p>
-      <w:pPr>
-        <w:spacing w:after="0"/>
-      </w:pPr>
-      <w:r>
-        <w:t>Enviar</w:t>
-      </w:r>
-    </w:p>
-    <w:p>
-      <w:pPr>
-        <w:spacing w:after="0"/>
-      </w:pPr>
-    </w:p>
-    <w:p>
-      <w:pPr>
-        <w:spacing w:after="0"/>
-      </w:pPr>
-      <w:r>
-        <w:t>↓</w:t>
-      </w:r>
-    </w:p>
-    <w:p>
-      <w:pPr>
-        <w:spacing w:after="0"/>
-      </w:pPr>
-    </w:p>
-    <w:p>
-      <w:pPr>
-        <w:spacing w:after="0"/>
-      </w:pPr>
-      <w:r>
-        <w:t>OK</w:t>
-      </w:r>
-    </w:p>
-    <w:p>
-      <w:pPr>
-        <w:spacing w:after="0"/>
-      </w:pPr>
-    </w:p>
-    <w:p>
-      <w:pPr>
-        <w:spacing w:after="0"/>
-      </w:pPr>
-      <w:r>
-        <w:t>↓</w:t>
-      </w:r>
-    </w:p>
-    <w:p>
-      <w:pPr>
-        <w:spacing w:after="0"/>
-      </w:pPr>
-    </w:p>
-    <w:p>
-      <w:pPr>
-        <w:spacing w:after="0"/>
-      </w:pPr>
-      <w:r>
-        <w:t>Eliminar</w:t>
-      </w:r>
-    </w:p>
-    <w:p>
-      <w:pPr>
-        <w:spacing w:after="0"/>
-      </w:pPr>
-    </w:p>
-    <w:p>
-      <w:pPr>
-        <w:spacing w:after="0"/>
-      </w:pPr>
-      <w:r>
         <w:t>↓</w:t>
       </w:r>
     </w:p>
@@ -19355,6 +19382,7 @@
     </w:p>
     <w:p>
       <w:r>
+        <w:lastRenderedPageBreak/>
         <w:t>Aquí tienes el paso a paso técnico para lograrlo:</w:t>
       </w:r>
     </w:p>
@@ -19406,7 +19434,6 @@
           <w:b/>
           <w:bCs/>
         </w:rPr>
-        <w:lastRenderedPageBreak/>
         <w:t>HTTPS:</w:t>
       </w:r>
       <w:r>
@@ -20006,6 +20033,7 @@
     </w:p>
     <w:p>
       <w:r>
+        <w:lastRenderedPageBreak/>
         <w:t>En el &lt;head&gt; de tu archivo index.html, debes enlazar el archivo que acabas de crear:</w:t>
       </w:r>
     </w:p>
@@ -20092,77 +20120,611 @@
           <w:b/>
           <w:bCs/>
         </w:rPr>
+        <w:t xml:space="preserve">Paso 3: Crear el </w:t>
+      </w:r>
+      <w:proofErr w:type="spellStart"/>
+      <w:r>
+        <w:rPr>
+          <w:b/>
+          <w:bCs/>
+        </w:rPr>
+        <w:t>Service</w:t>
+      </w:r>
+      <w:proofErr w:type="spellEnd"/>
+      <w:r>
+        <w:rPr>
+          <w:b/>
+          <w:bCs/>
+        </w:rPr>
+        <w:t xml:space="preserve"> </w:t>
+      </w:r>
+      <w:proofErr w:type="spellStart"/>
+      <w:r>
+        <w:rPr>
+          <w:b/>
+          <w:bCs/>
+        </w:rPr>
+        <w:t>Worker</w:t>
+      </w:r>
+      <w:proofErr w:type="spellEnd"/>
+      <w:r>
+        <w:rPr>
+          <w:b/>
+          <w:bCs/>
+        </w:rPr>
+        <w:t xml:space="preserve"> (sw.js)</w:t>
+      </w:r>
+    </w:p>
+    <w:p>
+      <w:r>
+        <w:t xml:space="preserve">El </w:t>
+      </w:r>
+      <w:proofErr w:type="spellStart"/>
+      <w:r>
+        <w:t>Service</w:t>
+      </w:r>
+      <w:proofErr w:type="spellEnd"/>
+      <w:r>
+        <w:t xml:space="preserve"> </w:t>
+      </w:r>
+      <w:proofErr w:type="spellStart"/>
+      <w:r>
+        <w:t>Worker</w:t>
+      </w:r>
+      <w:proofErr w:type="spellEnd"/>
+      <w:r>
+        <w:t xml:space="preserve"> es el motor que gestiona la caché y permite que la </w:t>
+      </w:r>
+      <w:proofErr w:type="spellStart"/>
+      <w:r>
+        <w:t>app</w:t>
+      </w:r>
+      <w:proofErr w:type="spellEnd"/>
+      <w:r>
+        <w:t xml:space="preserve"> cargue instantáneamente. Crea un archivo llamado sw.js en la raíz de tu proyecto con este código básico de almacenamiento en caché:</w:t>
+      </w:r>
+    </w:p>
+    <w:p>
+      <w:pPr>
+        <w:spacing w:after="0"/>
+      </w:pPr>
+      <w:r>
+        <w:t>JavaScript</w:t>
+      </w:r>
+    </w:p>
+    <w:p>
+      <w:pPr>
+        <w:spacing w:after="0"/>
+      </w:pPr>
+      <w:proofErr w:type="spellStart"/>
+      <w:proofErr w:type="gramStart"/>
+      <w:r>
+        <w:t>const</w:t>
+      </w:r>
+      <w:proofErr w:type="spellEnd"/>
+      <w:proofErr w:type="gramEnd"/>
+      <w:r>
+        <w:t xml:space="preserve"> CACHE_NAME = 'v1_cache_miapp';</w:t>
+      </w:r>
+    </w:p>
+    <w:p>
+      <w:pPr>
+        <w:spacing w:after="0"/>
+      </w:pPr>
+      <w:r>
+        <w:t>// Archivos esenciales que quieres que funcionen incluso sin internet</w:t>
+      </w:r>
+    </w:p>
+    <w:p>
+      <w:pPr>
+        <w:spacing w:after="0"/>
+      </w:pPr>
+      <w:proofErr w:type="spellStart"/>
+      <w:proofErr w:type="gramStart"/>
+      <w:r>
+        <w:t>const</w:t>
+      </w:r>
+      <w:proofErr w:type="spellEnd"/>
+      <w:proofErr w:type="gramEnd"/>
+      <w:r>
+        <w:t xml:space="preserve"> </w:t>
+      </w:r>
+      <w:proofErr w:type="spellStart"/>
+      <w:r>
+        <w:t>urlsToCache</w:t>
+      </w:r>
+      <w:proofErr w:type="spellEnd"/>
+      <w:r>
+        <w:t xml:space="preserve"> = [</w:t>
+      </w:r>
+    </w:p>
+    <w:p>
+      <w:pPr>
+        <w:spacing w:after="0"/>
+      </w:pPr>
+      <w:r>
+        <w:t xml:space="preserve">  '/',</w:t>
+      </w:r>
+    </w:p>
+    <w:p>
+      <w:pPr>
+        <w:spacing w:after="0"/>
+      </w:pPr>
+      <w:r>
+        <w:t xml:space="preserve">  '/index.html',</w:t>
+      </w:r>
+    </w:p>
+    <w:p>
+      <w:pPr>
+        <w:spacing w:after="0"/>
+      </w:pPr>
+      <w:r>
+        <w:t xml:space="preserve">  '/styles.css',</w:t>
+      </w:r>
+    </w:p>
+    <w:p>
+      <w:pPr>
+        <w:spacing w:after="0"/>
+      </w:pPr>
+      <w:r>
+        <w:t xml:space="preserve">  '/script.js',</w:t>
+      </w:r>
+    </w:p>
+    <w:p>
+      <w:pPr>
+        <w:spacing w:after="0"/>
+      </w:pPr>
+      <w:r>
+        <w:t xml:space="preserve">  '/icon-192.png'</w:t>
+      </w:r>
+    </w:p>
+    <w:p>
+      <w:pPr>
+        <w:spacing w:after="0"/>
+      </w:pPr>
+      <w:r>
+        <w:t>];</w:t>
+      </w:r>
+    </w:p>
+    <w:p>
+      <w:pPr>
+        <w:spacing w:after="0"/>
+      </w:pPr>
+    </w:p>
+    <w:p>
+      <w:pPr>
+        <w:spacing w:after="0"/>
+      </w:pPr>
+      <w:r>
+        <w:t>// Evento de instalación: Guarda los archivos en la caché del navegador</w:t>
+      </w:r>
+    </w:p>
+    <w:p>
+      <w:pPr>
+        <w:spacing w:after="0"/>
+      </w:pPr>
+      <w:proofErr w:type="spellStart"/>
+      <w:proofErr w:type="gramStart"/>
+      <w:r>
+        <w:t>self.addEventListener</w:t>
+      </w:r>
+      <w:proofErr w:type="spellEnd"/>
+      <w:r>
+        <w:t>(</w:t>
+      </w:r>
+      <w:proofErr w:type="gramEnd"/>
+      <w:r>
+        <w:t>'</w:t>
+      </w:r>
+      <w:proofErr w:type="spellStart"/>
+      <w:r>
+        <w:t>install</w:t>
+      </w:r>
+      <w:proofErr w:type="spellEnd"/>
+      <w:r>
+        <w:t>', e =&gt; {</w:t>
+      </w:r>
+    </w:p>
+    <w:p>
+      <w:pPr>
+        <w:spacing w:after="0"/>
+      </w:pPr>
+      <w:r>
+        <w:t xml:space="preserve">  </w:t>
+      </w:r>
+      <w:proofErr w:type="spellStart"/>
+      <w:proofErr w:type="gramStart"/>
+      <w:r>
+        <w:t>e.waitUntil</w:t>
+      </w:r>
+      <w:proofErr w:type="spellEnd"/>
+      <w:r>
+        <w:t>(</w:t>
+      </w:r>
+      <w:proofErr w:type="gramEnd"/>
+    </w:p>
+    <w:p>
+      <w:pPr>
+        <w:spacing w:after="0"/>
+      </w:pPr>
+      <w:r>
+        <w:t xml:space="preserve">    </w:t>
+      </w:r>
+      <w:proofErr w:type="spellStart"/>
+      <w:proofErr w:type="gramStart"/>
+      <w:r>
+        <w:t>caches.open</w:t>
+      </w:r>
+      <w:proofErr w:type="spellEnd"/>
+      <w:r>
+        <w:t>(</w:t>
+      </w:r>
+      <w:proofErr w:type="gramEnd"/>
+      <w:r>
+        <w:t>CACHE_NAME)</w:t>
+      </w:r>
+    </w:p>
+    <w:p>
+      <w:pPr>
+        <w:spacing w:after="0"/>
+      </w:pPr>
+      <w:r>
+        <w:t xml:space="preserve">      .</w:t>
+      </w:r>
+      <w:proofErr w:type="spellStart"/>
+      <w:proofErr w:type="gramStart"/>
+      <w:r>
+        <w:t>then</w:t>
+      </w:r>
+      <w:proofErr w:type="spellEnd"/>
+      <w:r>
+        <w:t>(</w:t>
+      </w:r>
+      <w:proofErr w:type="gramEnd"/>
+      <w:r>
+        <w:t>cache =&gt; {</w:t>
+      </w:r>
+    </w:p>
+    <w:p>
+      <w:pPr>
+        <w:spacing w:after="0"/>
+      </w:pPr>
+      <w:r>
+        <w:t xml:space="preserve">        </w:t>
+      </w:r>
+      <w:proofErr w:type="spellStart"/>
+      <w:proofErr w:type="gramStart"/>
+      <w:r>
+        <w:t>return</w:t>
+      </w:r>
+      <w:proofErr w:type="spellEnd"/>
+      <w:proofErr w:type="gramEnd"/>
+      <w:r>
+        <w:t xml:space="preserve"> </w:t>
+      </w:r>
+      <w:proofErr w:type="spellStart"/>
+      <w:r>
+        <w:t>cache.addAll</w:t>
+      </w:r>
+      <w:proofErr w:type="spellEnd"/>
+      <w:r>
+        <w:t>(</w:t>
+      </w:r>
+      <w:proofErr w:type="spellStart"/>
+      <w:r>
+        <w:t>urlsToCache</w:t>
+      </w:r>
+      <w:proofErr w:type="spellEnd"/>
+      <w:r>
+        <w:t>);</w:t>
+      </w:r>
+    </w:p>
+    <w:p>
+      <w:pPr>
+        <w:spacing w:after="0"/>
+      </w:pPr>
+      <w:r>
+        <w:t xml:space="preserve">      })</w:t>
+      </w:r>
+    </w:p>
+    <w:p>
+      <w:pPr>
+        <w:spacing w:after="0"/>
+      </w:pPr>
+      <w:r>
+        <w:t xml:space="preserve">      .</w:t>
+      </w:r>
+      <w:proofErr w:type="spellStart"/>
+      <w:proofErr w:type="gramStart"/>
+      <w:r>
+        <w:t>then</w:t>
+      </w:r>
+      <w:proofErr w:type="spellEnd"/>
+      <w:r>
+        <w:t>(</w:t>
+      </w:r>
+      <w:proofErr w:type="gramEnd"/>
+      <w:r>
+        <w:t xml:space="preserve">() =&gt; </w:t>
+      </w:r>
+      <w:proofErr w:type="spellStart"/>
+      <w:r>
+        <w:t>self.skipWaiting</w:t>
+      </w:r>
+      <w:proofErr w:type="spellEnd"/>
+      <w:r>
+        <w:t>())</w:t>
+      </w:r>
+    </w:p>
+    <w:p>
+      <w:pPr>
+        <w:spacing w:after="0"/>
+      </w:pPr>
+      <w:r>
+        <w:t xml:space="preserve">  );</w:t>
+      </w:r>
+    </w:p>
+    <w:p>
+      <w:pPr>
+        <w:spacing w:after="0"/>
+      </w:pPr>
+      <w:r>
+        <w:t>});</w:t>
+      </w:r>
+    </w:p>
+    <w:p>
+      <w:pPr>
+        <w:spacing w:after="0"/>
+      </w:pPr>
+    </w:p>
+    <w:p>
+      <w:pPr>
+        <w:spacing w:after="0"/>
+      </w:pPr>
+      <w:r>
+        <w:t>// Evento de activación: Limpia cachés antiguas</w:t>
+      </w:r>
+    </w:p>
+    <w:p>
+      <w:pPr>
+        <w:spacing w:after="0"/>
+      </w:pPr>
+      <w:proofErr w:type="spellStart"/>
+      <w:proofErr w:type="gramStart"/>
+      <w:r>
+        <w:t>self.addEventListener</w:t>
+      </w:r>
+      <w:proofErr w:type="spellEnd"/>
+      <w:r>
+        <w:t>(</w:t>
+      </w:r>
+      <w:proofErr w:type="gramEnd"/>
+      <w:r>
+        <w:t>'</w:t>
+      </w:r>
+      <w:proofErr w:type="spellStart"/>
+      <w:r>
+        <w:t>activate</w:t>
+      </w:r>
+      <w:proofErr w:type="spellEnd"/>
+      <w:r>
+        <w:t>', e =&gt; {</w:t>
+      </w:r>
+    </w:p>
+    <w:p>
+      <w:pPr>
+        <w:spacing w:after="0"/>
+      </w:pPr>
+      <w:r>
+        <w:t xml:space="preserve">  </w:t>
+      </w:r>
+      <w:proofErr w:type="spellStart"/>
+      <w:proofErr w:type="gramStart"/>
+      <w:r>
+        <w:t>e.waitUntil</w:t>
+      </w:r>
+      <w:proofErr w:type="spellEnd"/>
+      <w:r>
+        <w:t>(</w:t>
+      </w:r>
+      <w:proofErr w:type="gramEnd"/>
+    </w:p>
+    <w:p>
+      <w:pPr>
+        <w:spacing w:after="0"/>
+      </w:pPr>
+      <w:r>
+        <w:t xml:space="preserve">    </w:t>
+      </w:r>
+      <w:proofErr w:type="spellStart"/>
+      <w:proofErr w:type="gramStart"/>
+      <w:r>
+        <w:t>caches.keys</w:t>
+      </w:r>
+      <w:proofErr w:type="spellEnd"/>
+      <w:r>
+        <w:t>(</w:t>
+      </w:r>
+      <w:proofErr w:type="gramEnd"/>
+      <w:r>
+        <w:t>).</w:t>
+      </w:r>
+      <w:proofErr w:type="spellStart"/>
+      <w:r>
+        <w:t>then</w:t>
+      </w:r>
+      <w:proofErr w:type="spellEnd"/>
+      <w:r>
+        <w:t>(</w:t>
+      </w:r>
+      <w:proofErr w:type="spellStart"/>
+      <w:r>
+        <w:t>cacheNames</w:t>
+      </w:r>
+      <w:proofErr w:type="spellEnd"/>
+      <w:r>
+        <w:t xml:space="preserve"> =&gt; {</w:t>
+      </w:r>
+    </w:p>
+    <w:p>
+      <w:pPr>
+        <w:spacing w:after="0"/>
+      </w:pPr>
+      <w:r>
+        <w:t xml:space="preserve">      </w:t>
+      </w:r>
+      <w:proofErr w:type="spellStart"/>
+      <w:proofErr w:type="gramStart"/>
+      <w:r>
+        <w:t>return</w:t>
+      </w:r>
+      <w:proofErr w:type="spellEnd"/>
+      <w:proofErr w:type="gramEnd"/>
+      <w:r>
+        <w:t xml:space="preserve"> </w:t>
+      </w:r>
+      <w:proofErr w:type="spellStart"/>
+      <w:r>
+        <w:t>Promise.all</w:t>
+      </w:r>
+      <w:proofErr w:type="spellEnd"/>
+      <w:r>
+        <w:t>(</w:t>
+      </w:r>
+    </w:p>
+    <w:p>
+      <w:pPr>
+        <w:spacing w:after="0"/>
+      </w:pPr>
+      <w:r>
+        <w:t xml:space="preserve">        </w:t>
+      </w:r>
+      <w:proofErr w:type="spellStart"/>
+      <w:proofErr w:type="gramStart"/>
+      <w:r>
+        <w:t>cacheNames.map</w:t>
+      </w:r>
+      <w:proofErr w:type="spellEnd"/>
+      <w:r>
+        <w:t>(</w:t>
+      </w:r>
+      <w:proofErr w:type="gramEnd"/>
+      <w:r>
+        <w:t>cache =&gt; {</w:t>
+      </w:r>
+    </w:p>
+    <w:p>
+      <w:pPr>
+        <w:spacing w:after="0"/>
+      </w:pPr>
+      <w:r>
+        <w:t xml:space="preserve">          </w:t>
+      </w:r>
+      <w:proofErr w:type="spellStart"/>
+      <w:proofErr w:type="gramStart"/>
+      <w:r>
+        <w:t>if</w:t>
+      </w:r>
+      <w:proofErr w:type="spellEnd"/>
+      <w:proofErr w:type="gramEnd"/>
+      <w:r>
+        <w:t xml:space="preserve"> (cache !== CACHE_NAME) {</w:t>
+      </w:r>
+    </w:p>
+    <w:p>
+      <w:pPr>
+        <w:spacing w:after="0"/>
+      </w:pPr>
+      <w:r>
+        <w:t xml:space="preserve">            </w:t>
+      </w:r>
+      <w:proofErr w:type="spellStart"/>
+      <w:proofErr w:type="gramStart"/>
+      <w:r>
+        <w:t>return</w:t>
+      </w:r>
+      <w:proofErr w:type="spellEnd"/>
+      <w:proofErr w:type="gramEnd"/>
+      <w:r>
+        <w:t xml:space="preserve"> </w:t>
+      </w:r>
+      <w:proofErr w:type="spellStart"/>
+      <w:r>
+        <w:t>caches.delete</w:t>
+      </w:r>
+      <w:proofErr w:type="spellEnd"/>
+      <w:r>
+        <w:t>(cache);</w:t>
+      </w:r>
+    </w:p>
+    <w:p>
+      <w:pPr>
+        <w:spacing w:after="0"/>
+      </w:pPr>
+      <w:r>
+        <w:t xml:space="preserve">          }</w:t>
+      </w:r>
+    </w:p>
+    <w:p>
+      <w:pPr>
+        <w:spacing w:after="0"/>
+      </w:pPr>
+      <w:r>
+        <w:t xml:space="preserve">        })</w:t>
+      </w:r>
+    </w:p>
+    <w:p>
+      <w:pPr>
+        <w:spacing w:after="0"/>
+      </w:pPr>
+      <w:r>
+        <w:t xml:space="preserve">      );</w:t>
+      </w:r>
+    </w:p>
+    <w:p>
+      <w:pPr>
+        <w:spacing w:after="0"/>
+      </w:pPr>
+      <w:r>
         <w:lastRenderedPageBreak/>
-        <w:t xml:space="preserve">Paso 3: Crear el </w:t>
-      </w:r>
-      <w:proofErr w:type="spellStart"/>
-      <w:r>
-        <w:rPr>
-          <w:b/>
-          <w:bCs/>
-        </w:rPr>
-        <w:t>Service</w:t>
-      </w:r>
-      <w:proofErr w:type="spellEnd"/>
-      <w:r>
-        <w:rPr>
-          <w:b/>
-          <w:bCs/>
-        </w:rPr>
-        <w:t xml:space="preserve"> </w:t>
-      </w:r>
-      <w:proofErr w:type="spellStart"/>
-      <w:r>
-        <w:rPr>
-          <w:b/>
-          <w:bCs/>
-        </w:rPr>
-        <w:t>Worker</w:t>
-      </w:r>
-      <w:proofErr w:type="spellEnd"/>
-      <w:r>
-        <w:rPr>
-          <w:b/>
-          <w:bCs/>
-        </w:rPr>
-        <w:t xml:space="preserve"> (sw.js)</w:t>
-      </w:r>
-    </w:p>
-    <w:p>
-      <w:r>
-        <w:t xml:space="preserve">El </w:t>
-      </w:r>
-      <w:proofErr w:type="spellStart"/>
-      <w:r>
-        <w:t>Service</w:t>
-      </w:r>
-      <w:proofErr w:type="spellEnd"/>
-      <w:r>
-        <w:t xml:space="preserve"> </w:t>
-      </w:r>
-      <w:proofErr w:type="spellStart"/>
-      <w:r>
-        <w:t>Worker</w:t>
-      </w:r>
-      <w:proofErr w:type="spellEnd"/>
-      <w:r>
-        <w:t xml:space="preserve"> es el motor que gestiona la caché y permite que la </w:t>
-      </w:r>
-      <w:proofErr w:type="spellStart"/>
-      <w:r>
-        <w:t>app</w:t>
-      </w:r>
-      <w:proofErr w:type="spellEnd"/>
-      <w:r>
-        <w:t xml:space="preserve"> cargue instantáneamente. Crea un archivo llamado sw.js en la raíz de tu proyecto con este código básico de almacenamiento en caché:</w:t>
-      </w:r>
-    </w:p>
-    <w:p>
-      <w:pPr>
-        <w:spacing w:after="0"/>
-      </w:pPr>
-      <w:r>
-        <w:t>JavaScript</w:t>
+        <w:t xml:space="preserve">    })</w:t>
+      </w:r>
+    </w:p>
+    <w:p>
+      <w:pPr>
+        <w:spacing w:after="0"/>
+      </w:pPr>
+      <w:r>
+        <w:t xml:space="preserve">  );</w:t>
+      </w:r>
+    </w:p>
+    <w:p>
+      <w:pPr>
+        <w:spacing w:after="0"/>
+      </w:pPr>
+      <w:r>
+        <w:t>});</w:t>
+      </w:r>
+    </w:p>
+    <w:p>
+      <w:pPr>
+        <w:spacing w:after="0"/>
+      </w:pPr>
+    </w:p>
+    <w:p>
+      <w:pPr>
+        <w:spacing w:after="0"/>
+      </w:pPr>
+      <w:r>
+        <w:t xml:space="preserve">// Evento </w:t>
+      </w:r>
+      <w:proofErr w:type="spellStart"/>
+      <w:r>
+        <w:t>fetch</w:t>
+      </w:r>
+      <w:proofErr w:type="spellEnd"/>
+      <w:r>
+        <w:t>: Sirve el contenido desde la caché si no hay internet</w:t>
       </w:r>
     </w:p>
     <w:p>
@@ -20172,583 +20734,48 @@
       <w:proofErr w:type="spellStart"/>
       <w:proofErr w:type="gramStart"/>
       <w:r>
-        <w:t>const</w:t>
-      </w:r>
-      <w:proofErr w:type="spellEnd"/>
+        <w:t>self.addEventListener</w:t>
+      </w:r>
+      <w:proofErr w:type="spellEnd"/>
+      <w:r>
+        <w:t>(</w:t>
+      </w:r>
       <w:proofErr w:type="gramEnd"/>
       <w:r>
-        <w:t xml:space="preserve"> CACHE_NAME = 'v1_cache_miapp';</w:t>
-      </w:r>
-    </w:p>
-    <w:p>
-      <w:pPr>
-        <w:spacing w:after="0"/>
-      </w:pPr>
-      <w:r>
-        <w:t>// Archivos esenciales que quieres que funcionen incluso sin internet</w:t>
-      </w:r>
-    </w:p>
-    <w:p>
-      <w:pPr>
-        <w:spacing w:after="0"/>
-      </w:pPr>
+        <w:t>'</w:t>
+      </w:r>
+      <w:proofErr w:type="spellStart"/>
+      <w:r>
+        <w:t>fetch</w:t>
+      </w:r>
+      <w:proofErr w:type="spellEnd"/>
+      <w:r>
+        <w:t>', e =&gt; {</w:t>
+      </w:r>
+    </w:p>
+    <w:p>
+      <w:pPr>
+        <w:spacing w:after="0"/>
+      </w:pPr>
+      <w:r>
+        <w:t xml:space="preserve">  </w:t>
+      </w:r>
       <w:proofErr w:type="spellStart"/>
       <w:proofErr w:type="gramStart"/>
       <w:r>
-        <w:t>const</w:t>
-      </w:r>
-      <w:proofErr w:type="spellEnd"/>
+        <w:t>e.respondWith</w:t>
+      </w:r>
+      <w:proofErr w:type="spellEnd"/>
+      <w:r>
+        <w:t>(</w:t>
+      </w:r>
       <w:proofErr w:type="gramEnd"/>
-      <w:r>
-        <w:t xml:space="preserve"> </w:t>
-      </w:r>
-      <w:proofErr w:type="spellStart"/>
-      <w:r>
-        <w:t>urlsToCache</w:t>
-      </w:r>
-      <w:proofErr w:type="spellEnd"/>
-      <w:r>
-        <w:t xml:space="preserve"> = [</w:t>
-      </w:r>
-    </w:p>
-    <w:p>
-      <w:pPr>
-        <w:spacing w:after="0"/>
-      </w:pPr>
-      <w:r>
-        <w:t xml:space="preserve">  '/',</w:t>
-      </w:r>
-    </w:p>
-    <w:p>
-      <w:pPr>
-        <w:spacing w:after="0"/>
-      </w:pPr>
-      <w:r>
-        <w:t xml:space="preserve">  '/index.html',</w:t>
-      </w:r>
-    </w:p>
-    <w:p>
-      <w:pPr>
-        <w:spacing w:after="0"/>
-      </w:pPr>
-      <w:r>
-        <w:t xml:space="preserve">  '/styles.css',</w:t>
-      </w:r>
-    </w:p>
-    <w:p>
-      <w:pPr>
-        <w:spacing w:after="0"/>
-      </w:pPr>
-      <w:r>
-        <w:t xml:space="preserve">  '/script.js',</w:t>
-      </w:r>
-    </w:p>
-    <w:p>
-      <w:pPr>
-        <w:spacing w:after="0"/>
-      </w:pPr>
-      <w:r>
-        <w:t xml:space="preserve">  '/icon-192.png'</w:t>
-      </w:r>
-    </w:p>
-    <w:p>
-      <w:pPr>
-        <w:spacing w:after="0"/>
-      </w:pPr>
-      <w:r>
-        <w:t>];</w:t>
-      </w:r>
-    </w:p>
-    <w:p>
-      <w:pPr>
-        <w:spacing w:after="0"/>
-      </w:pPr>
-    </w:p>
-    <w:p>
-      <w:pPr>
-        <w:spacing w:after="0"/>
-      </w:pPr>
-      <w:r>
-        <w:t>// Evento de instalación: Guarda los archivos en la caché del navegador</w:t>
-      </w:r>
-    </w:p>
-    <w:p>
-      <w:pPr>
-        <w:spacing w:after="0"/>
-      </w:pPr>
-      <w:proofErr w:type="spellStart"/>
-      <w:proofErr w:type="gramStart"/>
-      <w:r>
-        <w:t>self.addEventListener</w:t>
-      </w:r>
-      <w:proofErr w:type="spellEnd"/>
-      <w:r>
-        <w:t>(</w:t>
-      </w:r>
-      <w:proofErr w:type="gramEnd"/>
-      <w:r>
-        <w:t>'</w:t>
-      </w:r>
-      <w:proofErr w:type="spellStart"/>
-      <w:r>
-        <w:t>install</w:t>
-      </w:r>
-      <w:proofErr w:type="spellEnd"/>
-      <w:r>
-        <w:t>', e =&gt; {</w:t>
-      </w:r>
-    </w:p>
-    <w:p>
-      <w:pPr>
-        <w:spacing w:after="0"/>
-      </w:pPr>
-      <w:r>
-        <w:t xml:space="preserve">  </w:t>
-      </w:r>
-      <w:proofErr w:type="spellStart"/>
-      <w:proofErr w:type="gramStart"/>
-      <w:r>
-        <w:t>e.waitUntil</w:t>
-      </w:r>
-      <w:proofErr w:type="spellEnd"/>
-      <w:r>
-        <w:t>(</w:t>
-      </w:r>
-      <w:proofErr w:type="gramEnd"/>
-    </w:p>
-    <w:p>
-      <w:pPr>
-        <w:spacing w:after="0"/>
-      </w:pPr>
-      <w:r>
-        <w:t xml:space="preserve">    </w:t>
-      </w:r>
-      <w:proofErr w:type="spellStart"/>
-      <w:proofErr w:type="gramStart"/>
-      <w:r>
-        <w:t>caches.open</w:t>
-      </w:r>
-      <w:proofErr w:type="spellEnd"/>
-      <w:r>
-        <w:t>(</w:t>
-      </w:r>
-      <w:proofErr w:type="gramEnd"/>
-      <w:r>
-        <w:t>CACHE_NAME)</w:t>
-      </w:r>
-    </w:p>
-    <w:p>
-      <w:pPr>
-        <w:spacing w:after="0"/>
-      </w:pPr>
-      <w:r>
-        <w:t xml:space="preserve">      .</w:t>
-      </w:r>
-      <w:proofErr w:type="spellStart"/>
-      <w:proofErr w:type="gramStart"/>
-      <w:r>
-        <w:t>then</w:t>
-      </w:r>
-      <w:proofErr w:type="spellEnd"/>
-      <w:r>
-        <w:t>(</w:t>
-      </w:r>
-      <w:proofErr w:type="gramEnd"/>
-      <w:r>
-        <w:t>cache =&gt; {</w:t>
-      </w:r>
-    </w:p>
-    <w:p>
-      <w:pPr>
-        <w:spacing w:after="0"/>
-      </w:pPr>
-      <w:r>
-        <w:t xml:space="preserve">        </w:t>
-      </w:r>
-      <w:proofErr w:type="spellStart"/>
-      <w:proofErr w:type="gramStart"/>
-      <w:r>
-        <w:t>return</w:t>
-      </w:r>
-      <w:proofErr w:type="spellEnd"/>
-      <w:proofErr w:type="gramEnd"/>
-      <w:r>
-        <w:t xml:space="preserve"> </w:t>
-      </w:r>
-      <w:proofErr w:type="spellStart"/>
-      <w:r>
-        <w:t>cache.addAll</w:t>
-      </w:r>
-      <w:proofErr w:type="spellEnd"/>
-      <w:r>
-        <w:t>(</w:t>
-      </w:r>
-      <w:proofErr w:type="spellStart"/>
-      <w:r>
-        <w:t>urlsToCache</w:t>
-      </w:r>
-      <w:proofErr w:type="spellEnd"/>
-      <w:r>
-        <w:t>);</w:t>
-      </w:r>
-    </w:p>
-    <w:p>
-      <w:pPr>
-        <w:spacing w:after="0"/>
-      </w:pPr>
-      <w:r>
-        <w:t xml:space="preserve">      })</w:t>
-      </w:r>
-    </w:p>
-    <w:p>
-      <w:pPr>
-        <w:spacing w:after="0"/>
-      </w:pPr>
-      <w:r>
-        <w:t xml:space="preserve">      .</w:t>
-      </w:r>
-      <w:proofErr w:type="spellStart"/>
-      <w:proofErr w:type="gramStart"/>
-      <w:r>
-        <w:t>then</w:t>
-      </w:r>
-      <w:proofErr w:type="spellEnd"/>
-      <w:r>
-        <w:t>(</w:t>
-      </w:r>
-      <w:proofErr w:type="gramEnd"/>
-      <w:r>
-        <w:t xml:space="preserve">() =&gt; </w:t>
-      </w:r>
-      <w:proofErr w:type="spellStart"/>
-      <w:r>
-        <w:t>self.skipWaiting</w:t>
-      </w:r>
-      <w:proofErr w:type="spellEnd"/>
-      <w:r>
-        <w:t>())</w:t>
-      </w:r>
-    </w:p>
-    <w:p>
-      <w:pPr>
-        <w:spacing w:after="0"/>
-      </w:pPr>
-      <w:r>
-        <w:t xml:space="preserve">  );</w:t>
-      </w:r>
-    </w:p>
-    <w:p>
-      <w:pPr>
-        <w:spacing w:after="0"/>
-      </w:pPr>
-      <w:r>
-        <w:t>});</w:t>
-      </w:r>
-    </w:p>
-    <w:p>
-      <w:pPr>
-        <w:spacing w:after="0"/>
-      </w:pPr>
-    </w:p>
-    <w:p>
-      <w:pPr>
-        <w:spacing w:after="0"/>
-      </w:pPr>
-      <w:r>
-        <w:t>// Evento de activación: Limpia cachés antiguas</w:t>
-      </w:r>
-    </w:p>
-    <w:p>
-      <w:pPr>
-        <w:spacing w:after="0"/>
-      </w:pPr>
-      <w:proofErr w:type="spellStart"/>
-      <w:proofErr w:type="gramStart"/>
-      <w:r>
-        <w:t>self.addEventListener</w:t>
-      </w:r>
-      <w:proofErr w:type="spellEnd"/>
-      <w:r>
-        <w:t>(</w:t>
-      </w:r>
-      <w:proofErr w:type="gramEnd"/>
-      <w:r>
-        <w:t>'</w:t>
-      </w:r>
-      <w:proofErr w:type="spellStart"/>
-      <w:r>
-        <w:t>activate</w:t>
-      </w:r>
-      <w:proofErr w:type="spellEnd"/>
-      <w:r>
-        <w:t>', e =&gt; {</w:t>
-      </w:r>
-    </w:p>
-    <w:p>
-      <w:pPr>
-        <w:spacing w:after="0"/>
-      </w:pPr>
-      <w:r>
-        <w:t xml:space="preserve">  </w:t>
-      </w:r>
-      <w:proofErr w:type="spellStart"/>
-      <w:proofErr w:type="gramStart"/>
-      <w:r>
-        <w:t>e.waitUntil</w:t>
-      </w:r>
-      <w:proofErr w:type="spellEnd"/>
-      <w:r>
-        <w:t>(</w:t>
-      </w:r>
-      <w:proofErr w:type="gramEnd"/>
-    </w:p>
-    <w:p>
-      <w:pPr>
-        <w:spacing w:after="0"/>
-      </w:pPr>
-      <w:r>
-        <w:t xml:space="preserve">    </w:t>
-      </w:r>
-      <w:proofErr w:type="spellStart"/>
-      <w:proofErr w:type="gramStart"/>
-      <w:r>
-        <w:t>caches.keys</w:t>
-      </w:r>
-      <w:proofErr w:type="spellEnd"/>
-      <w:r>
-        <w:t>(</w:t>
-      </w:r>
-      <w:proofErr w:type="gramEnd"/>
-      <w:r>
-        <w:t>).</w:t>
-      </w:r>
-      <w:proofErr w:type="spellStart"/>
-      <w:r>
-        <w:t>then</w:t>
-      </w:r>
-      <w:proofErr w:type="spellEnd"/>
-      <w:r>
-        <w:t>(</w:t>
-      </w:r>
-      <w:proofErr w:type="spellStart"/>
-      <w:r>
-        <w:t>cacheNames</w:t>
-      </w:r>
-      <w:proofErr w:type="spellEnd"/>
-      <w:r>
-        <w:t xml:space="preserve"> =&gt; {</w:t>
-      </w:r>
-    </w:p>
-    <w:p>
-      <w:pPr>
-        <w:spacing w:after="0"/>
-      </w:pPr>
-      <w:r>
-        <w:t xml:space="preserve">      </w:t>
-      </w:r>
-      <w:proofErr w:type="spellStart"/>
-      <w:proofErr w:type="gramStart"/>
-      <w:r>
-        <w:t>return</w:t>
-      </w:r>
-      <w:proofErr w:type="spellEnd"/>
-      <w:proofErr w:type="gramEnd"/>
-      <w:r>
-        <w:t xml:space="preserve"> </w:t>
-      </w:r>
-      <w:proofErr w:type="spellStart"/>
-      <w:r>
-        <w:t>Promise.all</w:t>
-      </w:r>
-      <w:proofErr w:type="spellEnd"/>
-      <w:r>
-        <w:t>(</w:t>
-      </w:r>
-    </w:p>
-    <w:p>
-      <w:pPr>
-        <w:spacing w:after="0"/>
-      </w:pPr>
-      <w:r>
-        <w:t xml:space="preserve">        </w:t>
-      </w:r>
-      <w:proofErr w:type="spellStart"/>
-      <w:proofErr w:type="gramStart"/>
-      <w:r>
-        <w:t>cacheNames.map</w:t>
-      </w:r>
-      <w:proofErr w:type="spellEnd"/>
-      <w:r>
-        <w:t>(</w:t>
-      </w:r>
-      <w:proofErr w:type="gramEnd"/>
-      <w:r>
-        <w:t>cache =&gt; {</w:t>
-      </w:r>
-    </w:p>
-    <w:p>
-      <w:pPr>
-        <w:spacing w:after="0"/>
-      </w:pPr>
-      <w:r>
-        <w:t xml:space="preserve">          </w:t>
-      </w:r>
-      <w:proofErr w:type="spellStart"/>
-      <w:proofErr w:type="gramStart"/>
-      <w:r>
-        <w:t>if</w:t>
-      </w:r>
-      <w:proofErr w:type="spellEnd"/>
-      <w:proofErr w:type="gramEnd"/>
-      <w:r>
-        <w:t xml:space="preserve"> (cache !== CACHE_NAME) {</w:t>
-      </w:r>
-    </w:p>
-    <w:p>
-      <w:pPr>
-        <w:spacing w:after="0"/>
-      </w:pPr>
-      <w:r>
-        <w:t xml:space="preserve">            </w:t>
-      </w:r>
-      <w:proofErr w:type="spellStart"/>
-      <w:proofErr w:type="gramStart"/>
-      <w:r>
-        <w:t>return</w:t>
-      </w:r>
-      <w:proofErr w:type="spellEnd"/>
-      <w:proofErr w:type="gramEnd"/>
-      <w:r>
-        <w:t xml:space="preserve"> </w:t>
-      </w:r>
-      <w:proofErr w:type="spellStart"/>
-      <w:r>
-        <w:t>caches.delete</w:t>
-      </w:r>
-      <w:proofErr w:type="spellEnd"/>
-      <w:r>
-        <w:t>(cache);</w:t>
-      </w:r>
-    </w:p>
-    <w:p>
-      <w:pPr>
-        <w:spacing w:after="0"/>
-      </w:pPr>
-      <w:r>
-        <w:t xml:space="preserve">          }</w:t>
-      </w:r>
-    </w:p>
-    <w:p>
-      <w:pPr>
-        <w:spacing w:after="0"/>
-      </w:pPr>
-      <w:r>
-        <w:t xml:space="preserve">        })</w:t>
-      </w:r>
-    </w:p>
-    <w:p>
-      <w:pPr>
-        <w:spacing w:after="0"/>
-      </w:pPr>
-      <w:r>
-        <w:t xml:space="preserve">      );</w:t>
-      </w:r>
-    </w:p>
-    <w:p>
-      <w:pPr>
-        <w:spacing w:after="0"/>
-      </w:pPr>
-      <w:r>
-        <w:t xml:space="preserve">    })</w:t>
-      </w:r>
-    </w:p>
-    <w:p>
-      <w:pPr>
-        <w:spacing w:after="0"/>
-      </w:pPr>
-      <w:r>
-        <w:t xml:space="preserve">  );</w:t>
-      </w:r>
-    </w:p>
-    <w:p>
-      <w:pPr>
-        <w:spacing w:after="0"/>
-      </w:pPr>
-      <w:r>
-        <w:t>});</w:t>
-      </w:r>
-    </w:p>
-    <w:p>
-      <w:pPr>
-        <w:spacing w:after="0"/>
-      </w:pPr>
-    </w:p>
-    <w:p>
-      <w:pPr>
-        <w:spacing w:after="0"/>
-      </w:pPr>
-      <w:r>
-        <w:t xml:space="preserve">// Evento </w:t>
-      </w:r>
-      <w:proofErr w:type="spellStart"/>
-      <w:r>
-        <w:t>fetch</w:t>
-      </w:r>
-      <w:proofErr w:type="spellEnd"/>
-      <w:r>
-        <w:t>: Sirve el contenido desde la caché si no hay internet</w:t>
-      </w:r>
-    </w:p>
-    <w:p>
-      <w:pPr>
-        <w:spacing w:after="0"/>
-      </w:pPr>
-      <w:proofErr w:type="spellStart"/>
-      <w:proofErr w:type="gramStart"/>
-      <w:r>
-        <w:t>self.addEventListener</w:t>
-      </w:r>
-      <w:proofErr w:type="spellEnd"/>
-      <w:r>
-        <w:t>(</w:t>
-      </w:r>
-      <w:proofErr w:type="gramEnd"/>
-      <w:r>
-        <w:t>'</w:t>
-      </w:r>
-      <w:proofErr w:type="spellStart"/>
-      <w:r>
-        <w:t>fetch</w:t>
-      </w:r>
-      <w:proofErr w:type="spellEnd"/>
-      <w:r>
-        <w:t>', e =&gt; {</w:t>
-      </w:r>
-    </w:p>
-    <w:p>
-      <w:pPr>
-        <w:spacing w:after="0"/>
-      </w:pPr>
-      <w:r>
-        <w:t xml:space="preserve">  </w:t>
-      </w:r>
-      <w:proofErr w:type="spellStart"/>
-      <w:proofErr w:type="gramStart"/>
-      <w:r>
-        <w:t>e.respondWith</w:t>
-      </w:r>
-      <w:proofErr w:type="spellEnd"/>
-      <w:r>
-        <w:t>(</w:t>
-      </w:r>
-      <w:proofErr w:type="gramEnd"/>
-    </w:p>
-    <w:p>
-      <w:pPr>
-        <w:spacing w:after="0"/>
-      </w:pPr>
-      <w:r>
-        <w:lastRenderedPageBreak/>
+    </w:p>
+    <w:p>
+      <w:pPr>
+        <w:spacing w:after="0"/>
+      </w:pPr>
+      <w:r>
         <w:t xml:space="preserve">    </w:t>
       </w:r>
       <w:proofErr w:type="spellStart"/>
@@ -21258,6 +21285,7 @@
         </w:numPr>
       </w:pPr>
       <w:r>
+        <w:lastRenderedPageBreak/>
         <w:t xml:space="preserve">En el menú izquierdo verás las secciones </w:t>
       </w:r>
       <w:proofErr w:type="spellStart"/>
@@ -26207,6 +26235,7 @@
   <w:style w:type="character" w:default="1" w:styleId="Fuentedeprrafopredeter">
     <w:name w:val="Default Paragraph Font"/>
     <w:uiPriority w:val="1"/>
+    <w:semiHidden/>
     <w:unhideWhenUsed/>
   </w:style>
   <w:style w:type="table" w:default="1" w:styleId="Tablanormal">
@@ -26435,6 +26464,7 @@
   <w:style w:type="character" w:default="1" w:styleId="Fuentedeprrafopredeter">
     <w:name w:val="Default Paragraph Font"/>
     <w:uiPriority w:val="1"/>
+    <w:semiHidden/>
     <w:unhideWhenUsed/>
   </w:style>
   <w:style w:type="table" w:default="1" w:styleId="Tablanormal">
@@ -26790,7 +26820,7 @@
 </file>
 
 <file path=customXml/itemProps1.xml><?xml version="1.0" encoding="utf-8"?>
-<ds:datastoreItem xmlns:ds="http://schemas.openxmlformats.org/officeDocument/2006/customXml" ds:itemID="{942940CC-C274-46F5-8256-EA6319E5057B}">
+<ds:datastoreItem xmlns:ds="http://schemas.openxmlformats.org/officeDocument/2006/customXml" ds:itemID="{86F430AB-C27F-4773-980F-18857F430A60}">
   <ds:schemaRefs>
     <ds:schemaRef ds:uri="http://schemas.openxmlformats.org/officeDocument/2006/bibliography"/>
   </ds:schemaRefs>

</xml_diff>

<commit_message>
se actualiza seleccion de proyectos, y dasboard con secuencia didactica
</commit_message>
<xml_diff>
--- a/ANALISIS/requerimientos.docx
+++ b/ANALISIS/requerimientos.docx
@@ -9343,11 +9343,16 @@
           <w:tab w:val="left" w:pos="1792"/>
         </w:tabs>
         <w:rPr>
-          <w:lang w:val="es-ES"/>
-        </w:rPr>
-      </w:pPr>
-      <w:r>
-        <w:rPr>
+          <w:b/>
+          <w:color w:val="FFC000"/>
+          <w:lang w:val="es-ES"/>
+        </w:rPr>
+      </w:pPr>
+      <w:bookmarkStart w:id="0" w:name="_GoBack"/>
+      <w:r>
+        <w:rPr>
+          <w:b/>
+          <w:color w:val="FFC000"/>
           <w:lang w:val="es-ES"/>
         </w:rPr>
         <w:t xml:space="preserve">Necesito agregar funcionalidad de manejo de roles y permisos a los usuarios, desde el dashboard de administración, y generar un usuario </w:t>
@@ -9355,6 +9360,8 @@
       <w:proofErr w:type="spellStart"/>
       <w:r>
         <w:rPr>
+          <w:b/>
+          <w:color w:val="FFC000"/>
           <w:lang w:val="es-ES"/>
         </w:rPr>
         <w:t>superadmin</w:t>
@@ -9362,11 +9369,14 @@
       <w:proofErr w:type="spellEnd"/>
       <w:r>
         <w:rPr>
+          <w:b/>
+          <w:color w:val="FFC000"/>
           <w:lang w:val="es-ES"/>
         </w:rPr>
         <w:t xml:space="preserve"> que pueda hacer todo</w:t>
       </w:r>
     </w:p>
+    <w:bookmarkEnd w:id="0"/>
     <w:p>
       <w:pPr>
         <w:tabs>
@@ -11386,11 +11396,15 @@
           <w:tab w:val="left" w:pos="1792"/>
         </w:tabs>
         <w:rPr>
-          <w:lang w:val="es-ES"/>
-        </w:rPr>
-      </w:pPr>
-      <w:r>
-        <w:rPr>
+          <w:b/>
+          <w:color w:val="FFC000"/>
+          <w:lang w:val="es-ES"/>
+        </w:rPr>
+      </w:pPr>
+      <w:r>
+        <w:rPr>
+          <w:b/>
+          <w:color w:val="FFC000"/>
           <w:lang w:val="es-ES"/>
         </w:rPr>
         <w:t xml:space="preserve">Necesito que al registrar asistencia, verifique en el calendario escolar si corresponde a una fecha marcada como feriado, y de ser </w:t>
@@ -11398,6 +11412,8 @@
       <w:proofErr w:type="spellStart"/>
       <w:r>
         <w:rPr>
+          <w:b/>
+          <w:color w:val="FFC000"/>
           <w:lang w:val="es-ES"/>
         </w:rPr>
         <w:t>asi</w:t>
@@ -11405,6 +11421,8 @@
       <w:proofErr w:type="spellEnd"/>
       <w:r>
         <w:rPr>
+          <w:b/>
+          <w:color w:val="FFC000"/>
           <w:lang w:val="es-ES"/>
         </w:rPr>
         <w:t xml:space="preserve"> que me coloque en las observaciones feriado</w:t>
@@ -12133,6 +12151,124 @@
     <w:p>
       <w:pPr>
         <w:rPr>
+          <w:b/>
+        </w:rPr>
+      </w:pPr>
+      <w:proofErr w:type="gramStart"/>
+      <w:r>
+        <w:rPr>
+          <w:b/>
+        </w:rPr>
+        <w:t>ahora</w:t>
+      </w:r>
+      <w:proofErr w:type="gramEnd"/>
+      <w:r>
+        <w:rPr>
+          <w:b/>
+        </w:rPr>
+        <w:t xml:space="preserve"> necesito que cuando entre a la vista de actividades asignadas me aparezca seleccionados en las listas desplegables la materia y solo los cursos que están asignados a esa materia, y en primer lugar el activo en el momento según el horario actual.</w:t>
+      </w:r>
+    </w:p>
+    <w:p>
+      <w:pPr>
+        <w:rPr>
+          <w:b/>
+        </w:rPr>
+      </w:pPr>
+      <w:proofErr w:type="gramStart"/>
+      <w:r>
+        <w:rPr>
+          <w:b/>
+        </w:rPr>
+        <w:t>ahora</w:t>
+      </w:r>
+      <w:proofErr w:type="gramEnd"/>
+      <w:r>
+        <w:rPr>
+          <w:b/>
+        </w:rPr>
+        <w:t xml:space="preserve"> necesito que cuando entre a la vista de calificar actividades me aparezca seleccionados en las listas desplegables la materia y solo los cursos que están asignados a esa materia, y en primer lugar el activo en el momento según el horario actual.</w:t>
+      </w:r>
+    </w:p>
+    <w:p>
+      <w:pPr>
+        <w:rPr>
+          <w:b/>
+        </w:rPr>
+      </w:pPr>
+      <w:proofErr w:type="gramStart"/>
+      <w:r>
+        <w:rPr>
+          <w:b/>
+        </w:rPr>
+        <w:t>ahora</w:t>
+      </w:r>
+      <w:proofErr w:type="gramEnd"/>
+      <w:r>
+        <w:rPr>
+          <w:b/>
+        </w:rPr>
+        <w:t xml:space="preserve"> necesito que cuando entre a la vista de contenidos me aparezca seleccionado en la lista desplegable la materia en primer lugar la</w:t>
+      </w:r>
+      <w:r>
+        <w:rPr>
+          <w:b/>
+        </w:rPr>
+        <w:t xml:space="preserve"> activa</w:t>
+      </w:r>
+      <w:r>
+        <w:rPr>
+          <w:b/>
+        </w:rPr>
+        <w:t xml:space="preserve"> en el momento según el horario actual y luego las demás materias registradas según el horario.</w:t>
+      </w:r>
+    </w:p>
+    <w:p>
+      <w:pPr>
+        <w:rPr>
+          <w:b/>
+        </w:rPr>
+      </w:pPr>
+      <w:proofErr w:type="gramStart"/>
+      <w:r>
+        <w:rPr>
+          <w:b/>
+        </w:rPr>
+        <w:t>ahora</w:t>
+      </w:r>
+      <w:proofErr w:type="gramEnd"/>
+      <w:r>
+        <w:rPr>
+          <w:b/>
+        </w:rPr>
+        <w:t xml:space="preserve"> necesito que cuando entre a la vista de actividades me aparezca seleccionado en la lista desplegable la materia en primer lugar la activa en el momento según el horario actual y luego las demás materias registradas según el horario</w:t>
+      </w:r>
+    </w:p>
+    <w:p>
+      <w:pPr>
+        <w:rPr>
+          <w:b/>
+        </w:rPr>
+      </w:pPr>
+      <w:proofErr w:type="gramStart"/>
+      <w:r>
+        <w:rPr>
+          <w:b/>
+        </w:rPr>
+        <w:t>ahora</w:t>
+      </w:r>
+      <w:proofErr w:type="gramEnd"/>
+      <w:r>
+        <w:rPr>
+          <w:b/>
+        </w:rPr>
+        <w:t xml:space="preserve"> necesito que cuando entre a la vista de asignar actividades me aparezca seleccionado en la lista desplegable el curso, en primer lugar el activo en el momento según el horario actual y luego en el desplegable solo los cursos asociados a esa materia, en orden según el horario</w:t>
+      </w:r>
+    </w:p>
+    <w:p>
+      <w:pPr>
+        <w:rPr>
+          <w:b/>
           <w:color w:val="00B0F0"/>
         </w:rPr>
       </w:pPr>
@@ -12150,177 +12286,43 @@
           <w:b/>
           <w:color w:val="00B0F0"/>
         </w:rPr>
-        <w:t xml:space="preserve"> necesito que cuando entre a la vista de actividades asignadas me aparezca seleccionados en las listas desplegables la materia y solo los cursos que están asignados a esa materia, y en primer lugar el activo en el momento según el horario actual</w:t>
-      </w:r>
-      <w:r>
-        <w:rPr>
+        <w:t xml:space="preserve"> necesito que cuando entre a la vista de proyectos, me aparezca seleccionado en la lista desplegable la materia actual según el horario y en orden todas las otras según mi horario, al desplegar los cursos que me muestre solo los cursos asociados a esa materia, y si cambio la materia del desplegable se </w:t>
+      </w:r>
+      <w:proofErr w:type="spellStart"/>
+      <w:r>
+        <w:rPr>
+          <w:b/>
           <w:color w:val="00B0F0"/>
         </w:rPr>
+        <w:t>actualize</w:t>
+      </w:r>
+      <w:proofErr w:type="spellEnd"/>
+      <w:r>
+        <w:rPr>
+          <w:b/>
+          <w:color w:val="00B0F0"/>
+        </w:rPr>
+        <w:t xml:space="preserve"> la lista de cursos asociados a la nueva materia lo demás sin cambios</w:t>
+      </w:r>
+      <w:r>
+        <w:rPr>
+          <w:b/>
+          <w:color w:val="00B0F0"/>
+        </w:rPr>
         <w:t>.</w:t>
       </w:r>
     </w:p>
     <w:p>
-      <w:pPr>
-        <w:rPr>
-          <w:b/>
-          <w:color w:val="00B0F0"/>
-        </w:rPr>
-      </w:pPr>
+      <w:r>
+        <w:t xml:space="preserve">Necesito que en el </w:t>
+      </w:r>
       <w:proofErr w:type="gramStart"/>
       <w:r>
-        <w:rPr>
-          <w:b/>
-          <w:color w:val="00B0F0"/>
-        </w:rPr>
-        <w:t>ahora</w:t>
+        <w:t>dashboard ,</w:t>
       </w:r>
       <w:proofErr w:type="gramEnd"/>
       <w:r>
-        <w:rPr>
-          <w:b/>
-          <w:color w:val="00B0F0"/>
-        </w:rPr>
-        <w:t xml:space="preserve"> necesito que cuando entre a la vista de calificar actividades me aparezca seleccionados en las listas desplegables la materia y solo los cursos que están asignados a esa materia, y en primer lugar el activo en el momento según el horario actual.</w:t>
-      </w:r>
-    </w:p>
-    <w:p>
-      <w:pPr>
-        <w:rPr>
-          <w:b/>
-          <w:color w:val="00B0F0"/>
-        </w:rPr>
-      </w:pPr>
-      <w:proofErr w:type="gramStart"/>
-      <w:r>
-        <w:rPr>
-          <w:b/>
-          <w:color w:val="00B0F0"/>
-        </w:rPr>
-        <w:t>ahora</w:t>
-      </w:r>
-      <w:proofErr w:type="gramEnd"/>
-      <w:r>
-        <w:rPr>
-          <w:b/>
-          <w:color w:val="00B0F0"/>
-        </w:rPr>
-        <w:t xml:space="preserve"> necesito que cuando entre a la vista de contenidos me aparezca seleccionado en la lista desplegable la materia en primer lugar la</w:t>
-      </w:r>
-      <w:r>
-        <w:rPr>
-          <w:b/>
-          <w:color w:val="00B0F0"/>
-        </w:rPr>
-        <w:t xml:space="preserve"> activa</w:t>
-      </w:r>
-      <w:r>
-        <w:rPr>
-          <w:b/>
-          <w:color w:val="00B0F0"/>
-        </w:rPr>
-        <w:t xml:space="preserve"> en el momento según el horario actual y luego las demás materias registradas según el horario.</w:t>
-      </w:r>
-    </w:p>
-    <w:p>
-      <w:pPr>
-        <w:rPr>
-          <w:b/>
-          <w:color w:val="00B0F0"/>
-        </w:rPr>
-      </w:pPr>
-      <w:proofErr w:type="gramStart"/>
-      <w:r>
-        <w:rPr>
-          <w:b/>
-          <w:color w:val="00B0F0"/>
-        </w:rPr>
-        <w:t>ahora</w:t>
-      </w:r>
-      <w:proofErr w:type="gramEnd"/>
-      <w:r>
-        <w:rPr>
-          <w:b/>
-          <w:color w:val="00B0F0"/>
-        </w:rPr>
-        <w:t xml:space="preserve"> necesito que cuando entre a la vista de actividades me aparezca seleccionado en la lista desplegable la materia en primer lugar la activa en el momento según el horario actual y luego las demás materias registradas según el horario</w:t>
-      </w:r>
-    </w:p>
-    <w:p>
-      <w:pPr>
-        <w:rPr>
-          <w:b/>
-          <w:color w:val="00B0F0"/>
-        </w:rPr>
-      </w:pPr>
-      <w:proofErr w:type="gramStart"/>
-      <w:r>
-        <w:rPr>
-          <w:b/>
-          <w:color w:val="00B0F0"/>
-        </w:rPr>
-        <w:t>ahora</w:t>
-      </w:r>
-      <w:proofErr w:type="gramEnd"/>
-      <w:r>
-        <w:rPr>
-          <w:b/>
-          <w:color w:val="00B0F0"/>
-        </w:rPr>
-        <w:t xml:space="preserve"> necesito que cuando entre a la vista de asignar actividades me aparezca seleccionado en la lista desplegable el curso, en primer lugar el activo en el momento según el horario actual y luego en el desplegable solo los cursos asociados a esa materia, en orden según el horario</w:t>
-      </w:r>
-    </w:p>
-    <w:p>
-      <w:pPr>
-        <w:rPr>
-          <w:b/>
-          <w:color w:val="00B0F0"/>
-        </w:rPr>
-      </w:pPr>
-      <w:proofErr w:type="gramStart"/>
-      <w:r>
-        <w:rPr>
-          <w:b/>
-          <w:color w:val="00B0F0"/>
-        </w:rPr>
-        <w:t>ahora</w:t>
-      </w:r>
-      <w:proofErr w:type="gramEnd"/>
-      <w:r>
-        <w:rPr>
-          <w:b/>
-          <w:color w:val="00B0F0"/>
-        </w:rPr>
-        <w:t xml:space="preserve"> necesito que cuando entre a la vista de proyectos, me aparezca seleccionado en la lista desplegable la materia actual según el horario y en orden todas las otras según mi horario, al desplegar los cursos que me muestre solo los cursos asociados a esa materia, y si cambio la materia del desplegable se </w:t>
-      </w:r>
-      <w:proofErr w:type="spellStart"/>
-      <w:r>
-        <w:rPr>
-          <w:b/>
-          <w:color w:val="00B0F0"/>
-        </w:rPr>
-        <w:t>actualize</w:t>
-      </w:r>
-      <w:proofErr w:type="spellEnd"/>
-      <w:r>
-        <w:rPr>
-          <w:b/>
-          <w:color w:val="00B0F0"/>
-        </w:rPr>
-        <w:t xml:space="preserve"> la lista de cursos asociados a la nueva materia lo demás sin cambios</w:t>
-      </w:r>
-      <w:r>
-        <w:rPr>
-          <w:b/>
-          <w:color w:val="00B0F0"/>
-        </w:rPr>
-        <w:t>.</w:t>
-      </w:r>
-    </w:p>
-    <w:p>
-      <w:bookmarkStart w:id="0" w:name="_GoBack"/>
-      <w:bookmarkEnd w:id="0"/>
-      <w:r>
-        <w:t>Necesito que en el dashboard , en la card clase actual, dentro de esa card, abajo me aparezca el tema que se dio en la clase anterior, fecha y tema, el tema de la clase actual fecha y tema, y lo mismo para la próxima clase, esos datos deben salir de la planificación de la materia.</w:t>
+        <w:t xml:space="preserve"> en la card clase actual, dentro de esa card, abajo me aparezca el tema que se dio en la clase anterior, fecha y tema, el tema de la clase actual fecha y tema, y lo mismo para la próxima clase, esos datos deben salir de la planificación de la materia.</w:t>
       </w:r>
     </w:p>
     <w:p>
@@ -26820,7 +26822,7 @@
 </file>
 
 <file path=customXml/itemProps1.xml><?xml version="1.0" encoding="utf-8"?>
-<ds:datastoreItem xmlns:ds="http://schemas.openxmlformats.org/officeDocument/2006/customXml" ds:itemID="{86F430AB-C27F-4773-980F-18857F430A60}">
+<ds:datastoreItem xmlns:ds="http://schemas.openxmlformats.org/officeDocument/2006/customXml" ds:itemID="{194D80C5-82C3-4AD9-B093-31438D9089DB}">
   <ds:schemaRefs>
     <ds:schemaRef ds:uri="http://schemas.openxmlformats.org/officeDocument/2006/bibliography"/>
   </ds:schemaRefs>

</xml_diff>

<commit_message>
se incorpora control captcha
</commit_message>
<xml_diff>
--- a/ANALISIS/requerimientos.docx
+++ b/ANALISIS/requerimientos.docx
@@ -9348,7 +9348,6 @@
           <w:lang w:val="es-ES"/>
         </w:rPr>
       </w:pPr>
-      <w:bookmarkStart w:id="0" w:name="_GoBack"/>
       <w:r>
         <w:rPr>
           <w:b/>
@@ -9376,7 +9375,6 @@
         <w:t xml:space="preserve"> que pueda hacer todo</w:t>
       </w:r>
     </w:p>
-    <w:bookmarkEnd w:id="0"/>
     <w:p>
       <w:pPr>
         <w:tabs>
@@ -12269,86 +12267,221 @@
       <w:pPr>
         <w:rPr>
           <w:b/>
+        </w:rPr>
+      </w:pPr>
+      <w:proofErr w:type="gramStart"/>
+      <w:r>
+        <w:rPr>
+          <w:b/>
+        </w:rPr>
+        <w:t>ahora</w:t>
+      </w:r>
+      <w:proofErr w:type="gramEnd"/>
+      <w:r>
+        <w:rPr>
+          <w:b/>
+        </w:rPr>
+        <w:t xml:space="preserve"> necesito que cuando entre a la vista de proyectos, me aparezca seleccionado en la lista desplegable la materia actual según el horario y en orden todas las otras según mi horario, al desplegar los cursos que me muestre solo los cursos asociados a esa materia, y si cambio la materia del desplegable se </w:t>
+      </w:r>
+      <w:proofErr w:type="spellStart"/>
+      <w:r>
+        <w:rPr>
+          <w:b/>
+        </w:rPr>
+        <w:t>actualize</w:t>
+      </w:r>
+      <w:proofErr w:type="spellEnd"/>
+      <w:r>
+        <w:rPr>
+          <w:b/>
+        </w:rPr>
+        <w:t xml:space="preserve"> la lista de cursos asociados a la nueva materia lo demás sin cambios</w:t>
+      </w:r>
+      <w:r>
+        <w:rPr>
+          <w:b/>
+        </w:rPr>
+        <w:t>.</w:t>
+      </w:r>
+    </w:p>
+    <w:p>
+      <w:pPr>
+        <w:rPr>
+          <w:b/>
+        </w:rPr>
+      </w:pPr>
+      <w:r>
+        <w:rPr>
+          <w:b/>
+        </w:rPr>
+        <w:t xml:space="preserve">Necesito que en el </w:t>
+      </w:r>
+      <w:proofErr w:type="gramStart"/>
+      <w:r>
+        <w:rPr>
+          <w:b/>
+        </w:rPr>
+        <w:t>dashboard ,</w:t>
+      </w:r>
+      <w:proofErr w:type="gramEnd"/>
+      <w:r>
+        <w:rPr>
+          <w:b/>
+        </w:rPr>
+        <w:t xml:space="preserve"> en la card clase actual, dentro de esa card, abajo me aparezca el tema que se dio en la clase anterior, fecha y tema, el tema de la clase actual fecha y tema, y lo mismo para la próxima clase, esos datos deben salir de la planificación de la materia.</w:t>
+      </w:r>
+    </w:p>
+    <w:p>
+      <w:pPr>
+        <w:rPr>
           <w:color w:val="00B0F0"/>
         </w:rPr>
       </w:pPr>
+      <w:bookmarkStart w:id="0" w:name="_GoBack"/>
       <w:proofErr w:type="gramStart"/>
       <w:r>
         <w:rPr>
-          <w:b/>
           <w:color w:val="00B0F0"/>
         </w:rPr>
-        <w:t>ahora</w:t>
+        <w:t>necesito</w:t>
       </w:r>
       <w:proofErr w:type="gramEnd"/>
       <w:r>
         <w:rPr>
-          <w:b/>
           <w:color w:val="00B0F0"/>
         </w:rPr>
-        <w:t xml:space="preserve"> necesito que cuando entre a la vista de proyectos, me aparezca seleccionado en la lista desplegable la materia actual según el horario y en orden todas las otras según mi horario, al desplegar los cursos que me muestre solo los cursos asociados a esa materia, y si cambio la materia del desplegable se </w:t>
-      </w:r>
-      <w:proofErr w:type="spellStart"/>
-      <w:r>
-        <w:rPr>
-          <w:b/>
+        <w:t xml:space="preserve"> implementar </w:t>
+      </w:r>
+      <w:proofErr w:type="spellStart"/>
+      <w:r>
+        <w:rPr>
           <w:color w:val="00B0F0"/>
         </w:rPr>
-        <w:t>actualize</w:t>
-      </w:r>
-      <w:proofErr w:type="spellEnd"/>
-      <w:r>
-        <w:rPr>
-          <w:b/>
+        <w:t>capcha</w:t>
+      </w:r>
+      <w:proofErr w:type="spellEnd"/>
+      <w:r>
+        <w:rPr>
           <w:color w:val="00B0F0"/>
         </w:rPr>
-        <w:t xml:space="preserve"> la lista de cursos asociados a la nueva materia lo demás sin cambios</w:t>
-      </w:r>
-      <w:r>
-        <w:rPr>
-          <w:b/>
+        <w:t xml:space="preserve"> en el </w:t>
+      </w:r>
+      <w:proofErr w:type="spellStart"/>
+      <w:r>
+        <w:rPr>
           <w:color w:val="00B0F0"/>
         </w:rPr>
-        <w:t>.</w:t>
-      </w:r>
-    </w:p>
-    <w:p>
-      <w:r>
-        <w:t xml:space="preserve">Necesito que en el </w:t>
-      </w:r>
-      <w:proofErr w:type="gramStart"/>
-      <w:r>
-        <w:t>dashboard ,</w:t>
-      </w:r>
-      <w:proofErr w:type="gramEnd"/>
-      <w:r>
-        <w:t xml:space="preserve"> en la card clase actual, dentro de esa card, abajo me aparezca el tema que se dio en la clase anterior, fecha y tema, el tema de la clase actual fecha y tema, y lo mismo para la próxima clase, esos datos deben salir de la planificación de la materia.</w:t>
-      </w:r>
-    </w:p>
-    <w:p>
-      <w:proofErr w:type="gramStart"/>
-      <w:r>
-        <w:t>necesito</w:t>
-      </w:r>
-      <w:proofErr w:type="gramEnd"/>
-      <w:r>
-        <w:t xml:space="preserve"> implementar </w:t>
-      </w:r>
-      <w:proofErr w:type="spellStart"/>
-      <w:r>
-        <w:t>capcha</w:t>
-      </w:r>
-      <w:proofErr w:type="spellEnd"/>
-      <w:r>
-        <w:t xml:space="preserve"> en el </w:t>
-      </w:r>
-      <w:proofErr w:type="spellStart"/>
-      <w:r>
         <w:t>login</w:t>
       </w:r>
       <w:proofErr w:type="spellEnd"/>
-    </w:p>
-    <w:p/>
+      <w:r>
+        <w:rPr>
+          <w:color w:val="00B0F0"/>
+        </w:rPr>
+        <w:t xml:space="preserve"> quiero, </w:t>
+      </w:r>
+      <w:r>
+        <w:rPr>
+          <w:rStyle w:val="Textoennegrita"/>
+          <w:color w:val="00B0F0"/>
+        </w:rPr>
+        <w:t xml:space="preserve">implementar exactamente este esquema en </w:t>
+      </w:r>
+      <w:proofErr w:type="spellStart"/>
+      <w:r>
+        <w:rPr>
+          <w:rStyle w:val="Textoennegrita"/>
+          <w:color w:val="00B0F0"/>
+        </w:rPr>
+        <w:t>Laravel</w:t>
+      </w:r>
+      <w:proofErr w:type="spellEnd"/>
+      <w:r>
+        <w:rPr>
+          <w:rStyle w:val="Textoennegrita"/>
+          <w:color w:val="00B0F0"/>
+        </w:rPr>
+        <w:t xml:space="preserve"> + PHP</w:t>
+      </w:r>
+      <w:r>
+        <w:rPr>
+          <w:color w:val="00B0F0"/>
+        </w:rPr>
+        <w:t xml:space="preserve">, </w:t>
+      </w:r>
+      <w:r>
+        <w:rPr>
+          <w:rStyle w:val="group-hoverentity-accent"/>
+          <w:color w:val="00B0F0"/>
+        </w:rPr>
+        <w:t xml:space="preserve">incluyendo </w:t>
+      </w:r>
+      <w:proofErr w:type="spellStart"/>
+      <w:r>
+        <w:rPr>
+          <w:rStyle w:val="Textoennegrita"/>
+          <w:color w:val="00B0F0"/>
+        </w:rPr>
+        <w:t>Turnstile</w:t>
+      </w:r>
+      <w:proofErr w:type="spellEnd"/>
+      <w:r>
+        <w:rPr>
+          <w:rStyle w:val="Textoennegrita"/>
+          <w:color w:val="00B0F0"/>
+        </w:rPr>
+        <w:t>/</w:t>
+      </w:r>
+      <w:proofErr w:type="spellStart"/>
+      <w:r>
+        <w:rPr>
+          <w:rStyle w:val="Textoennegrita"/>
+          <w:color w:val="00B0F0"/>
+        </w:rPr>
+        <w:t>reCAPTCHA</w:t>
+      </w:r>
+      <w:proofErr w:type="spellEnd"/>
+      <w:r>
+        <w:rPr>
+          <w:rStyle w:val="Textoennegrita"/>
+          <w:color w:val="00B0F0"/>
+        </w:rPr>
+        <w:t xml:space="preserve">, middleware de </w:t>
+      </w:r>
+      <w:proofErr w:type="spellStart"/>
+      <w:r>
+        <w:rPr>
+          <w:rStyle w:val="Textoennegrita"/>
+          <w:color w:val="00B0F0"/>
+        </w:rPr>
+        <w:t>rate</w:t>
+      </w:r>
+      <w:proofErr w:type="spellEnd"/>
+      <w:r>
+        <w:rPr>
+          <w:rStyle w:val="Textoennegrita"/>
+          <w:color w:val="00B0F0"/>
+        </w:rPr>
+        <w:t xml:space="preserve"> </w:t>
+      </w:r>
+      <w:proofErr w:type="spellStart"/>
+      <w:r>
+        <w:rPr>
+          <w:rStyle w:val="Textoennegrita"/>
+          <w:color w:val="00B0F0"/>
+        </w:rPr>
+        <w:t>limiting</w:t>
+      </w:r>
+      <w:proofErr w:type="spellEnd"/>
+      <w:r>
+        <w:rPr>
+          <w:rStyle w:val="Textoennegrita"/>
+          <w:color w:val="00B0F0"/>
+        </w:rPr>
+        <w:t>, contador de intentos fallidos y CAPTCHA solamente después de X intentos</w:t>
+      </w:r>
+    </w:p>
+    <w:bookmarkEnd w:id="0"/>
     <w:p/>
     <w:p/>
     <w:p/>
@@ -26300,6 +26433,22 @@
       <w:lang w:eastAsia="es-AR"/>
     </w:rPr>
   </w:style>
+  <w:style w:type="character" w:customStyle="1" w:styleId="group-hoverentity-accent">
+    <w:name w:val="group-hover:entity-accent"/>
+    <w:basedOn w:val="Fuentedeprrafopredeter"/>
+    <w:rsid w:val="00C33672"/>
+  </w:style>
+  <w:style w:type="character" w:styleId="Textoennegrita">
+    <w:name w:val="Strong"/>
+    <w:basedOn w:val="Fuentedeprrafopredeter"/>
+    <w:uiPriority w:val="22"/>
+    <w:qFormat/>
+    <w:rsid w:val="00C33672"/>
+    <w:rPr>
+      <w:b/>
+      <w:bCs/>
+    </w:rPr>
+  </w:style>
 </w:styles>
 </file>
 
@@ -26527,6 +26676,22 @@
       <w:sz w:val="24"/>
       <w:szCs w:val="24"/>
       <w:lang w:eastAsia="es-AR"/>
+    </w:rPr>
+  </w:style>
+  <w:style w:type="character" w:customStyle="1" w:styleId="group-hoverentity-accent">
+    <w:name w:val="group-hover:entity-accent"/>
+    <w:basedOn w:val="Fuentedeprrafopredeter"/>
+    <w:rsid w:val="00C33672"/>
+  </w:style>
+  <w:style w:type="character" w:styleId="Textoennegrita">
+    <w:name w:val="Strong"/>
+    <w:basedOn w:val="Fuentedeprrafopredeter"/>
+    <w:uiPriority w:val="22"/>
+    <w:qFormat/>
+    <w:rsid w:val="00C33672"/>
+    <w:rPr>
+      <w:b/>
+      <w:bCs/>
     </w:rPr>
   </w:style>
 </w:styles>
@@ -26822,7 +26987,7 @@
 </file>
 
 <file path=customXml/itemProps1.xml><?xml version="1.0" encoding="utf-8"?>
-<ds:datastoreItem xmlns:ds="http://schemas.openxmlformats.org/officeDocument/2006/customXml" ds:itemID="{194D80C5-82C3-4AD9-B093-31438D9089DB}">
+<ds:datastoreItem xmlns:ds="http://schemas.openxmlformats.org/officeDocument/2006/customXml" ds:itemID="{3F7BE89F-D52F-4824-A9AC-31D7A3330A3B}">
   <ds:schemaRefs>
     <ds:schemaRef ds:uri="http://schemas.openxmlformats.org/officeDocument/2006/bibliography"/>
   </ds:schemaRefs>

</xml_diff>